<commit_message>
Added the chi-squared test for the hierarchical clustering independence question. Table is printed as output.
</commit_message>
<xml_diff>
--- a/Assignment-3/CGS4144_Assn3.docx
+++ b/Assignment-3/CGS4144_Assn3.docx
@@ -19,7 +19,7 @@
           <w:sz w:val="24"/>
           <w:szCs w:val="24"/>
         </w:rPr>
-        <w:t>CGS4144 Bioinform=atics - Assignment 3</w:t>
+        <w:t>CGS4144 Bioinformatics - Assignment 3</w:t>
       </w:r>
     </w:p>
     <w:p>
@@ -435,19 +435,20 @@
               <w:suppressAutoHyphens w:val="true"/>
               <w:spacing w:before="0" w:after="0"/>
               <w:jc w:val="center"/>
-              <w:rPr>
-                <w:color w:val="054361"/>
-              </w:rPr>
+              <w:rPr/>
             </w:pPr>
-            <w:r>
-              <w:rPr>
-                <w:rFonts w:eastAsia="Times New Roman" w:cs="Times New Roman"/>
-                <w:color w:val="054361"/>
-                <w:kern w:val="0"/>
-                <w:lang w:val="en-US" w:eastAsia="en-US" w:bidi="ar-SA"/>
-              </w:rPr>
-              <w:t>github.com/amitathik7</w:t>
-            </w:r>
+            <w:hyperlink r:id="rId2">
+              <w:r>
+                <w:rPr>
+                  <w:rStyle w:val="Hyperlink"/>
+                  <w:rFonts w:eastAsia="Times New Roman" w:cs="Times New Roman"/>
+                  <w:color w:val="054361"/>
+                  <w:kern w:val="0"/>
+                  <w:lang w:val="en-US" w:eastAsia="en-US" w:bidi="ar-SA"/>
+                </w:rPr>
+                <w:t>github.com/amitathik7</w:t>
+              </w:r>
+            </w:hyperlink>
           </w:p>
         </w:tc>
       </w:tr>
@@ -563,7 +564,7 @@
         <w:rPr/>
         <w:t xml:space="preserve"> </w:t>
       </w:r>
-      <w:hyperlink r:id="rId2">
+      <w:hyperlink r:id="rId3">
         <w:r>
           <w:rPr>
             <w:rStyle w:val="Hyperlink"/>
@@ -761,7 +762,7 @@
         </w:rPr>
         <w:t xml:space="preserve">Unsupervised Analysis (e.g. using </w:t>
       </w:r>
-      <w:hyperlink r:id="rId3">
+      <w:hyperlink r:id="rId4">
         <w:r>
           <w:rPr>
             <w:rStyle w:val="Hyperlink"/>
@@ -779,7 +780,7 @@
         </w:rPr>
         <w:t xml:space="preserve"> in R or </w:t>
       </w:r>
-      <w:hyperlink r:id="rId4">
+      <w:hyperlink r:id="rId5">
         <w:r>
           <w:rPr>
             <w:rStyle w:val="Hyperlink"/>
@@ -863,7 +864,7 @@
         </w:rPr>
         <w:t xml:space="preserve">K-means (tutorial: </w:t>
       </w:r>
-      <w:hyperlink r:id="rId5">
+      <w:hyperlink r:id="rId6">
         <w:r>
           <w:rPr>
             <w:rStyle w:val="Hyperlink"/>
@@ -903,7 +904,7 @@
           <w:color w:val="064462"/>
         </w:rPr>
       </w:pPr>
-      <w:hyperlink r:id="rId6">
+      <w:hyperlink r:id="rId7">
         <w:r>
           <w:rPr>
             <w:rStyle w:val="Hyperlink"/>
@@ -935,7 +936,7 @@
           <w:color w:val="064462"/>
         </w:rPr>
       </w:pPr>
-      <w:hyperlink r:id="rId7">
+      <w:hyperlink r:id="rId8">
         <w:r>
           <w:rPr>
             <w:rStyle w:val="Hyperlink"/>
@@ -1057,7 +1058,7 @@
           <w:u w:val="none"/>
         </w:rPr>
       </w:pPr>
-      <w:hyperlink r:id="rId8">
+      <w:hyperlink r:id="rId9">
         <w:r>
           <w:rPr>
             <w:rStyle w:val="Hyperlink"/>
@@ -1398,7 +1399,7 @@
       </w:pPr>
       <w:r>
         <w:rPr>
-          <w:rFonts w:cs="Calibri Light" w:cstheme="majorHAnsi" w:ascii="Calibri Light" w:hAnsi="Calibri Light"/>
+          <w:rFonts w:cs="Calibri Light" w:ascii="Calibri Light" w:hAnsi="Calibri Light" w:cstheme="majorHAnsi"/>
           <w:color w:val="EE0000"/>
           <w:szCs w:val="22"/>
         </w:rPr>
@@ -1417,7 +1418,7 @@
       </w:pPr>
       <w:r>
         <w:rPr>
-          <w:rFonts w:cs="Calibri Light" w:cstheme="majorHAnsi" w:ascii="Calibri Light" w:hAnsi="Calibri Light"/>
+          <w:rFonts w:cs="Calibri Light" w:ascii="Calibri Light" w:hAnsi="Calibri Light" w:cstheme="majorHAnsi"/>
           <w:color w:val="EE0000"/>
           <w:szCs w:val="22"/>
         </w:rPr>
@@ -1436,7 +1437,7 @@
       </w:pPr>
       <w:r>
         <w:rPr>
-          <w:rFonts w:cs="Calibri Light" w:cstheme="majorHAnsi" w:ascii="Calibri Light" w:hAnsi="Calibri Light"/>
+          <w:rFonts w:cs="Calibri Light" w:ascii="Calibri Light" w:hAnsi="Calibri Light" w:cstheme="majorHAnsi"/>
           <w:color w:val="EE0000"/>
           <w:szCs w:val="22"/>
         </w:rPr>
@@ -1455,7 +1456,7 @@
       </w:pPr>
       <w:r>
         <w:rPr>
-          <w:rFonts w:cs="Calibri Light" w:cstheme="majorHAnsi" w:ascii="Calibri Light" w:hAnsi="Calibri Light"/>
+          <w:rFonts w:cs="Calibri Light" w:ascii="Calibri Light" w:hAnsi="Calibri Light" w:cstheme="majorHAnsi"/>
           <w:color w:val="EE0000"/>
           <w:szCs w:val="22"/>
         </w:rPr>
@@ -1480,6 +1481,224 @@
           <w:szCs w:val="22"/>
         </w:rPr>
         <w:t>ei. When I changed the number of genes I found that the lower the number of genes the greater accuracy there was in the hierarchical clustering means procedure.</w:t>
+      </w:r>
+    </w:p>
+    <w:p>
+      <w:pPr>
+        <w:pStyle w:val="Normal"/>
+        <w:spacing w:beforeAutospacing="1" w:afterAutospacing="1"/>
+        <w:rPr>
+          <w:rFonts w:ascii="Calibri Light" w:hAnsi="Calibri Light" w:cs="Calibri Light" w:asciiTheme="majorHAnsi" w:cstheme="majorHAnsi" w:hAnsiTheme="majorHAnsi"/>
+          <w:color w:val="EE0000"/>
+          <w:szCs w:val="22"/>
+        </w:rPr>
+      </w:pPr>
+      <w:r>
+        <w:rPr>
+          <w:rFonts w:cs="Calibri Light" w:cstheme="majorHAnsi" w:ascii="Calibri Light" w:hAnsi="Calibri Light"/>
+          <w:color w:val="EE0000"/>
+          <w:szCs w:val="22"/>
+        </w:rPr>
+        <w:t>eii. Results:</w:t>
+      </w:r>
+    </w:p>
+    <w:p>
+      <w:pPr>
+        <w:pStyle w:val="Normal"/>
+        <w:spacing w:beforeAutospacing="1" w:afterAutospacing="1"/>
+        <w:rPr>
+          <w:rFonts w:ascii="Calibri Light" w:hAnsi="Calibri Light" w:cs="Calibri Light" w:asciiTheme="majorHAnsi" w:cstheme="majorHAnsi" w:hAnsiTheme="majorHAnsi"/>
+          <w:color w:val="EE0000"/>
+          <w:szCs w:val="22"/>
+        </w:rPr>
+      </w:pPr>
+      <w:r>
+        <w:rPr>
+          <w:rFonts w:cs="Calibri Light" w:cstheme="majorHAnsi" w:ascii="Calibri Light" w:hAnsi="Calibri Light"/>
+          <w:color w:val="EE0000"/>
+          <w:szCs w:val="22"/>
+        </w:rPr>
+        <w:t xml:space="preserve">  </w:t>
+      </w:r>
+      <w:r>
+        <w:rPr>
+          <w:rFonts w:cs="Calibri Light" w:cstheme="majorHAnsi" w:ascii="Calibri Light" w:hAnsi="Calibri Light"/>
+          <w:color w:val="EE0000"/>
+          <w:szCs w:val="22"/>
+        </w:rPr>
+        <w:t>Method 1    Method 2  Chi-square Statistic  P-value  Degrees of Freedom</w:t>
+      </w:r>
+    </w:p>
+    <w:p>
+      <w:pPr>
+        <w:pStyle w:val="Normal"/>
+        <w:spacing w:beforeAutospacing="1" w:afterAutospacing="1"/>
+        <w:rPr>
+          <w:rFonts w:ascii="Calibri Light" w:hAnsi="Calibri Light" w:cs="Calibri Light" w:asciiTheme="majorHAnsi" w:cstheme="majorHAnsi" w:hAnsiTheme="majorHAnsi"/>
+          <w:color w:val="EE0000"/>
+          <w:szCs w:val="22"/>
+        </w:rPr>
+      </w:pPr>
+      <w:r>
+        <w:rPr>
+          <w:rFonts w:cs="Calibri Light" w:cstheme="majorHAnsi" w:ascii="Calibri Light" w:hAnsi="Calibri Light"/>
+          <w:color w:val="EE0000"/>
+          <w:szCs w:val="22"/>
+        </w:rPr>
+        <w:t xml:space="preserve">  </w:t>
+      </w:r>
+      <w:r>
+        <w:rPr>
+          <w:rFonts w:cs="Calibri Light" w:cstheme="majorHAnsi" w:ascii="Calibri Light" w:hAnsi="Calibri Light"/>
+          <w:color w:val="EE0000"/>
+          <w:szCs w:val="22"/>
+        </w:rPr>
+        <w:t>10 genes   100 genes                5.3343 0.020910                   1</w:t>
+      </w:r>
+    </w:p>
+    <w:p>
+      <w:pPr>
+        <w:pStyle w:val="Normal"/>
+        <w:spacing w:beforeAutospacing="1" w:afterAutospacing="1"/>
+        <w:rPr>
+          <w:rFonts w:ascii="Calibri Light" w:hAnsi="Calibri Light" w:cs="Calibri Light" w:asciiTheme="majorHAnsi" w:cstheme="majorHAnsi" w:hAnsiTheme="majorHAnsi"/>
+          <w:color w:val="EE0000"/>
+          <w:szCs w:val="22"/>
+        </w:rPr>
+      </w:pPr>
+      <w:r>
+        <w:rPr>
+          <w:rFonts w:cs="Calibri Light" w:cstheme="majorHAnsi" w:ascii="Calibri Light" w:hAnsi="Calibri Light"/>
+          <w:color w:val="EE0000"/>
+          <w:szCs w:val="22"/>
+        </w:rPr>
+        <w:t xml:space="preserve">  </w:t>
+      </w:r>
+      <w:r>
+        <w:rPr>
+          <w:rFonts w:cs="Calibri Light" w:cstheme="majorHAnsi" w:ascii="Calibri Light" w:hAnsi="Calibri Light"/>
+          <w:color w:val="EE0000"/>
+          <w:szCs w:val="22"/>
+        </w:rPr>
+        <w:t>10 genes  1000 genes                7.8851 0.004984                   1</w:t>
+      </w:r>
+    </w:p>
+    <w:p>
+      <w:pPr>
+        <w:pStyle w:val="Normal"/>
+        <w:spacing w:beforeAutospacing="1" w:afterAutospacing="1"/>
+        <w:rPr>
+          <w:rFonts w:ascii="Calibri Light" w:hAnsi="Calibri Light" w:cs="Calibri Light" w:asciiTheme="majorHAnsi" w:cstheme="majorHAnsi" w:hAnsiTheme="majorHAnsi"/>
+          <w:color w:val="EE0000"/>
+          <w:szCs w:val="22"/>
+        </w:rPr>
+      </w:pPr>
+      <w:r>
+        <w:rPr>
+          <w:rFonts w:cs="Calibri Light" w:cstheme="majorHAnsi" w:ascii="Calibri Light" w:hAnsi="Calibri Light"/>
+          <w:color w:val="EE0000"/>
+          <w:szCs w:val="22"/>
+        </w:rPr>
+        <w:t xml:space="preserve">  </w:t>
+      </w:r>
+      <w:r>
+        <w:rPr>
+          <w:rFonts w:cs="Calibri Light" w:cstheme="majorHAnsi" w:ascii="Calibri Light" w:hAnsi="Calibri Light"/>
+          <w:color w:val="EE0000"/>
+          <w:szCs w:val="22"/>
+        </w:rPr>
+        <w:t>10 genes 10000 genes                4.2117 0.040146                   1</w:t>
+      </w:r>
+    </w:p>
+    <w:p>
+      <w:pPr>
+        <w:pStyle w:val="Normal"/>
+        <w:spacing w:beforeAutospacing="1" w:afterAutospacing="1"/>
+        <w:rPr>
+          <w:rFonts w:ascii="Calibri Light" w:hAnsi="Calibri Light" w:cs="Calibri Light" w:asciiTheme="majorHAnsi" w:cstheme="majorHAnsi" w:hAnsiTheme="majorHAnsi"/>
+          <w:color w:val="EE0000"/>
+          <w:szCs w:val="22"/>
+        </w:rPr>
+      </w:pPr>
+      <w:r>
+        <w:rPr>
+          <w:rFonts w:cs="Calibri Light" w:cstheme="majorHAnsi" w:ascii="Calibri Light" w:hAnsi="Calibri Light"/>
+          <w:color w:val="EE0000"/>
+          <w:szCs w:val="22"/>
+        </w:rPr>
+        <w:t xml:space="preserve"> </w:t>
+      </w:r>
+      <w:r>
+        <w:rPr>
+          <w:rFonts w:cs="Calibri Light" w:cstheme="majorHAnsi" w:ascii="Calibri Light" w:hAnsi="Calibri Light"/>
+          <w:color w:val="EE0000"/>
+          <w:szCs w:val="22"/>
+        </w:rPr>
+        <w:t>100 genes  1000 genes              366.4869 0.000000                   1</w:t>
+      </w:r>
+    </w:p>
+    <w:p>
+      <w:pPr>
+        <w:pStyle w:val="Normal"/>
+        <w:spacing w:beforeAutospacing="1" w:afterAutospacing="1"/>
+        <w:rPr>
+          <w:rFonts w:ascii="Calibri Light" w:hAnsi="Calibri Light" w:cs="Calibri Light" w:asciiTheme="majorHAnsi" w:cstheme="majorHAnsi" w:hAnsiTheme="majorHAnsi"/>
+          <w:color w:val="EE0000"/>
+          <w:szCs w:val="22"/>
+        </w:rPr>
+      </w:pPr>
+      <w:r>
+        <w:rPr>
+          <w:rFonts w:cs="Calibri Light" w:cstheme="majorHAnsi" w:ascii="Calibri Light" w:hAnsi="Calibri Light"/>
+          <w:color w:val="EE0000"/>
+          <w:szCs w:val="22"/>
+        </w:rPr>
+        <w:t xml:space="preserve"> </w:t>
+      </w:r>
+      <w:r>
+        <w:rPr>
+          <w:rFonts w:cs="Calibri Light" w:cstheme="majorHAnsi" w:ascii="Calibri Light" w:hAnsi="Calibri Light"/>
+          <w:color w:val="EE0000"/>
+          <w:szCs w:val="22"/>
+        </w:rPr>
+        <w:t>100 genes 10000 genes              155.5041 0.000000                   1</w:t>
+      </w:r>
+    </w:p>
+    <w:p>
+      <w:pPr>
+        <w:pStyle w:val="Normal"/>
+        <w:spacing w:beforeAutospacing="1" w:afterAutospacing="1"/>
+        <w:rPr>
+          <w:rFonts w:ascii="Calibri Light" w:hAnsi="Calibri Light" w:cs="Calibri Light" w:asciiTheme="majorHAnsi" w:cstheme="majorHAnsi" w:hAnsiTheme="majorHAnsi"/>
+          <w:color w:val="EE0000"/>
+          <w:szCs w:val="22"/>
+        </w:rPr>
+      </w:pPr>
+      <w:r>
+        <w:rPr>
+          <w:rFonts w:cs="Calibri Light" w:cstheme="majorHAnsi" w:ascii="Calibri Light" w:hAnsi="Calibri Light"/>
+          <w:color w:val="EE0000"/>
+          <w:szCs w:val="22"/>
+        </w:rPr>
+        <w:t>1000 genes 10000 genes              345.8472 0.000000                   1</w:t>
+      </w:r>
+    </w:p>
+    <w:p>
+      <w:pPr>
+        <w:pStyle w:val="Normal"/>
+        <w:spacing w:beforeAutospacing="1" w:afterAutospacing="1"/>
+        <w:rPr>
+          <w:rFonts w:ascii="Calibri Light" w:hAnsi="Calibri Light" w:cs="Calibri Light" w:asciiTheme="majorHAnsi" w:cstheme="majorHAnsi" w:hAnsiTheme="majorHAnsi"/>
+          <w:color w:val="EE0000"/>
+          <w:szCs w:val="22"/>
+        </w:rPr>
+      </w:pPr>
+      <w:r>
+        <w:rPr>
+          <w:rFonts w:cs="Calibri Light" w:cstheme="majorHAnsi" w:ascii="Calibri Light" w:hAnsi="Calibri Light"/>
+          <w:color w:val="EE0000"/>
+          <w:szCs w:val="22"/>
+        </w:rPr>
       </w:r>
     </w:p>
     <w:p>
@@ -1511,7 +1730,7 @@
                     </pic:cNvPicPr>
                   </pic:nvPicPr>
                   <pic:blipFill>
-                    <a:blip r:embed="rId9"/>
+                    <a:blip r:embed="rId10"/>
                     <a:stretch>
                       <a:fillRect/>
                     </a:stretch>
@@ -1678,9 +1897,9 @@
       </w:r>
     </w:p>
     <w:sectPr>
-      <w:footerReference w:type="even" r:id="rId10"/>
-      <w:footerReference w:type="default" r:id="rId11"/>
-      <w:footerReference w:type="first" r:id="rId12"/>
+      <w:footerReference w:type="even" r:id="rId11"/>
+      <w:footerReference w:type="default" r:id="rId12"/>
+      <w:footerReference w:type="first" r:id="rId13"/>
       <w:type w:val="nextPage"/>
       <w:pgSz w:w="12240" w:h="15840"/>
       <w:pgMar w:left="720" w:right="720" w:gutter="0" w:header="0" w:top="720" w:footer="720" w:bottom="777"/>

</xml_diff>

<commit_message>
Gaussian_mixture complete and  updated assignment3 docx
</commit_message>
<xml_diff>
--- a/Assignment-3/CGS4144_Assn3.docx
+++ b/Assignment-3/CGS4144_Assn3.docx
@@ -1,11 +1,10 @@
 
 <file path=word/document.xml><?xml version="1.0" encoding="utf-8"?>
-<w:document xmlns:o="urn:schemas-microsoft-com:office:office" xmlns:r="http://schemas.openxmlformats.org/officeDocument/2006/relationships" xmlns:v="urn:schemas-microsoft-com:vml" xmlns:w="http://schemas.openxmlformats.org/wordprocessingml/2006/main" xmlns:w10="urn:schemas-microsoft-com:office:word" xmlns:wp="http://schemas.openxmlformats.org/drawingml/2006/wordprocessingDrawing" xmlns:pic="http://schemas.openxmlformats.org/drawingml/2006/picture" xmlns:wps="http://schemas.microsoft.com/office/word/2010/wordprocessingShape" xmlns:wpg="http://schemas.microsoft.com/office/word/2010/wordprocessingGroup" xmlns:mc="http://schemas.openxmlformats.org/markup-compatibility/2006" xmlns:wp14="http://schemas.microsoft.com/office/word/2010/wordprocessingDrawing" xmlns:w14="http://schemas.microsoft.com/office/word/2010/wordml" xmlns:w15="http://schemas.microsoft.com/office/word/2012/wordml" mc:Ignorable="w14 wp14 w15">
+<w:document xmlns:wpc="http://schemas.microsoft.com/office/word/2010/wordprocessingCanvas" xmlns:cx="http://schemas.microsoft.com/office/drawing/2014/chartex" xmlns:cx1="http://schemas.microsoft.com/office/drawing/2015/9/8/chartex" xmlns:cx2="http://schemas.microsoft.com/office/drawing/2015/10/21/chartex" xmlns:cx3="http://schemas.microsoft.com/office/drawing/2016/5/9/chartex" xmlns:cx4="http://schemas.microsoft.com/office/drawing/2016/5/10/chartex" xmlns:cx5="http://schemas.microsoft.com/office/drawing/2016/5/11/chartex" xmlns:cx6="http://schemas.microsoft.com/office/drawing/2016/5/12/chartex" xmlns:cx7="http://schemas.microsoft.com/office/drawing/2016/5/13/chartex" xmlns:cx8="http://schemas.microsoft.com/office/drawing/2016/5/14/chartex" xmlns:mc="http://schemas.openxmlformats.org/markup-compatibility/2006" xmlns:aink="http://schemas.microsoft.com/office/drawing/2016/ink" xmlns:am3d="http://schemas.microsoft.com/office/drawing/2017/model3d" xmlns:o="urn:schemas-microsoft-com:office:office" xmlns:oel="http://schemas.microsoft.com/office/2019/extlst" xmlns:r="http://schemas.openxmlformats.org/officeDocument/2006/relationships" xmlns:m="http://schemas.openxmlformats.org/officeDocument/2006/math" xmlns:v="urn:schemas-microsoft-com:vml" xmlns:wp14="http://schemas.microsoft.com/office/word/2010/wordprocessingDrawing" xmlns:wp="http://schemas.openxmlformats.org/drawingml/2006/wordprocessingDrawing" xmlns:w10="urn:schemas-microsoft-com:office:word" xmlns:w="http://schemas.openxmlformats.org/wordprocessingml/2006/main" xmlns:w14="http://schemas.microsoft.com/office/word/2010/wordml" xmlns:w15="http://schemas.microsoft.com/office/word/2012/wordml" xmlns:w16cex="http://schemas.microsoft.com/office/word/2018/wordml/cex" xmlns:w16cid="http://schemas.microsoft.com/office/word/2016/wordml/cid" xmlns:w16="http://schemas.microsoft.com/office/word/2018/wordml" xmlns:w16du="http://schemas.microsoft.com/office/word/2023/wordml/word16du" xmlns:w16sdtdh="http://schemas.microsoft.com/office/word/2020/wordml/sdtdatahash" xmlns:w16se="http://schemas.microsoft.com/office/word/2015/wordml/symex" xmlns:wpg="http://schemas.microsoft.com/office/word/2010/wordprocessingGroup" xmlns:wpi="http://schemas.microsoft.com/office/word/2010/wordprocessingInk" xmlns:wne="http://schemas.microsoft.com/office/word/2006/wordml" xmlns:wps="http://schemas.microsoft.com/office/word/2010/wordprocessingShape" mc:Ignorable="w14 w15 w16se w16cid w16 w16cex w16sdtdh w16du wp14">
   <w:body>
     <w:p>
       <w:pPr>
         <w:pStyle w:val="Heading1"/>
-        <w:spacing w:before="160" w:after="0"/>
         <w:jc w:val="center"/>
         <w:rPr>
           <w:color w:val="054361"/>
@@ -19,34 +18,61 @@
           <w:sz w:val="24"/>
           <w:szCs w:val="24"/>
         </w:rPr>
-        <w:t>CGS4144 Bioinformatics - Assignment 3</w:t>
-      </w:r>
-    </w:p>
-    <w:p>
-      <w:pPr>
-        <w:pStyle w:val="Normal"/>
-        <w:rPr/>
-      </w:pPr>
-      <w:r>
-        <w:rPr/>
-      </w:r>
-    </w:p>
+        <w:t xml:space="preserve">CGS4144 </w:t>
+      </w:r>
+      <w:proofErr w:type="spellStart"/>
+      <w:r>
+        <w:rPr>
+          <w:color w:val="054361"/>
+          <w:sz w:val="24"/>
+          <w:szCs w:val="24"/>
+        </w:rPr>
+        <w:t>Bioinform</w:t>
+      </w:r>
+      <w:proofErr w:type="spellEnd"/>
+      <w:r>
+        <w:rPr>
+          <w:color w:val="054361"/>
+          <w:sz w:val="24"/>
+          <w:szCs w:val="24"/>
+        </w:rPr>
+        <w:t>=</w:t>
+      </w:r>
+      <w:proofErr w:type="spellStart"/>
+      <w:r>
+        <w:rPr>
+          <w:color w:val="054361"/>
+          <w:sz w:val="24"/>
+          <w:szCs w:val="24"/>
+        </w:rPr>
+        <w:t>atics</w:t>
+      </w:r>
+      <w:proofErr w:type="spellEnd"/>
+      <w:r>
+        <w:rPr>
+          <w:color w:val="054361"/>
+          <w:sz w:val="24"/>
+          <w:szCs w:val="24"/>
+        </w:rPr>
+        <w:t xml:space="preserve"> - Assignment 3</w:t>
+      </w:r>
+    </w:p>
+    <w:p/>
     <w:p>
       <w:pPr>
         <w:pStyle w:val="Heading1"/>
         <w:rPr>
-          <w:b w:val="false"/>
+          <w:b w:val="0"/>
           <w:bCs/>
           <w:color w:val="054361"/>
         </w:rPr>
       </w:pPr>
       <w:r>
-        <w:rPr/>
         <w:t>Directions:</w:t>
       </w:r>
       <w:r>
         <w:rPr>
-          <w:b w:val="false"/>
+          <w:b w:val="0"/>
           <w:bCs/>
           <w:color w:val="054361"/>
         </w:rPr>
@@ -60,33 +86,23 @@
       </w:r>
       <w:r>
         <w:rPr>
-          <w:b w:val="false"/>
+          <w:b w:val="0"/>
           <w:bCs/>
           <w:color w:val="054361"/>
         </w:rPr>
         <w:t xml:space="preserve"> Create a work document with your team’s name at the top followed by your results, to be submitted on Canvas. </w:t>
       </w:r>
     </w:p>
-    <w:p>
-      <w:pPr>
-        <w:pStyle w:val="Normal"/>
-        <w:rPr/>
-      </w:pPr>
-      <w:r>
-        <w:rPr/>
-      </w:r>
-    </w:p>
-    <w:p>
-      <w:pPr>
-        <w:pStyle w:val="Normal"/>
-        <w:rPr/>
-      </w:pPr>
-      <w:r>
-        <w:rPr/>
+    <w:p/>
+    <w:p>
+      <w:r>
+        <w:rPr>
+          <w:noProof/>
+        </w:rPr>
         <mc:AlternateContent>
           <mc:Choice Requires="wps">
             <w:drawing>
-              <wp:anchor distT="6985" distB="6985" distL="635" distR="0" simplePos="0" relativeHeight="3" behindDoc="0" locked="0" layoutInCell="1" allowOverlap="1" wp14:anchorId="3F3D3C7B">
+              <wp:anchor distT="6985" distB="6985" distL="635" distR="0" simplePos="0" relativeHeight="3" behindDoc="0" locked="0" layoutInCell="1" allowOverlap="1" wp14:anchorId="414DEB82" wp14:editId="65509EEF">
                 <wp:simplePos x="0" y="0"/>
                 <wp:positionH relativeFrom="column">
                   <wp:posOffset>0</wp:posOffset>
@@ -98,10 +114,11 @@
                 <wp:effectExtent l="635" t="6985" r="0" b="6985"/>
                 <wp:wrapNone/>
                 <wp:docPr id="1" name="Straight Connector 3"/>
+                <wp:cNvGraphicFramePr/>
                 <a:graphic xmlns:a="http://schemas.openxmlformats.org/drawingml/2006/main">
                   <a:graphicData uri="http://schemas.microsoft.com/office/word/2010/wordprocessingShape">
                     <wps:wsp>
-                      <wps:cNvSpPr/>
+                      <wps:cNvCnPr/>
                       <wps:spPr>
                         <a:xfrm>
                           <a:off x="0" y="0"/>
@@ -135,7 +152,7 @@
               </wp:anchor>
             </w:drawing>
           </mc:Choice>
-          <mc:Fallback>
+          <mc:Fallback xmlns:pic="http://schemas.openxmlformats.org/drawingml/2006/picture">
             <w:pict>
               <v:line id="shape_0" from="0pt,-0.05pt" to="542.15pt,-0.05pt" stroked="t" o:allowincell="f" style="position:absolute" wp14:anchorId="3F3D3C7B">
                 <v:stroke color="#bdd7ee" weight="12600" joinstyle="miter" endcap="flat"/>
@@ -149,7 +166,6 @@
     </w:p>
     <w:p>
       <w:pPr>
-        <w:pStyle w:val="Normal"/>
         <w:rPr>
           <w:color w:val="044361"/>
         </w:rPr>
@@ -162,13 +178,11 @@
         <w:t>Team:</w:t>
       </w:r>
       <w:r>
-        <w:rPr/>
         <w:t xml:space="preserve"> </w:t>
       </w:r>
     </w:p>
     <w:p>
       <w:pPr>
-        <w:pStyle w:val="Normal"/>
         <w:rPr>
           <w:color w:val="044361"/>
         </w:rPr>
@@ -184,16 +198,8 @@
       <w:tblPr>
         <w:tblStyle w:val="TableGrid"/>
         <w:tblW w:w="10975" w:type="dxa"/>
-        <w:jc w:val="start"/>
-        <w:tblInd w:w="0" w:type="dxa"/>
         <w:tblLayout w:type="fixed"/>
-        <w:tblCellMar>
-          <w:top w:w="0" w:type="dxa"/>
-          <w:start w:w="108" w:type="dxa"/>
-          <w:bottom w:w="0" w:type="dxa"/>
-          <w:end w:w="108" w:type="dxa"/>
-        </w:tblCellMar>
-        <w:tblLook w:noHBand="0" w:noVBand="1" w:firstColumn="1" w:lastRow="0" w:lastColumn="0" w:firstRow="1" w:val="04a0"/>
+        <w:tblLook w:val="04A0" w:firstRow="1" w:lastRow="0" w:firstColumn="1" w:lastColumn="0" w:noHBand="0" w:noVBand="1"/>
       </w:tblPr>
       <w:tblGrid>
         <w:gridCol w:w="3865"/>
@@ -202,30 +208,17 @@
       </w:tblGrid>
       <w:tr>
         <w:trPr>
-          <w:tblHeader w:val="true"/>
+          <w:tblHeader/>
         </w:trPr>
         <w:tc>
           <w:tcPr>
             <w:tcW w:w="3865" w:type="dxa"/>
-            <w:tcBorders/>
           </w:tcPr>
           <w:p>
             <w:pPr>
               <w:pStyle w:val="Heading1"/>
-              <w:widowControl/>
-              <w:suppressAutoHyphens w:val="true"/>
-              <w:spacing w:before="160" w:after="0"/>
-              <w:jc w:val="start"/>
-              <w:rPr>
-                <w:kern w:val="0"/>
-                <w:lang w:val="en-US" w:eastAsia="en-US" w:bidi="ar-SA"/>
-              </w:rPr>
             </w:pPr>
             <w:r>
-              <w:rPr>
-                <w:kern w:val="0"/>
-                <w:lang w:val="en-US" w:eastAsia="en-US" w:bidi="ar-SA"/>
-              </w:rPr>
               <w:t>Name</w:t>
             </w:r>
           </w:p>
@@ -233,25 +226,12 @@
         <w:tc>
           <w:tcPr>
             <w:tcW w:w="3060" w:type="dxa"/>
-            <w:tcBorders/>
           </w:tcPr>
           <w:p>
             <w:pPr>
               <w:pStyle w:val="Heading1"/>
-              <w:widowControl/>
-              <w:suppressAutoHyphens w:val="true"/>
-              <w:spacing w:before="160" w:after="0"/>
-              <w:jc w:val="start"/>
-              <w:rPr>
-                <w:kern w:val="0"/>
-                <w:lang w:val="en-US" w:eastAsia="en-US" w:bidi="ar-SA"/>
-              </w:rPr>
             </w:pPr>
             <w:r>
-              <w:rPr>
-                <w:kern w:val="0"/>
-                <w:lang w:val="en-US" w:eastAsia="en-US" w:bidi="ar-SA"/>
-              </w:rPr>
               <w:t>Email</w:t>
             </w:r>
           </w:p>
@@ -259,54 +239,32 @@
         <w:tc>
           <w:tcPr>
             <w:tcW w:w="4050" w:type="dxa"/>
-            <w:tcBorders/>
           </w:tcPr>
           <w:p>
             <w:pPr>
               <w:pStyle w:val="Heading1"/>
-              <w:widowControl/>
-              <w:suppressAutoHyphens w:val="true"/>
-              <w:spacing w:before="160" w:after="0"/>
               <w:jc w:val="center"/>
-              <w:rPr>
-                <w:kern w:val="0"/>
-                <w:lang w:val="en-US" w:eastAsia="en-US" w:bidi="ar-SA"/>
-              </w:rPr>
             </w:pPr>
             <w:r>
-              <w:rPr>
-                <w:kern w:val="0"/>
-                <w:lang w:val="en-US" w:eastAsia="en-US" w:bidi="ar-SA"/>
-              </w:rPr>
               <w:t>GitHub</w:t>
             </w:r>
           </w:p>
         </w:tc>
       </w:tr>
       <w:tr>
-        <w:trPr/>
         <w:tc>
           <w:tcPr>
             <w:tcW w:w="3865" w:type="dxa"/>
-            <w:tcBorders/>
           </w:tcPr>
           <w:p>
             <w:pPr>
-              <w:pStyle w:val="Normal"/>
-              <w:widowControl/>
-              <w:suppressAutoHyphens w:val="true"/>
-              <w:spacing w:before="0" w:after="0"/>
-              <w:jc w:val="start"/>
               <w:rPr>
                 <w:color w:val="054361"/>
               </w:rPr>
             </w:pPr>
             <w:r>
               <w:rPr>
-                <w:rFonts w:eastAsia="Times New Roman" w:cs="Times New Roman"/>
                 <w:color w:val="054361"/>
-                <w:kern w:val="0"/>
-                <w:lang w:val="en-US" w:eastAsia="en-US" w:bidi="ar-SA"/>
               </w:rPr>
               <w:t>Ethan</w:t>
             </w:r>
@@ -315,14 +273,36 @@
         <w:tc>
           <w:tcPr>
             <w:tcW w:w="3060" w:type="dxa"/>
-            <w:tcBorders/>
           </w:tcPr>
           <w:p>
             <w:pPr>
-              <w:pStyle w:val="Normal"/>
-              <w:widowControl/>
-              <w:suppressAutoHyphens w:val="true"/>
-              <w:spacing w:before="0" w:after="0"/>
+              <w:jc w:val="center"/>
+              <w:rPr>
+                <w:color w:val="054361"/>
+              </w:rPr>
+            </w:pPr>
+            <w:proofErr w:type="spellStart"/>
+            <w:r>
+              <w:rPr>
+                <w:color w:val="054361"/>
+              </w:rPr>
+              <w:t>eklasky</w:t>
+            </w:r>
+            <w:proofErr w:type="spellEnd"/>
+            <w:r>
+              <w:rPr>
+                <w:color w:val="054361"/>
+              </w:rPr>
+              <w:t xml:space="preserve"> @ufl.edu</w:t>
+            </w:r>
+          </w:p>
+        </w:tc>
+        <w:tc>
+          <w:tcPr>
+            <w:tcW w:w="4050" w:type="dxa"/>
+          </w:tcPr>
+          <w:p>
+            <w:pPr>
               <w:jc w:val="center"/>
               <w:rPr>
                 <w:color w:val="054361"/>
@@ -330,26 +310,46 @@
             </w:pPr>
             <w:r>
               <w:rPr>
-                <w:rFonts w:eastAsia="Times New Roman" w:cs="Times New Roman"/>
                 <w:color w:val="054361"/>
-                <w:kern w:val="0"/>
-                <w:lang w:val="en-US" w:eastAsia="en-US" w:bidi="ar-SA"/>
               </w:rPr>
-              <w:t>eklasky @ufl.edu</w:t>
+              <w:t>E53klasky</w:t>
             </w:r>
+          </w:p>
+        </w:tc>
+      </w:tr>
+      <w:tr>
+        <w:tc>
+          <w:tcPr>
+            <w:tcW w:w="3865" w:type="dxa"/>
+          </w:tcPr>
+          <w:p>
+            <w:pPr>
+              <w:rPr>
+                <w:color w:val="054361"/>
+              </w:rPr>
+            </w:pPr>
+            <w:r>
+              <w:rPr>
+                <w:color w:val="054361"/>
+              </w:rPr>
+              <w:t xml:space="preserve">Amit Athi </w:t>
+            </w:r>
+            <w:proofErr w:type="spellStart"/>
+            <w:r>
+              <w:rPr>
+                <w:color w:val="054361"/>
+              </w:rPr>
+              <w:t>Kesavan</w:t>
+            </w:r>
+            <w:proofErr w:type="spellEnd"/>
           </w:p>
         </w:tc>
         <w:tc>
           <w:tcPr>
-            <w:tcW w:w="4050" w:type="dxa"/>
-            <w:tcBorders/>
+            <w:tcW w:w="3060" w:type="dxa"/>
           </w:tcPr>
           <w:p>
             <w:pPr>
-              <w:pStyle w:val="Normal"/>
-              <w:widowControl/>
-              <w:suppressAutoHyphens w:val="true"/>
-              <w:spacing w:before="0" w:after="0"/>
               <w:jc w:val="center"/>
               <w:rPr>
                 <w:color w:val="054361"/>
@@ -357,67 +357,7 @@
             </w:pPr>
             <w:r>
               <w:rPr>
-                <w:rFonts w:eastAsia="Times New Roman" w:cs="Times New Roman"/>
                 <w:color w:val="054361"/>
-                <w:kern w:val="0"/>
-                <w:lang w:val="en-US" w:eastAsia="en-US" w:bidi="ar-SA"/>
-              </w:rPr>
-              <w:t>E53klasky</w:t>
-            </w:r>
-          </w:p>
-        </w:tc>
-      </w:tr>
-      <w:tr>
-        <w:trPr/>
-        <w:tc>
-          <w:tcPr>
-            <w:tcW w:w="3865" w:type="dxa"/>
-            <w:tcBorders/>
-          </w:tcPr>
-          <w:p>
-            <w:pPr>
-              <w:pStyle w:val="Normal"/>
-              <w:widowControl/>
-              <w:suppressAutoHyphens w:val="true"/>
-              <w:spacing w:before="0" w:after="0"/>
-              <w:jc w:val="start"/>
-              <w:rPr>
-                <w:color w:val="054361"/>
-              </w:rPr>
-            </w:pPr>
-            <w:r>
-              <w:rPr>
-                <w:rFonts w:eastAsia="Times New Roman" w:cs="Times New Roman"/>
-                <w:color w:val="054361"/>
-                <w:kern w:val="0"/>
-                <w:lang w:val="en-US" w:eastAsia="en-US" w:bidi="ar-SA"/>
-              </w:rPr>
-              <w:t>Amit Athi Kesavan</w:t>
-            </w:r>
-          </w:p>
-        </w:tc>
-        <w:tc>
-          <w:tcPr>
-            <w:tcW w:w="3060" w:type="dxa"/>
-            <w:tcBorders/>
-          </w:tcPr>
-          <w:p>
-            <w:pPr>
-              <w:pStyle w:val="Normal"/>
-              <w:widowControl/>
-              <w:suppressAutoHyphens w:val="true"/>
-              <w:spacing w:before="0" w:after="0"/>
-              <w:jc w:val="center"/>
-              <w:rPr>
-                <w:color w:val="054361"/>
-              </w:rPr>
-            </w:pPr>
-            <w:r>
-              <w:rPr>
-                <w:rFonts w:eastAsia="Times New Roman" w:cs="Times New Roman"/>
-                <w:color w:val="054361"/>
-                <w:kern w:val="0"/>
-                <w:lang w:val="en-US" w:eastAsia="en-US" w:bidi="ar-SA"/>
               </w:rPr>
               <w:t>amit.athikesavan@ufl.edu</w:t>
             </w:r>
@@ -426,72 +366,9 @@
         <w:tc>
           <w:tcPr>
             <w:tcW w:w="4050" w:type="dxa"/>
-            <w:tcBorders/>
           </w:tcPr>
           <w:p>
             <w:pPr>
-              <w:pStyle w:val="Normal"/>
-              <w:widowControl/>
-              <w:suppressAutoHyphens w:val="true"/>
-              <w:spacing w:before="0" w:after="0"/>
-              <w:jc w:val="center"/>
-              <w:rPr/>
-            </w:pPr>
-            <w:hyperlink r:id="rId2">
-              <w:r>
-                <w:rPr>
-                  <w:rStyle w:val="Hyperlink"/>
-                  <w:rFonts w:eastAsia="Times New Roman" w:cs="Times New Roman"/>
-                  <w:color w:val="054361"/>
-                  <w:kern w:val="0"/>
-                  <w:lang w:val="en-US" w:eastAsia="en-US" w:bidi="ar-SA"/>
-                </w:rPr>
-                <w:t>github.com/amitathik7</w:t>
-              </w:r>
-            </w:hyperlink>
-          </w:p>
-        </w:tc>
-      </w:tr>
-      <w:tr>
-        <w:trPr/>
-        <w:tc>
-          <w:tcPr>
-            <w:tcW w:w="3865" w:type="dxa"/>
-            <w:tcBorders/>
-          </w:tcPr>
-          <w:p>
-            <w:pPr>
-              <w:pStyle w:val="Normal"/>
-              <w:widowControl/>
-              <w:suppressAutoHyphens w:val="true"/>
-              <w:spacing w:before="0" w:after="0"/>
-              <w:jc w:val="start"/>
-              <w:rPr>
-                <w:color w:val="054361"/>
-              </w:rPr>
-            </w:pPr>
-            <w:r>
-              <w:rPr>
-                <w:rFonts w:eastAsia="Times New Roman" w:cs="Times New Roman"/>
-                <w:color w:val="054361"/>
-                <w:kern w:val="0"/>
-                <w:lang w:val="en-US" w:eastAsia="en-US" w:bidi="ar-SA"/>
-              </w:rPr>
-              <w:t>&lt;student3 name&gt;</w:t>
-            </w:r>
-          </w:p>
-        </w:tc>
-        <w:tc>
-          <w:tcPr>
-            <w:tcW w:w="3060" w:type="dxa"/>
-            <w:tcBorders/>
-          </w:tcPr>
-          <w:p>
-            <w:pPr>
-              <w:pStyle w:val="Normal"/>
-              <w:widowControl/>
-              <w:suppressAutoHyphens w:val="true"/>
-              <w:spacing w:before="0" w:after="0"/>
               <w:jc w:val="center"/>
               <w:rPr>
                 <w:color w:val="054361"/>
@@ -499,26 +376,38 @@
             </w:pPr>
             <w:r>
               <w:rPr>
-                <w:rFonts w:eastAsia="Times New Roman" w:cs="Times New Roman"/>
                 <w:color w:val="054361"/>
-                <w:kern w:val="0"/>
-                <w:lang w:val="en-US" w:eastAsia="en-US" w:bidi="ar-SA"/>
               </w:rPr>
-              <w:t>&lt;student3@ufl.edu&gt;</w:t>
+              <w:t>github.com/amitathik7</w:t>
+            </w:r>
+          </w:p>
+        </w:tc>
+      </w:tr>
+      <w:tr>
+        <w:tc>
+          <w:tcPr>
+            <w:tcW w:w="3865" w:type="dxa"/>
+          </w:tcPr>
+          <w:p>
+            <w:pPr>
+              <w:rPr>
+                <w:color w:val="054361"/>
+              </w:rPr>
+            </w:pPr>
+            <w:r>
+              <w:rPr>
+                <w:color w:val="054361"/>
+              </w:rPr>
+              <w:t>Timothy Wang</w:t>
             </w:r>
           </w:p>
         </w:tc>
         <w:tc>
           <w:tcPr>
-            <w:tcW w:w="4050" w:type="dxa"/>
-            <w:tcBorders/>
+            <w:tcW w:w="3060" w:type="dxa"/>
           </w:tcPr>
           <w:p>
             <w:pPr>
-              <w:pStyle w:val="Normal"/>
-              <w:widowControl/>
-              <w:suppressAutoHyphens w:val="true"/>
-              <w:spacing w:before="0" w:after="0"/>
               <w:jc w:val="center"/>
               <w:rPr>
                 <w:color w:val="054361"/>
@@ -526,29 +415,36 @@
             </w:pPr>
             <w:r>
               <w:rPr>
-                <w:rFonts w:eastAsia="Times New Roman" w:cs="Times New Roman"/>
                 <w:color w:val="054361"/>
-                <w:kern w:val="0"/>
-                <w:lang w:val="en-US" w:eastAsia="en-US" w:bidi="ar-SA"/>
               </w:rPr>
-              <w:t>&lt;github.com/student3&gt;</w:t>
+              <w:t>timothy.wang@ufl.edu</w:t>
+            </w:r>
+          </w:p>
+        </w:tc>
+        <w:tc>
+          <w:tcPr>
+            <w:tcW w:w="4050" w:type="dxa"/>
+          </w:tcPr>
+          <w:p>
+            <w:pPr>
+              <w:jc w:val="center"/>
+              <w:rPr>
+                <w:color w:val="054361"/>
+              </w:rPr>
+            </w:pPr>
+            <w:r>
+              <w:rPr>
+                <w:color w:val="054361"/>
+              </w:rPr>
+              <w:t>github.com/timothyw8</w:t>
             </w:r>
           </w:p>
         </w:tc>
       </w:tr>
     </w:tbl>
-    <w:p>
-      <w:pPr>
-        <w:pStyle w:val="Normal"/>
-        <w:rPr/>
-      </w:pPr>
-      <w:r>
-        <w:rPr/>
-      </w:r>
-    </w:p>
-    <w:p>
-      <w:pPr>
-        <w:pStyle w:val="Normal"/>
+    <w:p/>
+    <w:p>
+      <w:pPr>
         <w:rPr>
           <w:color w:val="054361"/>
         </w:rPr>
@@ -561,10 +457,9 @@
         <w:t>Data:</w:t>
       </w:r>
       <w:r>
-        <w:rPr/>
         <w:t xml:space="preserve"> </w:t>
       </w:r>
-      <w:hyperlink r:id="rId3">
+      <w:hyperlink r:id="rId8">
         <w:r>
           <w:rPr>
             <w:rStyle w:val="Hyperlink"/>
@@ -573,18 +468,9 @@
         </w:r>
       </w:hyperlink>
     </w:p>
-    <w:p>
-      <w:pPr>
-        <w:pStyle w:val="Normal"/>
-        <w:rPr/>
-      </w:pPr>
-      <w:r>
-        <w:rPr/>
-      </w:r>
-    </w:p>
-    <w:p>
-      <w:pPr>
-        <w:pStyle w:val="Normal"/>
+    <w:p/>
+    <w:p>
+      <w:pPr>
         <w:rPr>
           <w:color w:val="054361"/>
         </w:rPr>
@@ -597,7 +483,6 @@
         <w:t>Scientific Question:</w:t>
       </w:r>
       <w:r>
-        <w:rPr/>
         <w:t xml:space="preserve"> </w:t>
       </w:r>
       <w:r>
@@ -607,20 +492,8 @@
         <w:t>Can gene expression patterns in blood distinguish tuberculosis patients who have different treatment outcomes?</w:t>
       </w:r>
     </w:p>
-    <w:p>
-      <w:pPr>
-        <w:pStyle w:val="Normal"/>
-        <w:rPr/>
-      </w:pPr>
-      <w:r>
-        <w:rPr/>
-      </w:r>
-    </w:p>
-    <w:p>
-      <w:pPr>
-        <w:pStyle w:val="Normal"/>
-        <w:rPr/>
-      </w:pPr>
+    <w:p/>
+    <w:p>
       <w:r>
         <w:rPr>
           <w:b/>
@@ -629,7 +502,6 @@
         <w:t>GitHub Repository for Project:</w:t>
       </w:r>
       <w:r>
-        <w:rPr/>
         <w:t xml:space="preserve"> </w:t>
       </w:r>
       <w:r>
@@ -642,14 +514,15 @@
     <w:p>
       <w:pPr>
         <w:pStyle w:val="Heading1"/>
-        <w:rPr/>
-      </w:pPr>
-      <w:r>
-        <w:rPr/>
+      </w:pPr>
+      <w:r>
+        <w:rPr>
+          <w:noProof/>
+        </w:rPr>
         <mc:AlternateContent>
           <mc:Choice Requires="wps">
             <w:drawing>
-              <wp:anchor distT="6350" distB="6350" distL="635" distR="0" simplePos="0" relativeHeight="4" behindDoc="0" locked="0" layoutInCell="1" allowOverlap="1" wp14:anchorId="5FC03F4E">
+              <wp:anchor distT="6350" distB="6350" distL="635" distR="0" simplePos="0" relativeHeight="4" behindDoc="0" locked="0" layoutInCell="1" allowOverlap="1" wp14:anchorId="60EE2651" wp14:editId="2B40D60E">
                 <wp:simplePos x="0" y="0"/>
                 <wp:positionH relativeFrom="column">
                   <wp:posOffset>-3810</wp:posOffset>
@@ -661,10 +534,11 @@
                 <wp:effectExtent l="635" t="6350" r="0" b="6350"/>
                 <wp:wrapNone/>
                 <wp:docPr id="2" name="Straight Connector 1"/>
+                <wp:cNvGraphicFramePr/>
                 <a:graphic xmlns:a="http://schemas.openxmlformats.org/drawingml/2006/main">
                   <a:graphicData uri="http://schemas.microsoft.com/office/word/2010/wordprocessingShape">
                     <wps:wsp>
-                      <wps:cNvSpPr/>
+                      <wps:cNvCnPr/>
                       <wps:spPr>
                         <a:xfrm>
                           <a:off x="0" y="0"/>
@@ -698,7 +572,7 @@
               </wp:anchor>
             </w:drawing>
           </mc:Choice>
-          <mc:Fallback>
+          <mc:Fallback xmlns:pic="http://schemas.openxmlformats.org/drawingml/2006/picture">
             <w:pict>
               <v:line id="shape_0" from="-0.3pt,14.4pt" to="541.85pt,14.4pt" stroked="t" o:allowincell="f" style="position:absolute" wp14:anchorId="5FC03F4E">
                 <v:stroke color="#bdd7ee" weight="12600" joinstyle="miter" endcap="flat"/>
@@ -710,15 +584,7 @@
         </mc:AlternateContent>
       </w:r>
     </w:p>
-    <w:p>
-      <w:pPr>
-        <w:pStyle w:val="Normal"/>
-        <w:rPr/>
-      </w:pPr>
-      <w:r>
-        <w:rPr/>
-      </w:r>
-    </w:p>
+    <w:p/>
     <w:p>
       <w:pPr>
         <w:pStyle w:val="ListParagraph"/>
@@ -762,7 +628,8 @@
         </w:rPr>
         <w:t xml:space="preserve">Unsupervised Analysis (e.g. using </w:t>
       </w:r>
-      <w:hyperlink r:id="rId4">
+      <w:hyperlink r:id="rId9">
+        <w:proofErr w:type="spellStart"/>
         <w:r>
           <w:rPr>
             <w:rStyle w:val="Hyperlink"/>
@@ -771,6 +638,7 @@
           </w:rPr>
           <w:t>TidyClust</w:t>
         </w:r>
+        <w:proofErr w:type="spellEnd"/>
       </w:hyperlink>
       <w:r>
         <w:rPr>
@@ -780,7 +648,7 @@
         </w:rPr>
         <w:t xml:space="preserve"> in R or </w:t>
       </w:r>
-      <w:hyperlink r:id="rId5">
+      <w:hyperlink r:id="rId10">
         <w:r>
           <w:rPr>
             <w:rStyle w:val="Hyperlink"/>
@@ -864,14 +732,30 @@
         </w:rPr>
         <w:t xml:space="preserve">K-means (tutorial: </w:t>
       </w:r>
-      <w:hyperlink r:id="rId6">
+      <w:hyperlink r:id="rId11">
         <w:r>
           <w:rPr>
             <w:rStyle w:val="Hyperlink"/>
             <w:i/>
             <w:iCs/>
           </w:rPr>
-          <w:t>https://www.tidymodels.org/learn/statistics/k-means/index.html</w:t>
+          <w:t>https://www.tidymodels.org/learn/statistics/k-mea</w:t>
+        </w:r>
+        <w:r>
+          <w:rPr>
+            <w:rStyle w:val="Hyperlink"/>
+            <w:i/>
+            <w:iCs/>
+          </w:rPr>
+          <w:t>n</w:t>
+        </w:r>
+        <w:r>
+          <w:rPr>
+            <w:rStyle w:val="Hyperlink"/>
+            <w:i/>
+            <w:iCs/>
+          </w:rPr>
+          <w:t>s/index.html</w:t>
         </w:r>
       </w:hyperlink>
       <w:r>
@@ -904,7 +788,7 @@
           <w:color w:val="064462"/>
         </w:rPr>
       </w:pPr>
-      <w:hyperlink r:id="rId7">
+      <w:hyperlink r:id="rId12">
         <w:r>
           <w:rPr>
             <w:rStyle w:val="Hyperlink"/>
@@ -922,6 +806,14 @@
         </w:rPr>
         <w:t xml:space="preserve">  </w:t>
       </w:r>
+      <w:r>
+        <w:rPr>
+          <w:i/>
+          <w:iCs/>
+          <w:color w:val="EE0000"/>
+        </w:rPr>
+        <w:t>Tim</w:t>
+      </w:r>
     </w:p>
     <w:p>
       <w:pPr>
@@ -936,7 +828,7 @@
           <w:color w:val="064462"/>
         </w:rPr>
       </w:pPr>
-      <w:hyperlink r:id="rId8">
+      <w:hyperlink r:id="rId13">
         <w:r>
           <w:rPr>
             <w:rStyle w:val="Hyperlink"/>
@@ -972,7 +864,7 @@
         <w:rPr>
           <w:i/>
           <w:iCs/>
-          <w:color w:themeColor="text2" w:val="44546A"/>
+          <w:color w:val="44546A" w:themeColor="text2"/>
         </w:rPr>
         <w:t xml:space="preserve">clustering </w:t>
       </w:r>
@@ -982,19 +874,39 @@
           <w:iCs/>
           <w:color w:val="064462"/>
         </w:rPr>
-        <w:t>(e.g. hclust)</w:t>
+        <w:t xml:space="preserve">(e.g. </w:t>
+      </w:r>
+      <w:proofErr w:type="spellStart"/>
+      <w:r>
+        <w:rPr>
+          <w:i/>
+          <w:iCs/>
+          <w:color w:val="064462"/>
+        </w:rPr>
+        <w:t>hclust</w:t>
+      </w:r>
+      <w:proofErr w:type="spellEnd"/>
+      <w:r>
+        <w:rPr>
+          <w:i/>
+          <w:iCs/>
+          <w:color w:val="064462"/>
+        </w:rPr>
+        <w:t>)</w:t>
+      </w:r>
+      <w:r>
+        <w:rPr>
+          <w:i/>
+          <w:iCs/>
+          <w:color w:val="064462"/>
+        </w:rPr>
         <w:br/>
       </w:r>
       <w:r>
         <w:rPr>
-          <w:rFonts w:eastAsia="Times New Roman" w:cs="Times New Roman"/>
           <w:i/>
           <w:iCs/>
           <w:color w:val="EE0000"/>
-          <w:kern w:val="0"/>
-          <w:sz w:val="22"/>
-          <w:szCs w:val="24"/>
-          <w:lang w:val="en-US" w:eastAsia="en-US" w:bidi="ar-SA"/>
         </w:rPr>
         <w:t>Amit</w:t>
       </w:r>
@@ -1058,7 +970,8 @@
           <w:u w:val="none"/>
         </w:rPr>
       </w:pPr>
-      <w:hyperlink r:id="rId9">
+      <w:hyperlink r:id="rId14">
+        <w:proofErr w:type="spellStart"/>
         <w:r>
           <w:rPr>
             <w:rStyle w:val="Hyperlink"/>
@@ -1067,6 +980,7 @@
           </w:rPr>
           <w:t>ConsensusClusterPlus</w:t>
         </w:r>
+        <w:proofErr w:type="spellEnd"/>
       </w:hyperlink>
     </w:p>
     <w:p>
@@ -1080,7 +994,7 @@
           <w:rStyle w:val="Hyperlink"/>
           <w:i/>
           <w:iCs/>
-          <w:color w:themeColor="text2" w:val="44546A"/>
+          <w:color w:val="44546A" w:themeColor="text2"/>
           <w:u w:val="none"/>
         </w:rPr>
       </w:pPr>
@@ -1089,7 +1003,7 @@
           <w:rStyle w:val="Hyperlink"/>
           <w:i/>
           <w:iCs/>
-          <w:color w:themeColor="text2" w:val="44546A"/>
+          <w:color w:val="44546A" w:themeColor="text2"/>
           <w:u w:val="none"/>
         </w:rPr>
         <w:t>another method (with instructor permission only)</w:t>
@@ -1152,20 +1066,13 @@
     <w:p>
       <w:pPr>
         <w:pStyle w:val="ListParagraph"/>
-        <w:ind w:start="1440"/>
+        <w:ind w:left="1440"/>
         <w:rPr>
           <w:i/>
           <w:iCs/>
           <w:color w:val="EE0000"/>
         </w:rPr>
       </w:pPr>
-      <w:r>
-        <w:rPr>
-          <w:i/>
-          <w:iCs/>
-          <w:color w:val="EE0000"/>
-        </w:rPr>
-      </w:r>
     </w:p>
     <w:p>
       <w:pPr>
@@ -1318,6 +1225,7 @@
           <w:iCs/>
           <w:color w:val="064462"/>
         </w:rPr>
+        <w:lastRenderedPageBreak/>
         <w:t>Create a heatmap of the 5,000 genes used in clustering. Add an annotation sidebar showing one set of clusters you identified from each clustering method and the sample groups from Assignment 1.</w:t>
       </w:r>
     </w:p>
@@ -1389,17 +1297,16 @@
     </w:p>
     <w:p>
       <w:pPr>
-        <w:pStyle w:val="Normal"/>
         <w:spacing w:beforeAutospacing="1" w:afterAutospacing="1"/>
         <w:rPr>
-          <w:rFonts w:ascii="Calibri Light" w:hAnsi="Calibri Light" w:cs="Calibri Light" w:asciiTheme="majorHAnsi" w:cstheme="majorHAnsi" w:hAnsiTheme="majorHAnsi"/>
+          <w:rFonts w:asciiTheme="majorHAnsi" w:hAnsiTheme="majorHAnsi" w:cstheme="majorHAnsi"/>
           <w:color w:val="EE0000"/>
           <w:szCs w:val="22"/>
         </w:rPr>
       </w:pPr>
       <w:r>
         <w:rPr>
-          <w:rFonts w:cs="Calibri Light" w:ascii="Calibri Light" w:hAnsi="Calibri Light" w:cstheme="majorHAnsi"/>
+          <w:rFonts w:ascii="Calibri Light" w:hAnsi="Calibri Light" w:cstheme="majorHAnsi"/>
           <w:color w:val="EE0000"/>
           <w:szCs w:val="22"/>
         </w:rPr>
@@ -1408,17 +1315,16 @@
     </w:p>
     <w:p>
       <w:pPr>
-        <w:pStyle w:val="Normal"/>
         <w:spacing w:beforeAutospacing="1" w:afterAutospacing="1"/>
         <w:rPr>
-          <w:rFonts w:ascii="Calibri Light" w:hAnsi="Calibri Light" w:cs="Calibri Light" w:asciiTheme="majorHAnsi" w:cstheme="majorHAnsi" w:hAnsiTheme="majorHAnsi"/>
+          <w:rFonts w:asciiTheme="majorHAnsi" w:hAnsiTheme="majorHAnsi" w:cstheme="majorHAnsi"/>
           <w:color w:val="EE0000"/>
           <w:szCs w:val="22"/>
         </w:rPr>
       </w:pPr>
       <w:r>
         <w:rPr>
-          <w:rFonts w:cs="Calibri Light" w:ascii="Calibri Light" w:hAnsi="Calibri Light" w:cstheme="majorHAnsi"/>
+          <w:rFonts w:ascii="Calibri Light" w:hAnsi="Calibri Light" w:cstheme="majorHAnsi"/>
           <w:color w:val="EE0000"/>
           <w:szCs w:val="22"/>
         </w:rPr>
@@ -1427,283 +1333,222 @@
     </w:p>
     <w:p>
       <w:pPr>
-        <w:pStyle w:val="Normal"/>
         <w:spacing w:beforeAutospacing="1" w:afterAutospacing="1"/>
         <w:rPr>
-          <w:rFonts w:ascii="Calibri Light" w:hAnsi="Calibri Light" w:cs="Calibri Light" w:asciiTheme="majorHAnsi" w:cstheme="majorHAnsi" w:hAnsiTheme="majorHAnsi"/>
+          <w:rFonts w:asciiTheme="majorHAnsi" w:hAnsiTheme="majorHAnsi" w:cstheme="majorHAnsi"/>
           <w:color w:val="EE0000"/>
           <w:szCs w:val="22"/>
         </w:rPr>
       </w:pPr>
       <w:r>
         <w:rPr>
-          <w:rFonts w:cs="Calibri Light" w:ascii="Calibri Light" w:hAnsi="Calibri Light" w:cstheme="majorHAnsi"/>
+          <w:rFonts w:ascii="Calibri Light" w:hAnsi="Calibri Light" w:cstheme="majorHAnsi"/>
           <w:color w:val="EE0000"/>
           <w:szCs w:val="22"/>
         </w:rPr>
-        <w:t>d. The hierarchical clustering method reuslted in two clusters.</w:t>
-      </w:r>
-    </w:p>
-    <w:p>
-      <w:pPr>
-        <w:pStyle w:val="Normal"/>
-        <w:spacing w:beforeAutospacing="1" w:afterAutospacing="1"/>
-        <w:rPr>
-          <w:rFonts w:ascii="Calibri Light" w:hAnsi="Calibri Light" w:cs="Calibri Light" w:asciiTheme="majorHAnsi" w:cstheme="majorHAnsi" w:hAnsiTheme="majorHAnsi"/>
+        <w:t xml:space="preserve">d. The hierarchical clustering method </w:t>
+      </w:r>
+      <w:proofErr w:type="spellStart"/>
+      <w:r>
+        <w:rPr>
+          <w:rFonts w:ascii="Calibri Light" w:hAnsi="Calibri Light" w:cstheme="majorHAnsi"/>
           <w:color w:val="EE0000"/>
           <w:szCs w:val="22"/>
         </w:rPr>
-      </w:pPr>
-      <w:r>
-        <w:rPr>
-          <w:rFonts w:cs="Calibri Light" w:ascii="Calibri Light" w:hAnsi="Calibri Light" w:cstheme="majorHAnsi"/>
+        <w:t>reuslted</w:t>
+      </w:r>
+      <w:proofErr w:type="spellEnd"/>
+      <w:r>
+        <w:rPr>
+          <w:rFonts w:ascii="Calibri Light" w:hAnsi="Calibri Light" w:cstheme="majorHAnsi"/>
           <w:color w:val="EE0000"/>
           <w:szCs w:val="22"/>
         </w:rPr>
-        <w:tab/>
-        <w:t>i. Changing the value from n=2 to other values decreased the accuracy significantly as there was a greater overlap between clusters after n=2.</w:t>
-      </w:r>
-    </w:p>
-    <w:p>
-      <w:pPr>
-        <w:pStyle w:val="Normal"/>
+        <w:t xml:space="preserve"> in two clusters.</w:t>
+      </w:r>
+    </w:p>
+    <w:p>
+      <w:pPr>
         <w:spacing w:beforeAutospacing="1" w:afterAutospacing="1"/>
         <w:rPr>
-          <w:rFonts w:ascii="Calibri Light" w:hAnsi="Calibri Light" w:cs="Calibri Light" w:asciiTheme="majorHAnsi" w:cstheme="majorHAnsi" w:hAnsiTheme="majorHAnsi"/>
+          <w:rFonts w:asciiTheme="majorHAnsi" w:hAnsiTheme="majorHAnsi" w:cstheme="majorHAnsi"/>
           <w:color w:val="EE0000"/>
           <w:szCs w:val="22"/>
         </w:rPr>
       </w:pPr>
       <w:r>
         <w:rPr>
-          <w:rFonts w:cs="Calibri Light" w:cstheme="majorHAnsi" w:ascii="Calibri Light" w:hAnsi="Calibri Light"/>
+          <w:rFonts w:ascii="Calibri Light" w:hAnsi="Calibri Light" w:cstheme="majorHAnsi"/>
           <w:color w:val="EE0000"/>
           <w:szCs w:val="22"/>
         </w:rPr>
-        <w:t>ei. When I changed the number of genes I found that the lower the number of genes the greater accuracy there was in the hierarchical clustering means procedure.</w:t>
-      </w:r>
-    </w:p>
-    <w:p>
-      <w:pPr>
-        <w:pStyle w:val="Normal"/>
-        <w:spacing w:beforeAutospacing="1" w:afterAutospacing="1"/>
-        <w:rPr>
-          <w:rFonts w:ascii="Calibri Light" w:hAnsi="Calibri Light" w:cs="Calibri Light" w:asciiTheme="majorHAnsi" w:cstheme="majorHAnsi" w:hAnsiTheme="majorHAnsi"/>
+        <w:tab/>
+      </w:r>
+      <w:proofErr w:type="spellStart"/>
+      <w:r>
+        <w:rPr>
+          <w:rFonts w:ascii="Calibri Light" w:hAnsi="Calibri Light" w:cstheme="majorHAnsi"/>
           <w:color w:val="EE0000"/>
           <w:szCs w:val="22"/>
         </w:rPr>
-      </w:pPr>
-      <w:r>
-        <w:rPr>
-          <w:rFonts w:cs="Calibri Light" w:cstheme="majorHAnsi" w:ascii="Calibri Light" w:hAnsi="Calibri Light"/>
+        <w:t>i</w:t>
+      </w:r>
+      <w:proofErr w:type="spellEnd"/>
+      <w:r>
+        <w:rPr>
+          <w:rFonts w:ascii="Calibri Light" w:hAnsi="Calibri Light" w:cstheme="majorHAnsi"/>
           <w:color w:val="EE0000"/>
           <w:szCs w:val="22"/>
         </w:rPr>
-        <w:t>eii. Results:</w:t>
-      </w:r>
-    </w:p>
-    <w:p>
-      <w:pPr>
-        <w:pStyle w:val="Normal"/>
+        <w:t>. Changing the value from n=2 to other values decreased the accuracy significantly as there was a greater overlap between clusters after n=2.</w:t>
+      </w:r>
+    </w:p>
+    <w:p>
+      <w:pPr>
         <w:spacing w:beforeAutospacing="1" w:afterAutospacing="1"/>
         <w:rPr>
-          <w:rFonts w:ascii="Calibri Light" w:hAnsi="Calibri Light" w:cs="Calibri Light" w:asciiTheme="majorHAnsi" w:cstheme="majorHAnsi" w:hAnsiTheme="majorHAnsi"/>
+          <w:rFonts w:ascii="Calibri Light" w:hAnsi="Calibri Light" w:cstheme="majorHAnsi"/>
           <w:color w:val="EE0000"/>
           <w:szCs w:val="22"/>
         </w:rPr>
       </w:pPr>
-      <w:r>
-        <w:rPr>
-          <w:rFonts w:cs="Calibri Light" w:cstheme="majorHAnsi" w:ascii="Calibri Light" w:hAnsi="Calibri Light"/>
+      <w:proofErr w:type="spellStart"/>
+      <w:r>
+        <w:rPr>
+          <w:rFonts w:ascii="Calibri Light" w:hAnsi="Calibri Light" w:cstheme="majorHAnsi"/>
           <w:color w:val="EE0000"/>
           <w:szCs w:val="22"/>
         </w:rPr>
-        <w:t xml:space="preserve">  </w:t>
-      </w:r>
-      <w:r>
-        <w:rPr>
-          <w:rFonts w:cs="Calibri Light" w:cstheme="majorHAnsi" w:ascii="Calibri Light" w:hAnsi="Calibri Light"/>
+        <w:t>ei</w:t>
+      </w:r>
+      <w:proofErr w:type="spellEnd"/>
+      <w:r>
+        <w:rPr>
+          <w:rFonts w:ascii="Calibri Light" w:hAnsi="Calibri Light" w:cstheme="majorHAnsi"/>
           <w:color w:val="EE0000"/>
           <w:szCs w:val="22"/>
         </w:rPr>
-        <w:t>Method 1    Method 2  Chi-square Statistic  P-value  Degrees of Freedom</w:t>
-      </w:r>
-    </w:p>
-    <w:p>
-      <w:pPr>
-        <w:pStyle w:val="Normal"/>
+        <w:t>. When I changed the number of genes I found that the lower the number of genes the greater accuracy there was in the hierarchical clustering means procedure</w:t>
+      </w:r>
+    </w:p>
+    <w:p>
+      <w:pPr>
         <w:spacing w:beforeAutospacing="1" w:afterAutospacing="1"/>
         <w:rPr>
-          <w:rFonts w:ascii="Calibri Light" w:hAnsi="Calibri Light" w:cs="Calibri Light" w:asciiTheme="majorHAnsi" w:cstheme="majorHAnsi" w:hAnsiTheme="majorHAnsi"/>
+          <w:rFonts w:ascii="Calibri Light" w:hAnsi="Calibri Light" w:cstheme="majorHAnsi"/>
           <w:color w:val="EE0000"/>
           <w:szCs w:val="22"/>
         </w:rPr>
       </w:pPr>
-      <w:r>
-        <w:rPr>
-          <w:rFonts w:cs="Calibri Light" w:cstheme="majorHAnsi" w:ascii="Calibri Light" w:hAnsi="Calibri Light"/>
+    </w:p>
+    <w:p>
+      <w:pPr>
+        <w:spacing w:beforeAutospacing="1" w:afterAutospacing="1"/>
+        <w:rPr>
+          <w:rFonts w:ascii="Calibri Light" w:hAnsi="Calibri Light" w:cstheme="majorHAnsi"/>
           <w:color w:val="EE0000"/>
           <w:szCs w:val="22"/>
         </w:rPr>
-        <w:t xml:space="preserve">  </w:t>
-      </w:r>
-      <w:r>
-        <w:rPr>
-          <w:rFonts w:cs="Calibri Light" w:cstheme="majorHAnsi" w:ascii="Calibri Light" w:hAnsi="Calibri Light"/>
+      </w:pPr>
+      <w:r>
+        <w:rPr>
+          <w:rFonts w:ascii="Calibri Light" w:hAnsi="Calibri Light" w:cstheme="majorHAnsi"/>
           <w:color w:val="EE0000"/>
           <w:szCs w:val="22"/>
         </w:rPr>
-        <w:t>10 genes   100 genes                5.3343 0.020910                   1</w:t>
-      </w:r>
-    </w:p>
-    <w:p>
-      <w:pPr>
-        <w:pStyle w:val="Normal"/>
-        <w:spacing w:beforeAutospacing="1" w:afterAutospacing="1"/>
-        <w:rPr>
-          <w:rFonts w:ascii="Calibri Light" w:hAnsi="Calibri Light" w:cs="Calibri Light" w:asciiTheme="majorHAnsi" w:cstheme="majorHAnsi" w:hAnsiTheme="majorHAnsi"/>
+        <w:t>Another method used was the Gaussian Mixture Model in python</w:t>
+      </w:r>
+      <w:r>
+        <w:rPr>
+          <w:rFonts w:ascii="Calibri Light" w:hAnsi="Calibri Light" w:cstheme="majorHAnsi"/>
           <w:color w:val="EE0000"/>
           <w:szCs w:val="22"/>
         </w:rPr>
-      </w:pPr>
-      <w:r>
-        <w:rPr>
-          <w:rFonts w:cs="Calibri Light" w:cstheme="majorHAnsi" w:ascii="Calibri Light" w:hAnsi="Calibri Light"/>
+        <w:t>.</w:t>
+      </w:r>
+      <w:r>
+        <w:rPr>
+          <w:rFonts w:ascii="Calibri Light" w:hAnsi="Calibri Light" w:cstheme="majorHAnsi"/>
           <w:color w:val="EE0000"/>
           <w:szCs w:val="22"/>
         </w:rPr>
-        <w:t xml:space="preserve">  </w:t>
-      </w:r>
-      <w:r>
-        <w:rPr>
-          <w:rFonts w:cs="Calibri Light" w:cstheme="majorHAnsi" w:ascii="Calibri Light" w:hAnsi="Calibri Light"/>
+        <w:t xml:space="preserve"> After extracting the 5,000 most variable genes and using the </w:t>
+      </w:r>
+      <w:proofErr w:type="spellStart"/>
+      <w:r>
+        <w:rPr>
+          <w:rFonts w:ascii="Calibri Light" w:hAnsi="Calibri Light" w:cstheme="majorHAnsi"/>
           <w:color w:val="EE0000"/>
           <w:szCs w:val="22"/>
         </w:rPr>
-        <w:t>10 genes  1000 genes                7.8851 0.004984                   1</w:t>
-      </w:r>
-    </w:p>
-    <w:p>
-      <w:pPr>
-        <w:pStyle w:val="Normal"/>
-        <w:spacing w:beforeAutospacing="1" w:afterAutospacing="1"/>
-        <w:rPr>
-          <w:rFonts w:ascii="Calibri Light" w:hAnsi="Calibri Light" w:cs="Calibri Light" w:asciiTheme="majorHAnsi" w:cstheme="majorHAnsi" w:hAnsiTheme="majorHAnsi"/>
+        <w:t>GaussianMixture</w:t>
+      </w:r>
+      <w:proofErr w:type="spellEnd"/>
+      <w:r>
+        <w:rPr>
+          <w:rFonts w:ascii="Calibri Light" w:hAnsi="Calibri Light" w:cstheme="majorHAnsi"/>
           <w:color w:val="EE0000"/>
           <w:szCs w:val="22"/>
         </w:rPr>
-      </w:pPr>
-      <w:r>
-        <w:rPr>
-          <w:rFonts w:cs="Calibri Light" w:cstheme="majorHAnsi" w:ascii="Calibri Light" w:hAnsi="Calibri Light"/>
+        <w:t xml:space="preserve"> models, 6 cluster sizes were generated and compared. The cluster sizes ranged from 2-7 and of them, 2 had the highest silhouette score of 0.0453. The second highest cluster was cluster 4 which had a score of 0.0199, though all the rother clusters had similar scores. Therefore, increasing the value k for number of clusters didn’t improve the separation of the data, it in fact decreased starting from k=3.</w:t>
+      </w:r>
+    </w:p>
+    <w:p>
+      <w:pPr>
+        <w:spacing w:beforeAutospacing="1" w:afterAutospacing="1"/>
+        <w:rPr>
+          <w:rFonts w:asciiTheme="majorHAnsi" w:hAnsiTheme="majorHAnsi" w:cstheme="majorHAnsi"/>
           <w:color w:val="EE0000"/>
           <w:szCs w:val="22"/>
         </w:rPr>
-        <w:t xml:space="preserve">  </w:t>
-      </w:r>
-      <w:r>
-        <w:rPr>
-          <w:rFonts w:cs="Calibri Light" w:cstheme="majorHAnsi" w:ascii="Calibri Light" w:hAnsi="Calibri Light"/>
+      </w:pPr>
+      <w:r>
+        <w:rPr>
+          <w:rFonts w:ascii="Calibri Light" w:hAnsi="Calibri Light" w:cstheme="majorHAnsi"/>
           <w:color w:val="EE0000"/>
           <w:szCs w:val="22"/>
         </w:rPr>
-        <w:t>10 genes 10000 genes                4.2117 0.040146                   1</w:t>
-      </w:r>
-    </w:p>
-    <w:p>
-      <w:pPr>
-        <w:pStyle w:val="Normal"/>
-        <w:spacing w:beforeAutospacing="1" w:afterAutospacing="1"/>
-        <w:rPr>
-          <w:rFonts w:ascii="Calibri Light" w:hAnsi="Calibri Light" w:cs="Calibri Light" w:asciiTheme="majorHAnsi" w:cstheme="majorHAnsi" w:hAnsiTheme="majorHAnsi"/>
+        <w:t xml:space="preserve">For gene counts 10-10,000 of the most variable genes, the Gaussian mixture model indicated that increasing the number of genes increased the cluster size. A comparison was done for each pair of gene counts. </w:t>
+      </w:r>
+      <w:proofErr w:type="gramStart"/>
+      <w:r>
+        <w:rPr>
+          <w:rFonts w:ascii="Calibri Light" w:hAnsi="Calibri Light" w:cstheme="majorHAnsi"/>
           <w:color w:val="EE0000"/>
           <w:szCs w:val="22"/>
         </w:rPr>
-      </w:pPr>
-      <w:r>
-        <w:rPr>
-          <w:rFonts w:cs="Calibri Light" w:cstheme="majorHAnsi" w:ascii="Calibri Light" w:hAnsi="Calibri Light"/>
+        <w:t>Most</w:t>
+      </w:r>
+      <w:proofErr w:type="gramEnd"/>
+      <w:r>
+        <w:rPr>
+          <w:rFonts w:ascii="Calibri Light" w:hAnsi="Calibri Light" w:cstheme="majorHAnsi"/>
           <w:color w:val="EE0000"/>
           <w:szCs w:val="22"/>
         </w:rPr>
-        <w:t xml:space="preserve"> </w:t>
-      </w:r>
-      <w:r>
-        <w:rPr>
-          <w:rFonts w:cs="Calibri Light" w:cstheme="majorHAnsi" w:ascii="Calibri Light" w:hAnsi="Calibri Light"/>
+        <w:t xml:space="preserve"> comparisons were significant according to the Chi-squared tests p-value. However, 10 to 10,000 genes </w:t>
+      </w:r>
+      <w:proofErr w:type="gramStart"/>
+      <w:r>
+        <w:rPr>
+          <w:rFonts w:ascii="Calibri Light" w:hAnsi="Calibri Light" w:cstheme="majorHAnsi"/>
           <w:color w:val="EE0000"/>
           <w:szCs w:val="22"/>
         </w:rPr>
-        <w:t>100 genes  1000 genes              366.4869 0.000000                   1</w:t>
-      </w:r>
-    </w:p>
-    <w:p>
-      <w:pPr>
-        <w:pStyle w:val="Normal"/>
-        <w:spacing w:beforeAutospacing="1" w:afterAutospacing="1"/>
-        <w:rPr>
-          <w:rFonts w:ascii="Calibri Light" w:hAnsi="Calibri Light" w:cs="Calibri Light" w:asciiTheme="majorHAnsi" w:cstheme="majorHAnsi" w:hAnsiTheme="majorHAnsi"/>
+        <w:t>was</w:t>
+      </w:r>
+      <w:proofErr w:type="gramEnd"/>
+      <w:r>
+        <w:rPr>
+          <w:rFonts w:ascii="Calibri Light" w:hAnsi="Calibri Light" w:cstheme="majorHAnsi"/>
           <w:color w:val="EE0000"/>
           <w:szCs w:val="22"/>
         </w:rPr>
-      </w:pPr>
-      <w:r>
-        <w:rPr>
-          <w:rFonts w:cs="Calibri Light" w:cstheme="majorHAnsi" w:ascii="Calibri Light" w:hAnsi="Calibri Light"/>
-          <w:color w:val="EE0000"/>
-          <w:szCs w:val="22"/>
-        </w:rPr>
-        <w:t xml:space="preserve"> </w:t>
-      </w:r>
-      <w:r>
-        <w:rPr>
-          <w:rFonts w:cs="Calibri Light" w:cstheme="majorHAnsi" w:ascii="Calibri Light" w:hAnsi="Calibri Light"/>
-          <w:color w:val="EE0000"/>
-          <w:szCs w:val="22"/>
-        </w:rPr>
-        <w:t>100 genes 10000 genes              155.5041 0.000000                   1</w:t>
-      </w:r>
-    </w:p>
-    <w:p>
-      <w:pPr>
-        <w:pStyle w:val="Normal"/>
-        <w:spacing w:beforeAutospacing="1" w:afterAutospacing="1"/>
-        <w:rPr>
-          <w:rFonts w:ascii="Calibri Light" w:hAnsi="Calibri Light" w:cs="Calibri Light" w:asciiTheme="majorHAnsi" w:cstheme="majorHAnsi" w:hAnsiTheme="majorHAnsi"/>
-          <w:color w:val="EE0000"/>
-          <w:szCs w:val="22"/>
-        </w:rPr>
-      </w:pPr>
-      <w:r>
-        <w:rPr>
-          <w:rFonts w:cs="Calibri Light" w:cstheme="majorHAnsi" w:ascii="Calibri Light" w:hAnsi="Calibri Light"/>
-          <w:color w:val="EE0000"/>
-          <w:szCs w:val="22"/>
-        </w:rPr>
-        <w:t>1000 genes 10000 genes              345.8472 0.000000                   1</w:t>
-      </w:r>
-    </w:p>
-    <w:p>
-      <w:pPr>
-        <w:pStyle w:val="Normal"/>
-        <w:spacing w:beforeAutospacing="1" w:afterAutospacing="1"/>
-        <w:rPr>
-          <w:rFonts w:ascii="Calibri Light" w:hAnsi="Calibri Light" w:cs="Calibri Light" w:asciiTheme="majorHAnsi" w:cstheme="majorHAnsi" w:hAnsiTheme="majorHAnsi"/>
-          <w:color w:val="EE0000"/>
-          <w:szCs w:val="22"/>
-        </w:rPr>
-      </w:pPr>
-      <w:r>
-        <w:rPr>
-          <w:rFonts w:cs="Calibri Light" w:cstheme="majorHAnsi" w:ascii="Calibri Light" w:hAnsi="Calibri Light"/>
-          <w:color w:val="EE0000"/>
-          <w:szCs w:val="22"/>
-        </w:rPr>
-      </w:r>
-    </w:p>
-    <w:p>
-      <w:pPr>
-        <w:pStyle w:val="Normal"/>
+        <w:t xml:space="preserve"> not statistically significant, as it only had a p value of 0.381. This means that there is low association between the two clustering results. </w:t>
+      </w:r>
+    </w:p>
+    <w:p>
+      <w:pPr>
         <w:spacing w:beforeAutospacing="1" w:afterAutospacing="1"/>
         <w:rPr>
           <w:rFonts w:ascii="Times New Roman" w:hAnsi="Times New Roman"/>
@@ -1711,9 +1556,12 @@
         </w:rPr>
       </w:pPr>
       <w:r>
-        <w:rPr/>
+        <w:rPr>
+          <w:noProof/>
+        </w:rPr>
+        <w:lastRenderedPageBreak/>
         <w:drawing>
-          <wp:inline distT="0" distB="0" distL="0" distR="0">
+          <wp:inline distT="0" distB="0" distL="0" distR="0" wp14:anchorId="7160AEC0" wp14:editId="251CE986">
             <wp:extent cx="6858000" cy="6511925"/>
             <wp:effectExtent l="0" t="0" r="0" b="0"/>
             <wp:docPr id="3" name="Picture 3"/>
@@ -1730,7 +1578,7 @@
                     </pic:cNvPicPr>
                   </pic:nvPicPr>
                   <pic:blipFill>
-                    <a:blip r:embed="rId10"/>
+                    <a:blip r:embed="rId15"/>
                     <a:stretch>
                       <a:fillRect/>
                     </a:stretch>
@@ -1754,20 +1602,12 @@
     </w:p>
     <w:p>
       <w:pPr>
-        <w:pStyle w:val="Normal"/>
-        <w:rPr>
-          <w:i/>
-          <w:iCs/>
-          <w:color w:val="064462"/>
-        </w:rPr>
-      </w:pPr>
-      <w:r>
-        <w:rPr>
-          <w:i/>
-          <w:iCs/>
-          <w:color w:val="064462"/>
-        </w:rPr>
-      </w:r>
+        <w:rPr>
+          <w:i/>
+          <w:iCs/>
+          <w:color w:val="064462"/>
+        </w:rPr>
+      </w:pPr>
     </w:p>
     <w:p>
       <w:pPr>
@@ -1881,53 +1721,58 @@
     </w:p>
     <w:p>
       <w:pPr>
-        <w:pStyle w:val="Normal"/>
-        <w:rPr>
-          <w:i/>
-          <w:iCs/>
-          <w:color w:val="064462"/>
-        </w:rPr>
-      </w:pPr>
-      <w:r>
-        <w:rPr>
-          <w:i/>
-          <w:iCs/>
-          <w:color w:val="064462"/>
-        </w:rPr>
-      </w:r>
+        <w:rPr>
+          <w:i/>
+          <w:iCs/>
+          <w:color w:val="064462"/>
+        </w:rPr>
+      </w:pPr>
     </w:p>
     <w:sectPr>
-      <w:footerReference w:type="even" r:id="rId11"/>
-      <w:footerReference w:type="default" r:id="rId12"/>
-      <w:footerReference w:type="first" r:id="rId13"/>
-      <w:type w:val="nextPage"/>
+      <w:footerReference w:type="even" r:id="rId16"/>
+      <w:footerReference w:type="default" r:id="rId17"/>
+      <w:footerReference w:type="first" r:id="rId18"/>
       <w:pgSz w:w="12240" w:h="15840"/>
-      <w:pgMar w:left="720" w:right="720" w:gutter="0" w:header="0" w:top="720" w:footer="720" w:bottom="777"/>
-      <w:pgNumType w:fmt="decimal"/>
-      <w:formProt w:val="false"/>
-      <w:textDirection w:val="lrTb"/>
-      <w:docGrid w:type="default" w:linePitch="360" w:charSpace="0"/>
+      <w:pgMar w:top="720" w:right="720" w:bottom="777" w:left="720" w:header="0" w:footer="720" w:gutter="0"/>
+      <w:cols w:space="720"/>
+      <w:formProt w:val="0"/>
+      <w:docGrid w:linePitch="360"/>
     </w:sectPr>
   </w:body>
 </w:document>
 </file>
 
+<file path=word/endnotes.xml><?xml version="1.0" encoding="utf-8"?>
+<w:endnotes xmlns:wpc="http://schemas.microsoft.com/office/word/2010/wordprocessingCanvas" xmlns:cx="http://schemas.microsoft.com/office/drawing/2014/chartex" xmlns:cx1="http://schemas.microsoft.com/office/drawing/2015/9/8/chartex" xmlns:cx2="http://schemas.microsoft.com/office/drawing/2015/10/21/chartex" xmlns:cx3="http://schemas.microsoft.com/office/drawing/2016/5/9/chartex" xmlns:cx4="http://schemas.microsoft.com/office/drawing/2016/5/10/chartex" xmlns:cx5="http://schemas.microsoft.com/office/drawing/2016/5/11/chartex" xmlns:cx6="http://schemas.microsoft.com/office/drawing/2016/5/12/chartex" xmlns:cx7="http://schemas.microsoft.com/office/drawing/2016/5/13/chartex" xmlns:cx8="http://schemas.microsoft.com/office/drawing/2016/5/14/chartex" xmlns:mc="http://schemas.openxmlformats.org/markup-compatibility/2006" xmlns:aink="http://schemas.microsoft.com/office/drawing/2016/ink" xmlns:am3d="http://schemas.microsoft.com/office/drawing/2017/model3d" xmlns:o="urn:schemas-microsoft-com:office:office" xmlns:oel="http://schemas.microsoft.com/office/2019/extlst" xmlns:r="http://schemas.openxmlformats.org/officeDocument/2006/relationships" xmlns:m="http://schemas.openxmlformats.org/officeDocument/2006/math" xmlns:v="urn:schemas-microsoft-com:vml" xmlns:wp14="http://schemas.microsoft.com/office/word/2010/wordprocessingDrawing" xmlns:wp="http://schemas.openxmlformats.org/drawingml/2006/wordprocessingDrawing" xmlns:w10="urn:schemas-microsoft-com:office:word" xmlns:w="http://schemas.openxmlformats.org/wordprocessingml/2006/main" xmlns:w14="http://schemas.microsoft.com/office/word/2010/wordml" xmlns:w15="http://schemas.microsoft.com/office/word/2012/wordml" xmlns:w16cex="http://schemas.microsoft.com/office/word/2018/wordml/cex" xmlns:w16cid="http://schemas.microsoft.com/office/word/2016/wordml/cid" xmlns:w16="http://schemas.microsoft.com/office/word/2018/wordml" xmlns:w16du="http://schemas.microsoft.com/office/word/2023/wordml/word16du" xmlns:w16sdtdh="http://schemas.microsoft.com/office/word/2020/wordml/sdtdatahash" xmlns:w16se="http://schemas.microsoft.com/office/word/2015/wordml/symex" xmlns:wpg="http://schemas.microsoft.com/office/word/2010/wordprocessingGroup" xmlns:wpi="http://schemas.microsoft.com/office/word/2010/wordprocessingInk" xmlns:wne="http://schemas.microsoft.com/office/word/2006/wordml" xmlns:wps="http://schemas.microsoft.com/office/word/2010/wordprocessingShape" mc:Ignorable="w14 w15 w16se w16cid w16 w16cex w16sdtdh w16du wp14">
+  <w:endnote w:type="separator" w:id="-1">
+    <w:p>
+      <w:r>
+        <w:separator/>
+      </w:r>
+    </w:p>
+  </w:endnote>
+  <w:endnote w:type="continuationSeparator" w:id="0">
+    <w:p>
+      <w:r>
+        <w:continuationSeparator/>
+      </w:r>
+    </w:p>
+  </w:endnote>
+</w:endnotes>
+</file>
+
 <file path=word/footer1.xml><?xml version="1.0" encoding="utf-8"?>
-<w:ftr xmlns:o="urn:schemas-microsoft-com:office:office" xmlns:r="http://schemas.openxmlformats.org/officeDocument/2006/relationships" xmlns:v="urn:schemas-microsoft-com:vml" xmlns:w="http://schemas.openxmlformats.org/wordprocessingml/2006/main" xmlns:w10="urn:schemas-microsoft-com:office:word" xmlns:wp="http://schemas.openxmlformats.org/drawingml/2006/wordprocessingDrawing" xmlns:pic="http://schemas.openxmlformats.org/drawingml/2006/picture" xmlns:wps="http://schemas.microsoft.com/office/word/2010/wordprocessingShape" xmlns:wpg="http://schemas.microsoft.com/office/word/2010/wordprocessingGroup" xmlns:mc="http://schemas.openxmlformats.org/markup-compatibility/2006" xmlns:wp14="http://schemas.microsoft.com/office/word/2010/wordprocessingDrawing" xmlns:w14="http://schemas.microsoft.com/office/word/2010/wordml" xmlns:w15="http://schemas.microsoft.com/office/word/2012/wordml" mc:Ignorable="w14 wp14 w15">
+<w:ftr xmlns:wpc="http://schemas.microsoft.com/office/word/2010/wordprocessingCanvas" xmlns:cx="http://schemas.microsoft.com/office/drawing/2014/chartex" xmlns:cx1="http://schemas.microsoft.com/office/drawing/2015/9/8/chartex" xmlns:cx2="http://schemas.microsoft.com/office/drawing/2015/10/21/chartex" xmlns:cx3="http://schemas.microsoft.com/office/drawing/2016/5/9/chartex" xmlns:cx4="http://schemas.microsoft.com/office/drawing/2016/5/10/chartex" xmlns:cx5="http://schemas.microsoft.com/office/drawing/2016/5/11/chartex" xmlns:cx6="http://schemas.microsoft.com/office/drawing/2016/5/12/chartex" xmlns:cx7="http://schemas.microsoft.com/office/drawing/2016/5/13/chartex" xmlns:cx8="http://schemas.microsoft.com/office/drawing/2016/5/14/chartex" xmlns:mc="http://schemas.openxmlformats.org/markup-compatibility/2006" xmlns:aink="http://schemas.microsoft.com/office/drawing/2016/ink" xmlns:am3d="http://schemas.microsoft.com/office/drawing/2017/model3d" xmlns:o="urn:schemas-microsoft-com:office:office" xmlns:oel="http://schemas.microsoft.com/office/2019/extlst" xmlns:r="http://schemas.openxmlformats.org/officeDocument/2006/relationships" xmlns:m="http://schemas.openxmlformats.org/officeDocument/2006/math" xmlns:v="urn:schemas-microsoft-com:vml" xmlns:wp14="http://schemas.microsoft.com/office/word/2010/wordprocessingDrawing" xmlns:wp="http://schemas.openxmlformats.org/drawingml/2006/wordprocessingDrawing" xmlns:w10="urn:schemas-microsoft-com:office:word" xmlns:w="http://schemas.openxmlformats.org/wordprocessingml/2006/main" xmlns:w14="http://schemas.microsoft.com/office/word/2010/wordml" xmlns:w15="http://schemas.microsoft.com/office/word/2012/wordml" xmlns:w16cex="http://schemas.microsoft.com/office/word/2018/wordml/cex" xmlns:w16cid="http://schemas.microsoft.com/office/word/2016/wordml/cid" xmlns:w16="http://schemas.microsoft.com/office/word/2018/wordml" xmlns:w16du="http://schemas.microsoft.com/office/word/2023/wordml/word16du" xmlns:w16sdtdh="http://schemas.microsoft.com/office/word/2020/wordml/sdtdatahash" xmlns:w16se="http://schemas.microsoft.com/office/word/2015/wordml/symex" xmlns:wpg="http://schemas.microsoft.com/office/word/2010/wordprocessingGroup" xmlns:wpi="http://schemas.microsoft.com/office/word/2010/wordprocessingInk" xmlns:wne="http://schemas.microsoft.com/office/word/2006/wordml" xmlns:wps="http://schemas.microsoft.com/office/word/2010/wordprocessingShape" mc:Ignorable="w14 w15 w16se w16cid w16 w16cex w16sdtdh w16du wp14">
   <w:p>
     <w:pPr>
       <w:pStyle w:val="Footer"/>
-      <w:rPr/>
     </w:pPr>
-    <w:r>
-      <w:rPr/>
-    </w:r>
   </w:p>
 </w:ftr>
 </file>
 
 <file path=word/footer2.xml><?xml version="1.0" encoding="utf-8"?>
-<w:ftr xmlns:o="urn:schemas-microsoft-com:office:office" xmlns:r="http://schemas.openxmlformats.org/officeDocument/2006/relationships" xmlns:v="urn:schemas-microsoft-com:vml" xmlns:w="http://schemas.openxmlformats.org/wordprocessingml/2006/main" xmlns:w10="urn:schemas-microsoft-com:office:word" xmlns:wp="http://schemas.openxmlformats.org/drawingml/2006/wordprocessingDrawing" xmlns:pic="http://schemas.openxmlformats.org/drawingml/2006/picture" xmlns:wps="http://schemas.microsoft.com/office/word/2010/wordprocessingShape" xmlns:wpg="http://schemas.microsoft.com/office/word/2010/wordprocessingGroup" xmlns:mc="http://schemas.openxmlformats.org/markup-compatibility/2006" xmlns:wp14="http://schemas.microsoft.com/office/word/2010/wordprocessingDrawing" xmlns:w14="http://schemas.microsoft.com/office/word/2010/wordml" xmlns:w15="http://schemas.microsoft.com/office/word/2012/wordml" mc:Ignorable="w14 wp14 w15">
+<w:ftr xmlns:wpc="http://schemas.microsoft.com/office/word/2010/wordprocessingCanvas" xmlns:cx="http://schemas.microsoft.com/office/drawing/2014/chartex" xmlns:cx1="http://schemas.microsoft.com/office/drawing/2015/9/8/chartex" xmlns:cx2="http://schemas.microsoft.com/office/drawing/2015/10/21/chartex" xmlns:cx3="http://schemas.microsoft.com/office/drawing/2016/5/9/chartex" xmlns:cx4="http://schemas.microsoft.com/office/drawing/2016/5/10/chartex" xmlns:cx5="http://schemas.microsoft.com/office/drawing/2016/5/11/chartex" xmlns:cx6="http://schemas.microsoft.com/office/drawing/2016/5/12/chartex" xmlns:cx7="http://schemas.microsoft.com/office/drawing/2016/5/13/chartex" xmlns:cx8="http://schemas.microsoft.com/office/drawing/2016/5/14/chartex" xmlns:mc="http://schemas.openxmlformats.org/markup-compatibility/2006" xmlns:aink="http://schemas.microsoft.com/office/drawing/2016/ink" xmlns:am3d="http://schemas.microsoft.com/office/drawing/2017/model3d" xmlns:o="urn:schemas-microsoft-com:office:office" xmlns:oel="http://schemas.microsoft.com/office/2019/extlst" xmlns:r="http://schemas.openxmlformats.org/officeDocument/2006/relationships" xmlns:m="http://schemas.openxmlformats.org/officeDocument/2006/math" xmlns:v="urn:schemas-microsoft-com:vml" xmlns:wp14="http://schemas.microsoft.com/office/word/2010/wordprocessingDrawing" xmlns:wp="http://schemas.openxmlformats.org/drawingml/2006/wordprocessingDrawing" xmlns:w10="urn:schemas-microsoft-com:office:word" xmlns:w="http://schemas.openxmlformats.org/wordprocessingml/2006/main" xmlns:w14="http://schemas.microsoft.com/office/word/2010/wordml" xmlns:w15="http://schemas.microsoft.com/office/word/2012/wordml" xmlns:w16cex="http://schemas.microsoft.com/office/word/2018/wordml/cex" xmlns:w16cid="http://schemas.microsoft.com/office/word/2016/wordml/cid" xmlns:w16="http://schemas.microsoft.com/office/word/2018/wordml" xmlns:w16du="http://schemas.microsoft.com/office/word/2023/wordml/word16du" xmlns:w16sdtdh="http://schemas.microsoft.com/office/word/2020/wordml/sdtdatahash" xmlns:w16se="http://schemas.microsoft.com/office/word/2015/wordml/symex" xmlns:wpg="http://schemas.microsoft.com/office/word/2010/wordprocessingGroup" xmlns:wpi="http://schemas.microsoft.com/office/word/2010/wordprocessingInk" xmlns:wne="http://schemas.microsoft.com/office/word/2006/wordml" xmlns:wps="http://schemas.microsoft.com/office/word/2010/wordprocessingShape" mc:Ignorable="w14 w15 w16se w16cid w16 w16cex w16sdtdh w16du wp14">
   <w:p>
     <w:pPr>
       <w:pStyle w:val="Footer"/>
@@ -1946,7 +1791,23 @@
         <w:sz w:val="20"/>
       </w:rPr>
       <w:t>Bioinformatics, CGS 4144</w:t>
+    </w:r>
+    <w:r>
+      <w:rPr>
+        <w:b/>
+        <w:i/>
+        <w:color w:val="054361"/>
+        <w:sz w:val="20"/>
+      </w:rPr>
       <w:tab/>
+    </w:r>
+    <w:r>
+      <w:rPr>
+        <w:b/>
+        <w:i/>
+        <w:color w:val="054361"/>
+        <w:sz w:val="20"/>
+      </w:rPr>
       <w:tab/>
       <w:t xml:space="preserve">Page </w:t>
     </w:r>
@@ -2013,14 +1874,34 @@
         <w:color w:val="054361"/>
         <w:sz w:val="20"/>
       </w:rPr>
-      <w:t>Kiley Graim, Fall 2026</w:t>
+      <w:t xml:space="preserve">Kiley </w:t>
+    </w:r>
+    <w:proofErr w:type="spellStart"/>
+    <w:r>
+      <w:rPr>
+        <w:b/>
+        <w:i/>
+        <w:color w:val="054361"/>
+        <w:sz w:val="20"/>
+      </w:rPr>
+      <w:t>Graim</w:t>
+    </w:r>
+    <w:proofErr w:type="spellEnd"/>
+    <w:r>
+      <w:rPr>
+        <w:b/>
+        <w:i/>
+        <w:color w:val="054361"/>
+        <w:sz w:val="20"/>
+      </w:rPr>
+      <w:t>, Fall 2026</w:t>
     </w:r>
   </w:p>
 </w:ftr>
 </file>
 
 <file path=word/footer3.xml><?xml version="1.0" encoding="utf-8"?>
-<w:ftr xmlns:o="urn:schemas-microsoft-com:office:office" xmlns:r="http://schemas.openxmlformats.org/officeDocument/2006/relationships" xmlns:v="urn:schemas-microsoft-com:vml" xmlns:w="http://schemas.openxmlformats.org/wordprocessingml/2006/main" xmlns:w10="urn:schemas-microsoft-com:office:word" xmlns:wp="http://schemas.openxmlformats.org/drawingml/2006/wordprocessingDrawing" xmlns:pic="http://schemas.openxmlformats.org/drawingml/2006/picture" xmlns:wps="http://schemas.microsoft.com/office/word/2010/wordprocessingShape" xmlns:wpg="http://schemas.microsoft.com/office/word/2010/wordprocessingGroup" xmlns:mc="http://schemas.openxmlformats.org/markup-compatibility/2006" xmlns:wp14="http://schemas.microsoft.com/office/word/2010/wordprocessingDrawing" xmlns:w14="http://schemas.microsoft.com/office/word/2010/wordml" xmlns:w15="http://schemas.microsoft.com/office/word/2012/wordml" mc:Ignorable="w14 wp14 w15">
+<w:ftr xmlns:wpc="http://schemas.microsoft.com/office/word/2010/wordprocessingCanvas" xmlns:cx="http://schemas.microsoft.com/office/drawing/2014/chartex" xmlns:cx1="http://schemas.microsoft.com/office/drawing/2015/9/8/chartex" xmlns:cx2="http://schemas.microsoft.com/office/drawing/2015/10/21/chartex" xmlns:cx3="http://schemas.microsoft.com/office/drawing/2016/5/9/chartex" xmlns:cx4="http://schemas.microsoft.com/office/drawing/2016/5/10/chartex" xmlns:cx5="http://schemas.microsoft.com/office/drawing/2016/5/11/chartex" xmlns:cx6="http://schemas.microsoft.com/office/drawing/2016/5/12/chartex" xmlns:cx7="http://schemas.microsoft.com/office/drawing/2016/5/13/chartex" xmlns:cx8="http://schemas.microsoft.com/office/drawing/2016/5/14/chartex" xmlns:mc="http://schemas.openxmlformats.org/markup-compatibility/2006" xmlns:aink="http://schemas.microsoft.com/office/drawing/2016/ink" xmlns:am3d="http://schemas.microsoft.com/office/drawing/2017/model3d" xmlns:o="urn:schemas-microsoft-com:office:office" xmlns:oel="http://schemas.microsoft.com/office/2019/extlst" xmlns:r="http://schemas.openxmlformats.org/officeDocument/2006/relationships" xmlns:m="http://schemas.openxmlformats.org/officeDocument/2006/math" xmlns:v="urn:schemas-microsoft-com:vml" xmlns:wp14="http://schemas.microsoft.com/office/word/2010/wordprocessingDrawing" xmlns:wp="http://schemas.openxmlformats.org/drawingml/2006/wordprocessingDrawing" xmlns:w10="urn:schemas-microsoft-com:office:word" xmlns:w="http://schemas.openxmlformats.org/wordprocessingml/2006/main" xmlns:w14="http://schemas.microsoft.com/office/word/2010/wordml" xmlns:w15="http://schemas.microsoft.com/office/word/2012/wordml" xmlns:w16cex="http://schemas.microsoft.com/office/word/2018/wordml/cex" xmlns:w16cid="http://schemas.microsoft.com/office/word/2016/wordml/cid" xmlns:w16="http://schemas.microsoft.com/office/word/2018/wordml" xmlns:w16du="http://schemas.microsoft.com/office/word/2023/wordml/word16du" xmlns:w16sdtdh="http://schemas.microsoft.com/office/word/2020/wordml/sdtdatahash" xmlns:w16se="http://schemas.microsoft.com/office/word/2015/wordml/symex" xmlns:wpg="http://schemas.microsoft.com/office/word/2010/wordprocessingGroup" xmlns:wpi="http://schemas.microsoft.com/office/word/2010/wordprocessingInk" xmlns:wne="http://schemas.microsoft.com/office/word/2006/wordml" xmlns:wps="http://schemas.microsoft.com/office/word/2010/wordprocessingShape" mc:Ignorable="w14 w15 w16se w16cid w16 w16cex w16sdtdh w16du wp14">
   <w:p>
     <w:pPr>
       <w:pStyle w:val="Footer"/>
@@ -2039,7 +1920,23 @@
         <w:sz w:val="20"/>
       </w:rPr>
       <w:t>Bioinformatics, CGS 4144</w:t>
+    </w:r>
+    <w:r>
+      <w:rPr>
+        <w:b/>
+        <w:i/>
+        <w:color w:val="054361"/>
+        <w:sz w:val="20"/>
+      </w:rPr>
       <w:tab/>
+    </w:r>
+    <w:r>
+      <w:rPr>
+        <w:b/>
+        <w:i/>
+        <w:color w:val="054361"/>
+        <w:sz w:val="20"/>
+      </w:rPr>
       <w:tab/>
       <w:t xml:space="preserve">Page </w:t>
     </w:r>
@@ -2106,26 +2003,68 @@
         <w:color w:val="054361"/>
         <w:sz w:val="20"/>
       </w:rPr>
-      <w:t>Kiley Graim, Fall 2026</w:t>
+      <w:t xml:space="preserve">Kiley </w:t>
+    </w:r>
+    <w:proofErr w:type="spellStart"/>
+    <w:r>
+      <w:rPr>
+        <w:b/>
+        <w:i/>
+        <w:color w:val="054361"/>
+        <w:sz w:val="20"/>
+      </w:rPr>
+      <w:t>Graim</w:t>
+    </w:r>
+    <w:proofErr w:type="spellEnd"/>
+    <w:r>
+      <w:rPr>
+        <w:b/>
+        <w:i/>
+        <w:color w:val="054361"/>
+        <w:sz w:val="20"/>
+      </w:rPr>
+      <w:t>, Fall 2026</w:t>
     </w:r>
   </w:p>
 </w:ftr>
 </file>
 
+<file path=word/footnotes.xml><?xml version="1.0" encoding="utf-8"?>
+<w:footnotes xmlns:wpc="http://schemas.microsoft.com/office/word/2010/wordprocessingCanvas" xmlns:cx="http://schemas.microsoft.com/office/drawing/2014/chartex" xmlns:cx1="http://schemas.microsoft.com/office/drawing/2015/9/8/chartex" xmlns:cx2="http://schemas.microsoft.com/office/drawing/2015/10/21/chartex" xmlns:cx3="http://schemas.microsoft.com/office/drawing/2016/5/9/chartex" xmlns:cx4="http://schemas.microsoft.com/office/drawing/2016/5/10/chartex" xmlns:cx5="http://schemas.microsoft.com/office/drawing/2016/5/11/chartex" xmlns:cx6="http://schemas.microsoft.com/office/drawing/2016/5/12/chartex" xmlns:cx7="http://schemas.microsoft.com/office/drawing/2016/5/13/chartex" xmlns:cx8="http://schemas.microsoft.com/office/drawing/2016/5/14/chartex" xmlns:mc="http://schemas.openxmlformats.org/markup-compatibility/2006" xmlns:aink="http://schemas.microsoft.com/office/drawing/2016/ink" xmlns:am3d="http://schemas.microsoft.com/office/drawing/2017/model3d" xmlns:o="urn:schemas-microsoft-com:office:office" xmlns:oel="http://schemas.microsoft.com/office/2019/extlst" xmlns:r="http://schemas.openxmlformats.org/officeDocument/2006/relationships" xmlns:m="http://schemas.openxmlformats.org/officeDocument/2006/math" xmlns:v="urn:schemas-microsoft-com:vml" xmlns:wp14="http://schemas.microsoft.com/office/word/2010/wordprocessingDrawing" xmlns:wp="http://schemas.openxmlformats.org/drawingml/2006/wordprocessingDrawing" xmlns:w10="urn:schemas-microsoft-com:office:word" xmlns:w="http://schemas.openxmlformats.org/wordprocessingml/2006/main" xmlns:w14="http://schemas.microsoft.com/office/word/2010/wordml" xmlns:w15="http://schemas.microsoft.com/office/word/2012/wordml" xmlns:w16cex="http://schemas.microsoft.com/office/word/2018/wordml/cex" xmlns:w16cid="http://schemas.microsoft.com/office/word/2016/wordml/cid" xmlns:w16="http://schemas.microsoft.com/office/word/2018/wordml" xmlns:w16du="http://schemas.microsoft.com/office/word/2023/wordml/word16du" xmlns:w16sdtdh="http://schemas.microsoft.com/office/word/2020/wordml/sdtdatahash" xmlns:w16se="http://schemas.microsoft.com/office/word/2015/wordml/symex" xmlns:wpg="http://schemas.microsoft.com/office/word/2010/wordprocessingGroup" xmlns:wpi="http://schemas.microsoft.com/office/word/2010/wordprocessingInk" xmlns:wne="http://schemas.microsoft.com/office/word/2006/wordml" xmlns:wps="http://schemas.microsoft.com/office/word/2010/wordprocessingShape" mc:Ignorable="w14 w15 w16se w16cid w16 w16cex w16sdtdh w16du wp14">
+  <w:footnote w:type="separator" w:id="-1">
+    <w:p>
+      <w:r>
+        <w:separator/>
+      </w:r>
+    </w:p>
+  </w:footnote>
+  <w:footnote w:type="continuationSeparator" w:id="0">
+    <w:p>
+      <w:r>
+        <w:continuationSeparator/>
+      </w:r>
+    </w:p>
+  </w:footnote>
+</w:footnotes>
+</file>
+
 <file path=word/numbering.xml><?xml version="1.0" encoding="utf-8"?>
-<w:numbering xmlns:w="http://schemas.openxmlformats.org/wordprocessingml/2006/main" xmlns:o="urn:schemas-microsoft-com:office:office" xmlns:r="http://schemas.openxmlformats.org/officeDocument/2006/relationships" xmlns:v="urn:schemas-microsoft-com:vml" xmlns:mc="http://schemas.openxmlformats.org/markup-compatibility/2006" xmlns:w14="http://schemas.microsoft.com/office/word/2010/wordml" mc:Ignorable="w14">
-  <w:abstractNum w:abstractNumId="1">
+<w:numbering xmlns:wpc="http://schemas.microsoft.com/office/word/2010/wordprocessingCanvas" xmlns:cx="http://schemas.microsoft.com/office/drawing/2014/chartex" xmlns:cx1="http://schemas.microsoft.com/office/drawing/2015/9/8/chartex" xmlns:cx2="http://schemas.microsoft.com/office/drawing/2015/10/21/chartex" xmlns:cx3="http://schemas.microsoft.com/office/drawing/2016/5/9/chartex" xmlns:cx4="http://schemas.microsoft.com/office/drawing/2016/5/10/chartex" xmlns:cx5="http://schemas.microsoft.com/office/drawing/2016/5/11/chartex" xmlns:cx6="http://schemas.microsoft.com/office/drawing/2016/5/12/chartex" xmlns:cx7="http://schemas.microsoft.com/office/drawing/2016/5/13/chartex" xmlns:cx8="http://schemas.microsoft.com/office/drawing/2016/5/14/chartex" xmlns:mc="http://schemas.openxmlformats.org/markup-compatibility/2006" xmlns:aink="http://schemas.microsoft.com/office/drawing/2016/ink" xmlns:am3d="http://schemas.microsoft.com/office/drawing/2017/model3d" xmlns:o="urn:schemas-microsoft-com:office:office" xmlns:oel="http://schemas.microsoft.com/office/2019/extlst" xmlns:r="http://schemas.openxmlformats.org/officeDocument/2006/relationships" xmlns:m="http://schemas.openxmlformats.org/officeDocument/2006/math" xmlns:v="urn:schemas-microsoft-com:vml" xmlns:wp14="http://schemas.microsoft.com/office/word/2010/wordprocessingDrawing" xmlns:wp="http://schemas.openxmlformats.org/drawingml/2006/wordprocessingDrawing" xmlns:w10="urn:schemas-microsoft-com:office:word" xmlns:w="http://schemas.openxmlformats.org/wordprocessingml/2006/main" xmlns:w14="http://schemas.microsoft.com/office/word/2010/wordml" xmlns:w15="http://schemas.microsoft.com/office/word/2012/wordml" xmlns:w16cex="http://schemas.microsoft.com/office/word/2018/wordml/cex" xmlns:w16cid="http://schemas.microsoft.com/office/word/2016/wordml/cid" xmlns:w16="http://schemas.microsoft.com/office/word/2018/wordml" xmlns:w16du="http://schemas.microsoft.com/office/word/2023/wordml/word16du" xmlns:w16sdtdh="http://schemas.microsoft.com/office/word/2020/wordml/sdtdatahash" xmlns:w16se="http://schemas.microsoft.com/office/word/2015/wordml/symex" xmlns:wpg="http://schemas.microsoft.com/office/word/2010/wordprocessingGroup" xmlns:wpi="http://schemas.microsoft.com/office/word/2010/wordprocessingInk" xmlns:wne="http://schemas.microsoft.com/office/word/2006/wordml" xmlns:wps="http://schemas.microsoft.com/office/word/2010/wordprocessingShape" mc:Ignorable="w14 w15 w16se w16cid w16 w16cex w16sdtdh w16du wp14">
+  <w:abstractNum w:abstractNumId="0" w15:restartNumberingAfterBreak="0">
+    <w:nsid w:val="11E47C95"/>
+    <w:multiLevelType w:val="multilevel"/>
+    <w:tmpl w:val="54BAD2A2"/>
     <w:lvl w:ilvl="0">
       <w:start w:val="1"/>
       <w:numFmt w:val="none"/>
       <w:suff w:val="nothing"/>
       <w:lvlText w:val=""/>
-      <w:lvlJc w:val="start"/>
+      <w:lvlJc w:val="left"/>
       <w:pPr>
         <w:tabs>
           <w:tab w:val="num" w:pos="0"/>
         </w:tabs>
-        <w:ind w:start="0" w:hanging="0"/>
+        <w:ind w:left="0" w:firstLine="0"/>
       </w:pPr>
     </w:lvl>
     <w:lvl w:ilvl="1">
@@ -2133,12 +2072,12 @@
       <w:numFmt w:val="none"/>
       <w:suff w:val="nothing"/>
       <w:lvlText w:val=""/>
-      <w:lvlJc w:val="start"/>
+      <w:lvlJc w:val="left"/>
       <w:pPr>
         <w:tabs>
           <w:tab w:val="num" w:pos="0"/>
         </w:tabs>
-        <w:ind w:start="0" w:hanging="0"/>
+        <w:ind w:left="0" w:firstLine="0"/>
       </w:pPr>
     </w:lvl>
     <w:lvl w:ilvl="2">
@@ -2146,12 +2085,12 @@
       <w:numFmt w:val="none"/>
       <w:suff w:val="nothing"/>
       <w:lvlText w:val=""/>
-      <w:lvlJc w:val="start"/>
+      <w:lvlJc w:val="left"/>
       <w:pPr>
         <w:tabs>
           <w:tab w:val="num" w:pos="0"/>
         </w:tabs>
-        <w:ind w:start="0" w:hanging="0"/>
+        <w:ind w:left="0" w:firstLine="0"/>
       </w:pPr>
     </w:lvl>
     <w:lvl w:ilvl="3">
@@ -2159,12 +2098,12 @@
       <w:numFmt w:val="none"/>
       <w:suff w:val="nothing"/>
       <w:lvlText w:val=""/>
-      <w:lvlJc w:val="start"/>
+      <w:lvlJc w:val="left"/>
       <w:pPr>
         <w:tabs>
           <w:tab w:val="num" w:pos="0"/>
         </w:tabs>
-        <w:ind w:start="0" w:hanging="0"/>
+        <w:ind w:left="0" w:firstLine="0"/>
       </w:pPr>
     </w:lvl>
     <w:lvl w:ilvl="4">
@@ -2172,12 +2111,12 @@
       <w:numFmt w:val="none"/>
       <w:suff w:val="nothing"/>
       <w:lvlText w:val=""/>
-      <w:lvlJc w:val="start"/>
+      <w:lvlJc w:val="left"/>
       <w:pPr>
         <w:tabs>
           <w:tab w:val="num" w:pos="0"/>
         </w:tabs>
-        <w:ind w:start="0" w:hanging="0"/>
+        <w:ind w:left="0" w:firstLine="0"/>
       </w:pPr>
     </w:lvl>
     <w:lvl w:ilvl="5">
@@ -2185,12 +2124,12 @@
       <w:numFmt w:val="none"/>
       <w:suff w:val="nothing"/>
       <w:lvlText w:val=""/>
-      <w:lvlJc w:val="start"/>
+      <w:lvlJc w:val="left"/>
       <w:pPr>
         <w:tabs>
           <w:tab w:val="num" w:pos="0"/>
         </w:tabs>
-        <w:ind w:start="0" w:hanging="0"/>
+        <w:ind w:left="0" w:firstLine="0"/>
       </w:pPr>
     </w:lvl>
     <w:lvl w:ilvl="6">
@@ -2198,12 +2137,12 @@
       <w:numFmt w:val="none"/>
       <w:suff w:val="nothing"/>
       <w:lvlText w:val=""/>
-      <w:lvlJc w:val="start"/>
+      <w:lvlJc w:val="left"/>
       <w:pPr>
         <w:tabs>
           <w:tab w:val="num" w:pos="0"/>
         </w:tabs>
-        <w:ind w:start="0" w:hanging="0"/>
+        <w:ind w:left="0" w:firstLine="0"/>
       </w:pPr>
     </w:lvl>
     <w:lvl w:ilvl="7">
@@ -2211,12 +2150,12 @@
       <w:numFmt w:val="none"/>
       <w:suff w:val="nothing"/>
       <w:lvlText w:val=""/>
-      <w:lvlJc w:val="start"/>
+      <w:lvlJc w:val="left"/>
       <w:pPr>
         <w:tabs>
           <w:tab w:val="num" w:pos="0"/>
         </w:tabs>
-        <w:ind w:start="0" w:hanging="0"/>
+        <w:ind w:left="0" w:firstLine="0"/>
       </w:pPr>
     </w:lvl>
     <w:lvl w:ilvl="8">
@@ -2224,155 +2163,149 @@
       <w:numFmt w:val="none"/>
       <w:suff w:val="nothing"/>
       <w:lvlText w:val=""/>
-      <w:lvlJc w:val="start"/>
+      <w:lvlJc w:val="left"/>
       <w:pPr>
         <w:tabs>
           <w:tab w:val="num" w:pos="0"/>
         </w:tabs>
-        <w:ind w:start="0" w:hanging="0"/>
+        <w:ind w:left="0" w:firstLine="0"/>
       </w:pPr>
     </w:lvl>
   </w:abstractNum>
-  <w:abstractNum w:abstractNumId="2">
+  <w:abstractNum w:abstractNumId="1" w15:restartNumberingAfterBreak="0">
+    <w:nsid w:val="2DCD40CD"/>
+    <w:multiLevelType w:val="multilevel"/>
+    <w:tmpl w:val="95B6FBB4"/>
     <w:lvl w:ilvl="0">
       <w:start w:val="1"/>
       <w:numFmt w:val="decimal"/>
       <w:lvlText w:val="%1."/>
-      <w:lvlJc w:val="start"/>
+      <w:lvlJc w:val="left"/>
       <w:pPr>
         <w:tabs>
           <w:tab w:val="num" w:pos="0"/>
         </w:tabs>
-        <w:ind w:start="720" w:hanging="360"/>
-      </w:pPr>
-      <w:rPr/>
+        <w:ind w:left="720" w:hanging="360"/>
+      </w:pPr>
     </w:lvl>
     <w:lvl w:ilvl="1">
       <w:start w:val="1"/>
       <w:numFmt w:val="lowerLetter"/>
       <w:lvlText w:val="%2."/>
-      <w:lvlJc w:val="start"/>
+      <w:lvlJc w:val="left"/>
       <w:pPr>
         <w:tabs>
           <w:tab w:val="num" w:pos="0"/>
         </w:tabs>
-        <w:ind w:start="1440" w:hanging="360"/>
-      </w:pPr>
-      <w:rPr/>
+        <w:ind w:left="1440" w:hanging="360"/>
+      </w:pPr>
     </w:lvl>
     <w:lvl w:ilvl="2">
       <w:start w:val="1"/>
       <w:numFmt w:val="lowerRoman"/>
       <w:lvlText w:val="%3."/>
-      <w:lvlJc w:val="end"/>
+      <w:lvlJc w:val="right"/>
       <w:pPr>
         <w:tabs>
           <w:tab w:val="num" w:pos="0"/>
         </w:tabs>
-        <w:ind w:start="2160" w:hanging="180"/>
-      </w:pPr>
-      <w:rPr/>
+        <w:ind w:left="2160" w:hanging="180"/>
+      </w:pPr>
     </w:lvl>
     <w:lvl w:ilvl="3">
       <w:start w:val="1"/>
       <w:numFmt w:val="decimal"/>
       <w:lvlText w:val="%4."/>
-      <w:lvlJc w:val="start"/>
+      <w:lvlJc w:val="left"/>
       <w:pPr>
         <w:tabs>
           <w:tab w:val="num" w:pos="0"/>
         </w:tabs>
-        <w:ind w:start="2880" w:hanging="360"/>
-      </w:pPr>
-      <w:rPr/>
+        <w:ind w:left="2880" w:hanging="360"/>
+      </w:pPr>
     </w:lvl>
     <w:lvl w:ilvl="4">
       <w:start w:val="1"/>
       <w:numFmt w:val="lowerLetter"/>
       <w:lvlText w:val="%5."/>
-      <w:lvlJc w:val="start"/>
+      <w:lvlJc w:val="left"/>
       <w:pPr>
         <w:tabs>
           <w:tab w:val="num" w:pos="0"/>
         </w:tabs>
-        <w:ind w:start="3600" w:hanging="360"/>
-      </w:pPr>
-      <w:rPr/>
+        <w:ind w:left="3600" w:hanging="360"/>
+      </w:pPr>
     </w:lvl>
     <w:lvl w:ilvl="5">
       <w:start w:val="1"/>
       <w:numFmt w:val="lowerRoman"/>
       <w:lvlText w:val="%6."/>
-      <w:lvlJc w:val="end"/>
+      <w:lvlJc w:val="right"/>
       <w:pPr>
         <w:tabs>
           <w:tab w:val="num" w:pos="0"/>
         </w:tabs>
-        <w:ind w:start="4320" w:hanging="180"/>
-      </w:pPr>
-      <w:rPr/>
+        <w:ind w:left="4320" w:hanging="180"/>
+      </w:pPr>
     </w:lvl>
     <w:lvl w:ilvl="6">
       <w:start w:val="1"/>
       <w:numFmt w:val="decimal"/>
       <w:lvlText w:val="%7."/>
-      <w:lvlJc w:val="start"/>
+      <w:lvlJc w:val="left"/>
       <w:pPr>
         <w:tabs>
           <w:tab w:val="num" w:pos="0"/>
         </w:tabs>
-        <w:ind w:start="5040" w:hanging="360"/>
-      </w:pPr>
-      <w:rPr/>
+        <w:ind w:left="5040" w:hanging="360"/>
+      </w:pPr>
     </w:lvl>
     <w:lvl w:ilvl="7">
       <w:start w:val="1"/>
       <w:numFmt w:val="lowerLetter"/>
       <w:lvlText w:val="%8."/>
-      <w:lvlJc w:val="start"/>
+      <w:lvlJc w:val="left"/>
       <w:pPr>
         <w:tabs>
           <w:tab w:val="num" w:pos="0"/>
         </w:tabs>
-        <w:ind w:start="5760" w:hanging="360"/>
-      </w:pPr>
-      <w:rPr/>
+        <w:ind w:left="5760" w:hanging="360"/>
+      </w:pPr>
     </w:lvl>
     <w:lvl w:ilvl="8">
       <w:start w:val="1"/>
       <w:numFmt w:val="lowerRoman"/>
       <w:lvlText w:val="%9."/>
-      <w:lvlJc w:val="end"/>
+      <w:lvlJc w:val="right"/>
       <w:pPr>
         <w:tabs>
           <w:tab w:val="num" w:pos="0"/>
         </w:tabs>
-        <w:ind w:start="6480" w:hanging="180"/>
-      </w:pPr>
-      <w:rPr/>
+        <w:ind w:left="6480" w:hanging="180"/>
+      </w:pPr>
     </w:lvl>
   </w:abstractNum>
-  <w:num w:numId="1">
+  <w:num w:numId="1" w16cid:durableId="1678540395">
+    <w:abstractNumId w:val="0"/>
+  </w:num>
+  <w:num w:numId="2" w16cid:durableId="532502612">
     <w:abstractNumId w:val="1"/>
-  </w:num>
-  <w:num w:numId="2">
-    <w:abstractNumId w:val="2"/>
   </w:num>
 </w:numbering>
 </file>
 
 <file path=word/styles.xml><?xml version="1.0" encoding="utf-8"?>
-<w:styles xmlns:w="http://schemas.openxmlformats.org/wordprocessingml/2006/main" xmlns:w14="http://schemas.microsoft.com/office/word/2010/wordml" xmlns:mc="http://schemas.openxmlformats.org/markup-compatibility/2006" mc:Ignorable="w14">
+<w:styles xmlns:mc="http://schemas.openxmlformats.org/markup-compatibility/2006" xmlns:r="http://schemas.openxmlformats.org/officeDocument/2006/relationships" xmlns:w="http://schemas.openxmlformats.org/wordprocessingml/2006/main" xmlns:w14="http://schemas.microsoft.com/office/word/2010/wordml" xmlns:w15="http://schemas.microsoft.com/office/word/2012/wordml" xmlns:w16cex="http://schemas.microsoft.com/office/word/2018/wordml/cex" xmlns:w16cid="http://schemas.microsoft.com/office/word/2016/wordml/cid" xmlns:w16="http://schemas.microsoft.com/office/word/2018/wordml" xmlns:w16du="http://schemas.microsoft.com/office/word/2023/wordml/word16du" xmlns:w16sdtdh="http://schemas.microsoft.com/office/word/2020/wordml/sdtdatahash" xmlns:w16se="http://schemas.microsoft.com/office/word/2015/wordml/symex" mc:Ignorable="w14 w15 w16se w16cid w16 w16cex w16sdtdh w16du">
   <w:docDefaults>
     <w:rPrDefault>
       <w:rPr>
-        <w:rFonts w:ascii="Times New Roman" w:hAnsi="Times New Roman" w:eastAsia="Times New Roman" w:cs="Times New Roman"/>
+        <w:rFonts w:ascii="Times New Roman" w:eastAsia="Times New Roman" w:hAnsi="Times New Roman" w:cs="Times New Roman"/>
         <w:lang w:val="en-US" w:eastAsia="en-US" w:bidi="ar-SA"/>
       </w:rPr>
     </w:rPrDefault>
     <w:pPrDefault>
       <w:pPr>
-        <w:suppressAutoHyphens w:val="true"/>
+        <w:suppressAutoHyphens/>
       </w:pPr>
     </w:pPrDefault>
   </w:docDefaults>
@@ -2448,7 +2381,7 @@
     <w:lsdException w:name="Table Web 3" w:semiHidden="1" w:unhideWhenUsed="1"/>
     <w:lsdException w:name="Balloon Text" w:semiHidden="1" w:unhideWhenUsed="1"/>
     <w:lsdException w:name="Table Theme" w:semiHidden="1" w:unhideWhenUsed="1"/>
-    <w:lsdException w:name="Placeholder Text" w:uiPriority="99" w:semiHidden="1"/>
+    <w:lsdException w:name="Placeholder Text" w:semiHidden="1" w:uiPriority="99"/>
     <w:lsdException w:name="No Spacing" w:uiPriority="1" w:qFormat="1"/>
     <w:lsdException w:name="Light Shading" w:uiPriority="60"/>
     <w:lsdException w:name="Light List" w:uiPriority="61"/>
@@ -2470,7 +2403,7 @@
     <w:lsdException w:name="Medium Shading 1 Accent 1" w:uiPriority="63"/>
     <w:lsdException w:name="Medium Shading 2 Accent 1" w:uiPriority="64"/>
     <w:lsdException w:name="Medium List 1 Accent 1" w:uiPriority="65"/>
-    <w:lsdException w:name="Revision" w:uiPriority="99" w:semiHidden="1"/>
+    <w:lsdException w:name="Revision" w:semiHidden="1" w:uiPriority="99"/>
     <w:lsdException w:name="List Paragraph" w:uiPriority="34" w:qFormat="1"/>
     <w:lsdException w:name="Quote" w:uiPriority="29" w:qFormat="1"/>
     <w:lsdException w:name="Intense Quote" w:uiPriority="30" w:qFormat="1"/>
@@ -2557,8 +2490,8 @@
     <w:lsdException w:name="Subtle Reference" w:uiPriority="31" w:qFormat="1"/>
     <w:lsdException w:name="Intense Reference" w:uiPriority="32" w:qFormat="1"/>
     <w:lsdException w:name="Book Title" w:uiPriority="33" w:qFormat="1"/>
-    <w:lsdException w:name="Bibliography" w:uiPriority="37" w:semiHidden="1" w:unhideWhenUsed="1"/>
-    <w:lsdException w:name="TOC Heading" w:uiPriority="39" w:semiHidden="1" w:unhideWhenUsed="1" w:qFormat="1"/>
+    <w:lsdException w:name="Bibliography" w:semiHidden="1" w:uiPriority="37" w:unhideWhenUsed="1"/>
+    <w:lsdException w:name="TOC Heading" w:semiHidden="1" w:uiPriority="39" w:unhideWhenUsed="1" w:qFormat="1"/>
     <w:lsdException w:name="Plain Table 1" w:uiPriority="41"/>
     <w:lsdException w:name="Plain Table 2" w:uiPriority="42"/>
     <w:lsdException w:name="Plain Table 3" w:uiPriority="43"/>
@@ -2663,30 +2596,20 @@
     <w:lsdException w:name="List Table 5 Dark Accent 6" w:uiPriority="50"/>
     <w:lsdException w:name="List Table 6 Colorful Accent 6" w:uiPriority="51"/>
     <w:lsdException w:name="List Table 7 Colorful Accent 6" w:uiPriority="52"/>
-    <w:lsdException w:name="Mention" w:uiPriority="99" w:semiHidden="1" w:unhideWhenUsed="1"/>
-    <w:lsdException w:name="Smart Hyperlink" w:uiPriority="99" w:semiHidden="1" w:unhideWhenUsed="1"/>
-    <w:lsdException w:name="Hashtag" w:uiPriority="99" w:semiHidden="1" w:unhideWhenUsed="1"/>
-    <w:lsdException w:name="Unresolved Mention" w:uiPriority="99" w:semiHidden="1" w:unhideWhenUsed="1"/>
-    <w:lsdException w:name="Smart Link" w:uiPriority="99" w:semiHidden="1" w:unhideWhenUsed="1"/>
+    <w:lsdException w:name="Mention" w:semiHidden="1" w:uiPriority="99" w:unhideWhenUsed="1"/>
+    <w:lsdException w:name="Smart Hyperlink" w:semiHidden="1" w:uiPriority="99" w:unhideWhenUsed="1"/>
+    <w:lsdException w:name="Hashtag" w:semiHidden="1" w:uiPriority="99" w:unhideWhenUsed="1"/>
+    <w:lsdException w:name="Unresolved Mention" w:semiHidden="1" w:uiPriority="99" w:unhideWhenUsed="1"/>
+    <w:lsdException w:name="Smart Link" w:semiHidden="1" w:uiPriority="99" w:unhideWhenUsed="1"/>
   </w:latentStyles>
-  <w:style w:type="paragraph" w:styleId="Normal" w:default="1">
+  <w:style w:type="paragraph" w:default="1" w:styleId="Normal">
     <w:name w:val="Normal"/>
     <w:qFormat/>
-    <w:rsid w:val="007800bc"/>
-    <w:pPr>
-      <w:widowControl/>
-      <w:suppressAutoHyphens w:val="true"/>
-      <w:bidi w:val="0"/>
-      <w:spacing w:before="0" w:after="0"/>
-      <w:jc w:val="start"/>
-    </w:pPr>
+    <w:rsid w:val="007800BC"/>
     <w:rPr>
-      <w:rFonts w:ascii="Cambria" w:hAnsi="Cambria" w:eastAsia="Times New Roman" w:cs="Times New Roman"/>
-      <w:color w:val="auto"/>
-      <w:kern w:val="0"/>
+      <w:rFonts w:ascii="Cambria" w:hAnsi="Cambria"/>
       <w:sz w:val="22"/>
       <w:szCs w:val="24"/>
-      <w:lang w:val="en-US" w:eastAsia="en-US" w:bidi="ar-SA"/>
     </w:rPr>
   </w:style>
   <w:style w:type="paragraph" w:styleId="Heading1">
@@ -2695,15 +2618,15 @@
     <w:next w:val="Normal"/>
     <w:link w:val="Heading1Char"/>
     <w:qFormat/>
-    <w:rsid w:val="007800bc"/>
+    <w:rsid w:val="007800BC"/>
     <w:pPr>
-      <w:keepNext w:val="true"/>
+      <w:keepNext/>
       <w:keepLines/>
-      <w:spacing w:before="160" w:after="0"/>
+      <w:spacing w:before="160"/>
       <w:outlineLvl w:val="0"/>
     </w:pPr>
     <w:rPr>
-      <w:rFonts w:eastAsia="" w:cs="" w:cstheme="majorBidi" w:eastAsiaTheme="majorEastAsia"/>
+      <w:rFonts w:eastAsiaTheme="majorEastAsia" w:cstheme="majorBidi"/>
       <w:b/>
       <w:i/>
       <w:szCs w:val="32"/>
@@ -2716,26 +2639,46 @@
     <w:link w:val="Heading2Char"/>
     <w:unhideWhenUsed/>
     <w:qFormat/>
-    <w:rsid w:val="009720b6"/>
+    <w:rsid w:val="009720B6"/>
     <w:pPr>
-      <w:keepNext w:val="true"/>
+      <w:keepNext/>
       <w:keepLines/>
-      <w:spacing w:before="40" w:after="0"/>
+      <w:spacing w:before="40"/>
       <w:outlineLvl w:val="1"/>
     </w:pPr>
     <w:rPr>
-      <w:rFonts w:eastAsia="" w:cs="" w:cstheme="majorBidi" w:eastAsiaTheme="majorEastAsia"/>
-      <w:color w:themeColor="accent1" w:themeShade="bf" w:val="2E74B5"/>
+      <w:rFonts w:eastAsiaTheme="majorEastAsia" w:cstheme="majorBidi"/>
+      <w:color w:val="2E74B5" w:themeColor="accent1" w:themeShade="BF"/>
       <w:sz w:val="26"/>
       <w:szCs w:val="26"/>
     </w:rPr>
   </w:style>
-  <w:style w:type="character" w:styleId="DefaultParagraphFont" w:default="1">
+  <w:style w:type="character" w:default="1" w:styleId="DefaultParagraphFont">
     <w:name w:val="Default Paragraph Font"/>
     <w:uiPriority w:val="1"/>
+    <w:semiHidden/>
     <w:unhideWhenUsed/>
-    <w:qFormat/>
-    <w:rPr/>
+  </w:style>
+  <w:style w:type="table" w:default="1" w:styleId="TableNormal">
+    <w:name w:val="Normal Table"/>
+    <w:uiPriority w:val="99"/>
+    <w:semiHidden/>
+    <w:unhideWhenUsed/>
+    <w:tblPr>
+      <w:tblInd w:w="0" w:type="dxa"/>
+      <w:tblCellMar>
+        <w:top w:w="0" w:type="dxa"/>
+        <w:left w:w="108" w:type="dxa"/>
+        <w:bottom w:w="0" w:type="dxa"/>
+        <w:right w:w="108" w:type="dxa"/>
+      </w:tblCellMar>
+    </w:tblPr>
+  </w:style>
+  <w:style w:type="numbering" w:default="1" w:styleId="NoList">
+    <w:name w:val="No List"/>
+    <w:uiPriority w:val="99"/>
+    <w:semiHidden/>
+    <w:unhideWhenUsed/>
   </w:style>
   <w:style w:type="character" w:styleId="Hyperlink">
     <w:name w:val="Hyperlink"/>
@@ -2743,25 +2686,25 @@
     <w:unhideWhenUsed/>
     <w:rsid w:val="00005562"/>
     <w:rPr>
-      <w:color w:themeColor="accent1" w:themeShade="bf" w:val="2E74B5"/>
+      <w:color w:val="2E74B5" w:themeColor="accent1" w:themeShade="BF"/>
       <w:u w:val="single"/>
     </w:rPr>
   </w:style>
-  <w:style w:type="character" w:styleId="HeaderChar" w:customStyle="1">
+  <w:style w:type="character" w:customStyle="1" w:styleId="HeaderChar">
     <w:name w:val="Header Char"/>
     <w:link w:val="Header"/>
     <w:qFormat/>
-    <w:rsid w:val="00be1628"/>
+    <w:rsid w:val="00BE1628"/>
     <w:rPr>
       <w:sz w:val="24"/>
       <w:szCs w:val="24"/>
     </w:rPr>
   </w:style>
-  <w:style w:type="character" w:styleId="FooterChar" w:customStyle="1">
+  <w:style w:type="character" w:customStyle="1" w:styleId="FooterChar">
     <w:name w:val="Footer Char"/>
     <w:link w:val="Footer"/>
     <w:qFormat/>
-    <w:rsid w:val="00be1628"/>
+    <w:rsid w:val="00BE1628"/>
     <w:rPr>
       <w:sz w:val="24"/>
       <w:szCs w:val="24"/>
@@ -2769,17 +2712,17 @@
   </w:style>
   <w:style w:type="character" w:styleId="FollowedHyperlink">
     <w:name w:val="FollowedHyperlink"/>
-    <w:rsid w:val="00640af7"/>
+    <w:rsid w:val="00640AF7"/>
     <w:rPr>
       <w:color w:val="800080"/>
       <w:u w:val="single"/>
     </w:rPr>
   </w:style>
-  <w:style w:type="character" w:styleId="BalloonTextChar" w:customStyle="1">
+  <w:style w:type="character" w:customStyle="1" w:styleId="BalloonTextChar">
     <w:name w:val="Balloon Text Char"/>
     <w:link w:val="BalloonText"/>
     <w:qFormat/>
-    <w:rsid w:val="004f04f2"/>
+    <w:rsid w:val="004F04F2"/>
     <w:rPr>
       <w:rFonts w:ascii="Tahoma" w:hAnsi="Tahoma" w:cs="Tahoma"/>
       <w:sz w:val="16"/>
@@ -2790,30 +2733,30 @@
     <w:name w:val="annotation reference"/>
     <w:basedOn w:val="DefaultParagraphFont"/>
     <w:qFormat/>
-    <w:rsid w:val="001b26b3"/>
+    <w:rsid w:val="001B26B3"/>
     <w:rPr>
       <w:sz w:val="18"/>
       <w:szCs w:val="18"/>
     </w:rPr>
   </w:style>
-  <w:style w:type="character" w:styleId="CommentTextChar" w:customStyle="1">
+  <w:style w:type="character" w:customStyle="1" w:styleId="CommentTextChar">
     <w:name w:val="Comment Text Char"/>
     <w:basedOn w:val="DefaultParagraphFont"/>
     <w:link w:val="CommentText"/>
     <w:qFormat/>
-    <w:rsid w:val="001b26b3"/>
+    <w:rsid w:val="001B26B3"/>
     <w:rPr>
       <w:rFonts w:ascii="Cambria" w:hAnsi="Cambria"/>
       <w:sz w:val="24"/>
       <w:szCs w:val="24"/>
     </w:rPr>
   </w:style>
-  <w:style w:type="character" w:styleId="CommentSubjectChar" w:customStyle="1">
+  <w:style w:type="character" w:customStyle="1" w:styleId="CommentSubjectChar">
     <w:name w:val="Comment Subject Char"/>
     <w:basedOn w:val="CommentTextChar"/>
-    <w:link w:val="annotationsubject"/>
+    <w:link w:val="CommentSubject"/>
     <w:qFormat/>
-    <w:rsid w:val="001b26b3"/>
+    <w:rsid w:val="001B26B3"/>
     <w:rPr>
       <w:rFonts w:ascii="Cambria" w:hAnsi="Cambria"/>
       <w:b/>
@@ -2822,42 +2765,42 @@
       <w:szCs w:val="24"/>
     </w:rPr>
   </w:style>
-  <w:style w:type="character" w:styleId="PlainTextChar" w:customStyle="1">
+  <w:style w:type="character" w:customStyle="1" w:styleId="PlainTextChar">
     <w:name w:val="Plain Text Char"/>
     <w:basedOn w:val="DefaultParagraphFont"/>
     <w:link w:val="PlainText"/>
     <w:uiPriority w:val="99"/>
     <w:qFormat/>
-    <w:rsid w:val="0065446b"/>
+    <w:rsid w:val="0065446B"/>
     <w:rPr>
-      <w:rFonts w:ascii="Calibri" w:hAnsi="Calibri" w:cs="" w:cstheme="minorBidi"/>
+      <w:rFonts w:ascii="Calibri" w:hAnsi="Calibri" w:cstheme="minorBidi"/>
       <w:sz w:val="22"/>
       <w:szCs w:val="21"/>
     </w:rPr>
   </w:style>
-  <w:style w:type="character" w:styleId="Heading1Char" w:customStyle="1">
+  <w:style w:type="character" w:customStyle="1" w:styleId="Heading1Char">
     <w:name w:val="Heading 1 Char"/>
     <w:basedOn w:val="DefaultParagraphFont"/>
     <w:link w:val="Heading1"/>
     <w:qFormat/>
-    <w:rsid w:val="007800bc"/>
+    <w:rsid w:val="007800BC"/>
     <w:rPr>
-      <w:rFonts w:ascii="Cambria" w:hAnsi="Cambria" w:eastAsia="" w:cs="" w:cstheme="majorBidi" w:eastAsiaTheme="majorEastAsia"/>
+      <w:rFonts w:ascii="Cambria" w:eastAsiaTheme="majorEastAsia" w:hAnsi="Cambria" w:cstheme="majorBidi"/>
       <w:b/>
       <w:i/>
       <w:sz w:val="22"/>
       <w:szCs w:val="32"/>
     </w:rPr>
   </w:style>
-  <w:style w:type="character" w:styleId="Heading2Char" w:customStyle="1">
+  <w:style w:type="character" w:customStyle="1" w:styleId="Heading2Char">
     <w:name w:val="Heading 2 Char"/>
     <w:basedOn w:val="DefaultParagraphFont"/>
     <w:link w:val="Heading2"/>
     <w:qFormat/>
-    <w:rsid w:val="009720b6"/>
+    <w:rsid w:val="009720B6"/>
     <w:rPr>
-      <w:rFonts w:ascii="Cambria" w:hAnsi="Cambria" w:eastAsia="" w:cs="" w:cstheme="majorBidi" w:eastAsiaTheme="majorEastAsia"/>
-      <w:color w:themeColor="accent1" w:themeShade="bf" w:val="2E74B5"/>
+      <w:rFonts w:ascii="Cambria" w:eastAsiaTheme="majorEastAsia" w:hAnsi="Cambria" w:cstheme="majorBidi"/>
+      <w:color w:val="2E74B5" w:themeColor="accent1" w:themeShade="BF"/>
       <w:sz w:val="26"/>
       <w:szCs w:val="26"/>
     </w:rPr>
@@ -2869,23 +2812,23 @@
     <w:semiHidden/>
     <w:unhideWhenUsed/>
     <w:qFormat/>
-    <w:rsid w:val="005a37ac"/>
+    <w:rsid w:val="005A37AC"/>
     <w:rPr>
       <w:color w:val="605E5C"/>
-      <w:shd w:fill="E1DFDD" w:val="clear"/>
+      <w:shd w:val="clear" w:color="auto" w:fill="E1DFDD"/>
     </w:rPr>
   </w:style>
-  <w:style w:type="paragraph" w:styleId="Heading">
+  <w:style w:type="paragraph" w:customStyle="1" w:styleId="Heading">
     <w:name w:val="Heading"/>
     <w:basedOn w:val="Normal"/>
     <w:next w:val="BodyText"/>
     <w:qFormat/>
     <w:pPr>
-      <w:keepNext w:val="true"/>
+      <w:keepNext/>
       <w:spacing w:before="240" w:after="120"/>
     </w:pPr>
     <w:rPr>
-      <w:rFonts w:ascii="Liberation Sans" w:hAnsi="Liberation Sans" w:eastAsia="Noto Sans CJK SC" w:cs="Noto Sans Devanagari"/>
+      <w:rFonts w:ascii="Liberation Sans" w:eastAsia="Noto Sans CJK SC" w:hAnsi="Liberation Sans" w:cs="Noto Sans Devanagari"/>
       <w:sz w:val="28"/>
       <w:szCs w:val="28"/>
     </w:rPr>
@@ -2893,10 +2836,10 @@
   <w:style w:type="paragraph" w:styleId="BodyText">
     <w:name w:val="Body Text"/>
     <w:basedOn w:val="Normal"/>
-    <w:rsid w:val="00b927dd"/>
+    <w:rsid w:val="00B927DD"/>
     <w:pPr>
-      <w:widowControl w:val="false"/>
-      <w:spacing w:before="0" w:after="120"/>
+      <w:widowControl w:val="0"/>
+      <w:spacing w:after="120"/>
       <w:jc w:val="both"/>
     </w:pPr>
     <w:rPr>
@@ -2907,7 +2850,6 @@
   <w:style w:type="paragraph" w:styleId="List">
     <w:name w:val="List"/>
     <w:basedOn w:val="BodyText"/>
-    <w:pPr/>
     <w:rPr>
       <w:rFonts w:cs="Noto Sans Devanagari"/>
     </w:rPr>
@@ -2925,10 +2867,9 @@
       <w:i/>
       <w:iCs/>
       <w:sz w:val="24"/>
-      <w:szCs w:val="24"/>
     </w:rPr>
   </w:style>
-  <w:style w:type="paragraph" w:styleId="Index">
+  <w:style w:type="paragraph" w:customStyle="1" w:styleId="Index">
     <w:name w:val="Index"/>
     <w:basedOn w:val="Normal"/>
     <w:qFormat/>
@@ -2939,59 +2880,51 @@
       <w:rFonts w:cs="Noto Sans Devanagari"/>
     </w:rPr>
   </w:style>
-  <w:style w:type="paragraph" w:styleId="HeaderandFooter">
+  <w:style w:type="paragraph" w:customStyle="1" w:styleId="HeaderandFooter">
     <w:name w:val="Header and Footer"/>
     <w:basedOn w:val="Normal"/>
     <w:qFormat/>
-    <w:pPr/>
-    <w:rPr/>
   </w:style>
   <w:style w:type="paragraph" w:styleId="Header">
     <w:name w:val="header"/>
     <w:basedOn w:val="Normal"/>
     <w:link w:val="HeaderChar"/>
-    <w:rsid w:val="00be1628"/>
+    <w:rsid w:val="00BE1628"/>
     <w:pPr>
       <w:tabs>
-        <w:tab w:val="clear" w:pos="720"/>
-        <w:tab w:val="center" w:pos="4680" w:leader="none"/>
-        <w:tab w:val="right" w:pos="9360" w:leader="none"/>
+        <w:tab w:val="center" w:pos="4680"/>
+        <w:tab w:val="right" w:pos="9360"/>
       </w:tabs>
     </w:pPr>
-    <w:rPr/>
   </w:style>
   <w:style w:type="paragraph" w:styleId="Footer">
     <w:name w:val="footer"/>
     <w:basedOn w:val="Normal"/>
     <w:link w:val="FooterChar"/>
-    <w:rsid w:val="00be1628"/>
+    <w:rsid w:val="00BE1628"/>
     <w:pPr>
       <w:tabs>
-        <w:tab w:val="clear" w:pos="720"/>
-        <w:tab w:val="center" w:pos="4680" w:leader="none"/>
-        <w:tab w:val="right" w:pos="9360" w:leader="none"/>
+        <w:tab w:val="center" w:pos="4680"/>
+        <w:tab w:val="right" w:pos="9360"/>
       </w:tabs>
     </w:pPr>
-    <w:rPr/>
-  </w:style>
-  <w:style w:type="paragraph" w:styleId="ColorfulList-Accent11" w:customStyle="1">
+  </w:style>
+  <w:style w:type="paragraph" w:customStyle="1" w:styleId="ColorfulList-Accent11">
     <w:name w:val="Colorful List - Accent 11"/>
     <w:basedOn w:val="Normal"/>
     <w:uiPriority w:val="34"/>
     <w:qFormat/>
-    <w:rsid w:val="005e6e52"/>
+    <w:rsid w:val="005E6E52"/>
     <w:pPr>
-      <w:ind w:start="720"/>
+      <w:ind w:left="720"/>
     </w:pPr>
-    <w:rPr/>
   </w:style>
   <w:style w:type="paragraph" w:styleId="BalloonText">
     <w:name w:val="Balloon Text"/>
     <w:basedOn w:val="Normal"/>
     <w:link w:val="BalloonTextChar"/>
     <w:qFormat/>
-    <w:rsid w:val="004f04f2"/>
-    <w:pPr/>
+    <w:rsid w:val="004F04F2"/>
     <w:rPr>
       <w:rFonts w:ascii="Tahoma" w:hAnsi="Tahoma" w:cs="Tahoma"/>
       <w:sz w:val="16"/>
@@ -3005,50 +2938,36 @@
     <w:qFormat/>
     <w:rsid w:val="00955689"/>
     <w:pPr>
-      <w:spacing w:before="0" w:after="0"/>
-      <w:ind w:start="720"/>
+      <w:ind w:left="720"/>
       <w:contextualSpacing/>
     </w:pPr>
-    <w:rPr/>
-  </w:style>
-  <w:style w:type="paragraph" w:styleId="Default" w:customStyle="1">
+  </w:style>
+  <w:style w:type="paragraph" w:customStyle="1" w:styleId="Default">
     <w:name w:val="Default"/>
     <w:qFormat/>
-    <w:rsid w:val="006e7fc7"/>
-    <w:pPr>
-      <w:widowControl/>
-      <w:suppressAutoHyphens w:val="true"/>
-      <w:bidi w:val="0"/>
-      <w:spacing w:before="0" w:after="0"/>
-      <w:jc w:val="start"/>
-    </w:pPr>
+    <w:rsid w:val="006E7FC7"/>
     <w:rPr>
-      <w:rFonts w:ascii="Times New Roman" w:hAnsi="Times New Roman" w:eastAsia="Times New Roman" w:cs="Times New Roman"/>
       <w:color w:val="000000"/>
-      <w:kern w:val="0"/>
       <w:sz w:val="24"/>
       <w:szCs w:val="24"/>
-      <w:lang w:val="en-US" w:eastAsia="en-US" w:bidi="ar-SA"/>
     </w:rPr>
   </w:style>
   <w:style w:type="paragraph" w:styleId="CommentText">
     <w:name w:val="annotation text"/>
     <w:basedOn w:val="Normal"/>
     <w:link w:val="CommentTextChar"/>
-    <w:rsid w:val="001b26b3"/>
-    <w:pPr/>
+    <w:rsid w:val="001B26B3"/>
     <w:rPr>
       <w:sz w:val="24"/>
     </w:rPr>
   </w:style>
-  <w:style w:type="paragraph" w:styleId="annotationsubject">
+  <w:style w:type="paragraph" w:styleId="CommentSubject">
     <w:name w:val="annotation subject"/>
     <w:basedOn w:val="CommentText"/>
     <w:next w:val="CommentText"/>
     <w:link w:val="CommentSubjectChar"/>
     <w:qFormat/>
-    <w:rsid w:val="001b26b3"/>
-    <w:pPr/>
+    <w:rsid w:val="001B26B3"/>
     <w:rPr>
       <w:b/>
       <w:bCs/>
@@ -3063,10 +2982,9 @@
     <w:uiPriority w:val="99"/>
     <w:unhideWhenUsed/>
     <w:qFormat/>
-    <w:rsid w:val="0065446b"/>
-    <w:pPr/>
+    <w:rsid w:val="0065446B"/>
     <w:rPr>
-      <w:rFonts w:ascii="Calibri" w:hAnsi="Calibri" w:cs="" w:cstheme="minorBidi"/>
+      <w:rFonts w:ascii="Calibri" w:hAnsi="Calibri" w:cstheme="minorBidi"/>
       <w:szCs w:val="21"/>
     </w:rPr>
   </w:style>
@@ -3075,46 +2993,24 @@
     <w:basedOn w:val="Normal"/>
     <w:uiPriority w:val="99"/>
     <w:qFormat/>
-    <w:rsid w:val="00a64310"/>
-    <w:pPr/>
+    <w:rsid w:val="00A64310"/>
     <w:rPr>
       <w:rFonts w:ascii="Times New Roman" w:hAnsi="Times New Roman"/>
       <w:sz w:val="24"/>
     </w:rPr>
   </w:style>
-  <w:style w:type="numbering" w:styleId="NoList" w:default="1">
-    <w:name w:val="No List"/>
-    <w:uiPriority w:val="99"/>
-    <w:semiHidden/>
-    <w:unhideWhenUsed/>
-    <w:qFormat/>
-  </w:style>
-  <w:style w:type="table" w:default="1" w:styleId="TableNormal">
-    <w:name w:val="Normal Table"/>
-    <w:uiPriority w:val="99"/>
-    <w:semiHidden/>
-    <w:unhideWhenUsed/>
-    <w:tblPr>
-      <w:tblCellMar>
-        <w:top w:w="0" w:type="dxa"/>
-        <w:left w:w="108" w:type="dxa"/>
-        <w:bottom w:w="0" w:type="dxa"/>
-        <w:right w:w="108" w:type="dxa"/>
-      </w:tblCellMar>
-    </w:tblPr>
-  </w:style>
   <w:style w:type="table" w:styleId="TableGrid">
     <w:name w:val="Table Grid"/>
     <w:basedOn w:val="TableNormal"/>
-    <w:rsid w:val="006e7fc7"/>
+    <w:rsid w:val="006E7FC7"/>
     <w:tblPr>
       <w:tblBorders>
-        <w:top w:val="single" w:color="auto" w:sz="4" w:space="0"/>
-        <w:left w:val="single" w:color="auto" w:sz="4" w:space="0"/>
-        <w:bottom w:val="single" w:color="auto" w:sz="4" w:space="0"/>
-        <w:right w:val="single" w:color="auto" w:sz="4" w:space="0"/>
-        <w:insideH w:val="single" w:color="auto" w:sz="4" w:space="0"/>
-        <w:insideV w:val="single" w:color="auto" w:sz="4" w:space="0"/>
+        <w:top w:val="single" w:sz="4" w:space="0" w:color="auto"/>
+        <w:left w:val="single" w:sz="4" w:space="0" w:color="auto"/>
+        <w:bottom w:val="single" w:sz="4" w:space="0" w:color="auto"/>
+        <w:right w:val="single" w:sz="4" w:space="0" w:color="auto"/>
+        <w:insideH w:val="single" w:sz="4" w:space="0" w:color="auto"/>
+        <w:insideV w:val="single" w:sz="4" w:space="0" w:color="auto"/>
       </w:tblBorders>
     </w:tblPr>
   </w:style>
@@ -3122,17 +3018,17 @@
     <w:name w:val="Plain Table 1"/>
     <w:basedOn w:val="TableNormal"/>
     <w:uiPriority w:val="41"/>
-    <w:rsid w:val="00fc354c"/>
+    <w:rsid w:val="00FC354C"/>
     <w:tblPr>
       <w:tblStyleRowBandSize w:val="1"/>
       <w:tblStyleColBandSize w:val="1"/>
       <w:tblBorders>
-        <w:top w:val="single" w:color="BFBFBF" w:themeColor="background1" w:themeShade="bf" w:sz="4" w:space="0"/>
-        <w:left w:val="single" w:color="BFBFBF" w:themeColor="background1" w:themeShade="bf" w:sz="4" w:space="0"/>
-        <w:bottom w:val="single" w:color="BFBFBF" w:themeColor="background1" w:themeShade="bf" w:sz="4" w:space="0"/>
-        <w:right w:val="single" w:color="BFBFBF" w:themeColor="background1" w:themeShade="bf" w:sz="4" w:space="0"/>
-        <w:insideH w:val="single" w:color="BFBFBF" w:themeColor="background1" w:themeShade="bf" w:sz="4" w:space="0"/>
-        <w:insideV w:val="single" w:color="BFBFBF" w:themeColor="background1" w:themeShade="bf" w:sz="4" w:space="0"/>
+        <w:top w:val="single" w:sz="4" w:space="0" w:color="BFBFBF" w:themeColor="background1" w:themeShade="BF"/>
+        <w:left w:val="single" w:sz="4" w:space="0" w:color="BFBFBF" w:themeColor="background1" w:themeShade="BF"/>
+        <w:bottom w:val="single" w:sz="4" w:space="0" w:color="BFBFBF" w:themeColor="background1" w:themeShade="BF"/>
+        <w:right w:val="single" w:sz="4" w:space="0" w:color="BFBFBF" w:themeColor="background1" w:themeShade="BF"/>
+        <w:insideH w:val="single" w:sz="4" w:space="0" w:color="BFBFBF" w:themeColor="background1" w:themeShade="BF"/>
+        <w:insideV w:val="single" w:sz="4" w:space="0" w:color="BFBFBF" w:themeColor="background1" w:themeShade="BF"/>
       </w:tblBorders>
     </w:tblPr>
     <w:tblStylePr w:type="firstRow">
@@ -3140,7 +3036,6 @@
         <w:b/>
         <w:bCs/>
       </w:rPr>
-      <w:tblPr/>
     </w:tblStylePr>
     <w:tblStylePr w:type="lastRow">
       <w:rPr>
@@ -3150,7 +3045,7 @@
       <w:tblPr/>
       <w:tcPr>
         <w:tcBorders>
-          <w:top w:val="double" w:color="BFBFBF" w:themeColor="background1" w:sz="4" w:space="0"/>
+          <w:top w:val="double" w:sz="4" w:space="0" w:color="FFFFFF" w:themeColor="background1"/>
         </w:tcBorders>
       </w:tcPr>
     </w:tblStylePr>
@@ -3159,25 +3054,23 @@
         <w:b/>
         <w:bCs/>
       </w:rPr>
-      <w:tblPr/>
     </w:tblStylePr>
     <w:tblStylePr w:type="lastCol">
       <w:rPr>
         <w:b/>
         <w:bCs/>
       </w:rPr>
-      <w:tblPr/>
     </w:tblStylePr>
     <w:tblStylePr w:type="band1Vert">
       <w:tblPr/>
       <w:tcPr>
-        <w:shd w:val="clear" w:color="auto" w:fill="F2F2F2" w:themeFill="background1" w:themeFillShade="f2"/>
+        <w:shd w:val="clear" w:color="auto" w:fill="F2F2F2" w:themeFill="background1" w:themeFillShade="F2"/>
       </w:tcPr>
     </w:tblStylePr>
     <w:tblStylePr w:type="band1Horz">
       <w:tblPr/>
       <w:tcPr>
-        <w:shd w:val="clear" w:color="auto" w:fill="F2F2F2" w:themeFill="background1" w:themeFillShade="f2"/>
+        <w:shd w:val="clear" w:color="auto" w:fill="F2F2F2" w:themeFill="background1" w:themeFillShade="F2"/>
       </w:tcPr>
     </w:tblStylePr>
   </w:style>
@@ -3185,7 +3078,7 @@
 </file>
 
 <file path=word/theme/theme1.xml><?xml version="1.0" encoding="utf-8"?>
-<a:theme xmlns:a="http://schemas.openxmlformats.org/drawingml/2006/main" xmlns:r="http://schemas.openxmlformats.org/officeDocument/2006/relationships" name="Office Theme">
+<a:theme xmlns:a="http://schemas.openxmlformats.org/drawingml/2006/main" name="Office Theme">
   <a:themeElements>
     <a:clrScheme name="Office">
       <a:dk1>
@@ -3227,12 +3120,12 @@
     </a:clrScheme>
     <a:fontScheme name="Office">
       <a:majorFont>
-        <a:latin typeface="Calibri Light" panose="020F0302020204030204" pitchFamily="0" charset="1"/>
+        <a:latin typeface="Calibri Light" panose="020F0302020204030204"/>
         <a:ea typeface=""/>
         <a:cs typeface=""/>
       </a:majorFont>
       <a:minorFont>
-        <a:latin typeface="Calibri" panose="020F0502020204030204" pitchFamily="0" charset="1"/>
+        <a:latin typeface="Calibri" panose="020F0502020204030204"/>
         <a:ea typeface=""/>
         <a:cs typeface=""/>
       </a:minorFont>
@@ -3264,7 +3157,7 @@
             </a:gs>
           </a:gsLst>
           <a:lin ang="5400000" scaled="0"/>
-          <a:tileRect l="0" t="0" r="0" b="0"/>
+          <a:tileRect/>
         </a:gradFill>
         <a:gradFill>
           <a:gsLst>
@@ -3288,7 +3181,7 @@
             </a:gs>
           </a:gsLst>
           <a:lin ang="5400000" scaled="0"/>
-          <a:tileRect l="0" t="0" r="0" b="0"/>
+          <a:tileRect/>
         </a:gradFill>
       </a:fillStyleLst>
       <a:lnStyleLst>
@@ -3348,11 +3241,13 @@
             </a:gs>
           </a:gsLst>
           <a:lin ang="5400000" scaled="0"/>
-          <a:tileRect l="0" t="0" r="0" b="0"/>
+          <a:tileRect/>
         </a:gradFill>
       </a:bgFillStyleLst>
     </a:fmtScheme>
   </a:themeElements>
+  <a:objectDefaults/>
+  <a:extraClrSchemeLst/>
 </a:theme>
 </file>
 

</xml_diff>

<commit_message>
Assignment 3: modified writeup doc, added table
</commit_message>
<xml_diff>
--- a/Assignment-3/CGS4144_Assn3.docx
+++ b/Assignment-3/CGS4144_Assn3.docx
@@ -739,23 +739,7 @@
             <w:i/>
             <w:iCs/>
           </w:rPr>
-          <w:t>https://www.tidymodels.org/learn/statistics/k-mea</w:t>
-        </w:r>
-        <w:r>
-          <w:rPr>
-            <w:rStyle w:val="Hyperlink"/>
-            <w:i/>
-            <w:iCs/>
-          </w:rPr>
-          <w:t>n</w:t>
-        </w:r>
-        <w:r>
-          <w:rPr>
-            <w:rStyle w:val="Hyperlink"/>
-            <w:i/>
-            <w:iCs/>
-          </w:rPr>
-          <w:t>s/index.html</w:t>
+          <w:t>https://www.tidymodels.org/learn/statistics/k-means/index.html</w:t>
         </w:r>
       </w:hyperlink>
       <w:r>
@@ -1456,43 +1440,588 @@
           <w:color w:val="EE0000"/>
           <w:szCs w:val="22"/>
         </w:rPr>
-        <w:t>Another method used was the Gaussian Mixture Model in python</w:t>
-      </w:r>
+        <w:t xml:space="preserve">Another method used was the Gaussian Mixture Model in python. After extracting the 5,000 most variable genes and using the </w:t>
+      </w:r>
+      <w:proofErr w:type="spellStart"/>
       <w:r>
         <w:rPr>
           <w:rFonts w:ascii="Calibri Light" w:hAnsi="Calibri Light" w:cstheme="majorHAnsi"/>
           <w:color w:val="EE0000"/>
           <w:szCs w:val="22"/>
         </w:rPr>
-        <w:t>.</w:t>
-      </w:r>
+        <w:t>GaussianMixture</w:t>
+      </w:r>
+      <w:proofErr w:type="spellEnd"/>
       <w:r>
         <w:rPr>
           <w:rFonts w:ascii="Calibri Light" w:hAnsi="Calibri Light" w:cstheme="majorHAnsi"/>
           <w:color w:val="EE0000"/>
           <w:szCs w:val="22"/>
         </w:rPr>
-        <w:t xml:space="preserve"> After extracting the 5,000 most variable genes and using the </w:t>
-      </w:r>
-      <w:proofErr w:type="spellStart"/>
+        <w:t xml:space="preserve"> models, 6 cluster sizes were generated and compared. The cluster sizes ranged from 2-7 and of them, </w:t>
+      </w:r>
       <w:r>
         <w:rPr>
           <w:rFonts w:ascii="Calibri Light" w:hAnsi="Calibri Light" w:cstheme="majorHAnsi"/>
           <w:color w:val="EE0000"/>
           <w:szCs w:val="22"/>
         </w:rPr>
-        <w:t>GaussianMixture</w:t>
-      </w:r>
-      <w:proofErr w:type="spellEnd"/>
+        <w:t xml:space="preserve">cluster </w:t>
+      </w:r>
       <w:r>
         <w:rPr>
           <w:rFonts w:ascii="Calibri Light" w:hAnsi="Calibri Light" w:cstheme="majorHAnsi"/>
           <w:color w:val="EE0000"/>
           <w:szCs w:val="22"/>
         </w:rPr>
-        <w:t xml:space="preserve"> models, 6 cluster sizes were generated and compared. The cluster sizes ranged from 2-7 and of them, 2 had the highest silhouette score of 0.0453. The second highest cluster was cluster 4 which had a score of 0.0199, though all the rother clusters had similar scores. Therefore, increasing the value k for number of clusters didn’t improve the separation of the data, it in fact decreased starting from k=3.</w:t>
-      </w:r>
-    </w:p>
+        <w:t>2 had the highest silhouette score of 0.0453. The second highest cluster was cluster 4 which had a score of 0.0199, though all the rother clusters had similar scores. Therefore, increasing the value k for number of clusters didn’t improve the separation of the data, it in fact decreased starting from k=3.</w:t>
+      </w:r>
+    </w:p>
+    <w:p>
+      <w:pPr>
+        <w:spacing w:beforeAutospacing="1" w:afterAutospacing="1"/>
+        <w:rPr>
+          <w:rFonts w:ascii="Calibri Light" w:hAnsi="Calibri Light" w:cstheme="majorHAnsi"/>
+          <w:color w:val="EE0000"/>
+          <w:szCs w:val="22"/>
+        </w:rPr>
+      </w:pPr>
+      <w:r>
+        <w:rPr>
+          <w:rFonts w:ascii="Calibri Light" w:hAnsi="Calibri Light" w:cstheme="majorHAnsi"/>
+          <w:color w:val="EE0000"/>
+          <w:szCs w:val="22"/>
+        </w:rPr>
+        <w:t xml:space="preserve">For gene counts 10-10,000 of the most variable genes, the Gaussian mixture model indicated that increasing the number of genes increased the cluster size. A comparison was done for each pair of gene counts. Most comparisons were significant according to the Chi-squared tests p-value. However, 10 to 10,000 genes </w:t>
+      </w:r>
+      <w:proofErr w:type="gramStart"/>
+      <w:r>
+        <w:rPr>
+          <w:rFonts w:ascii="Calibri Light" w:hAnsi="Calibri Light" w:cstheme="majorHAnsi"/>
+          <w:color w:val="EE0000"/>
+          <w:szCs w:val="22"/>
+        </w:rPr>
+        <w:t>was</w:t>
+      </w:r>
+      <w:proofErr w:type="gramEnd"/>
+      <w:r>
+        <w:rPr>
+          <w:rFonts w:ascii="Calibri Light" w:hAnsi="Calibri Light" w:cstheme="majorHAnsi"/>
+          <w:color w:val="EE0000"/>
+          <w:szCs w:val="22"/>
+        </w:rPr>
+        <w:t xml:space="preserve"> not statistically significant, as it only had a p value of 0.381. This means that there is low association between the two clustering results. </w:t>
+      </w:r>
+    </w:p>
+    <w:tbl>
+      <w:tblPr>
+        <w:tblStyle w:val="TableGrid"/>
+        <w:tblW w:w="0" w:type="auto"/>
+        <w:tblLook w:val="04A0" w:firstRow="1" w:lastRow="0" w:firstColumn="1" w:lastColumn="0" w:noHBand="0" w:noVBand="1"/>
+      </w:tblPr>
+      <w:tblGrid>
+        <w:gridCol w:w="3596"/>
+        <w:gridCol w:w="3597"/>
+        <w:gridCol w:w="3597"/>
+      </w:tblGrid>
+      <w:tr>
+        <w:tc>
+          <w:tcPr>
+            <w:tcW w:w="3596" w:type="dxa"/>
+          </w:tcPr>
+          <w:p>
+            <w:pPr>
+              <w:spacing w:beforeAutospacing="1" w:afterAutospacing="1"/>
+              <w:rPr>
+                <w:rFonts w:asciiTheme="majorHAnsi" w:hAnsiTheme="majorHAnsi" w:cstheme="majorHAnsi"/>
+                <w:color w:val="EE0000"/>
+                <w:szCs w:val="22"/>
+              </w:rPr>
+            </w:pPr>
+            <w:r>
+              <w:rPr>
+                <w:rFonts w:asciiTheme="majorHAnsi" w:hAnsiTheme="majorHAnsi" w:cstheme="majorHAnsi"/>
+                <w:color w:val="EE0000"/>
+                <w:szCs w:val="22"/>
+              </w:rPr>
+              <w:t>Gene count Pair</w:t>
+            </w:r>
+          </w:p>
+        </w:tc>
+        <w:tc>
+          <w:tcPr>
+            <w:tcW w:w="3597" w:type="dxa"/>
+          </w:tcPr>
+          <w:p>
+            <w:pPr>
+              <w:spacing w:beforeAutospacing="1" w:afterAutospacing="1"/>
+              <w:rPr>
+                <w:rFonts w:asciiTheme="majorHAnsi" w:hAnsiTheme="majorHAnsi" w:cstheme="majorHAnsi"/>
+                <w:color w:val="EE0000"/>
+                <w:szCs w:val="22"/>
+              </w:rPr>
+            </w:pPr>
+            <w:r>
+              <w:rPr>
+                <w:rFonts w:asciiTheme="majorHAnsi" w:hAnsiTheme="majorHAnsi" w:cstheme="majorHAnsi"/>
+                <w:color w:val="EE0000"/>
+                <w:szCs w:val="22"/>
+              </w:rPr>
+              <w:t>Chi-Squared Value</w:t>
+            </w:r>
+          </w:p>
+        </w:tc>
+        <w:tc>
+          <w:tcPr>
+            <w:tcW w:w="3597" w:type="dxa"/>
+          </w:tcPr>
+          <w:p>
+            <w:pPr>
+              <w:spacing w:beforeAutospacing="1" w:afterAutospacing="1"/>
+              <w:rPr>
+                <w:rFonts w:asciiTheme="majorHAnsi" w:hAnsiTheme="majorHAnsi" w:cstheme="majorHAnsi"/>
+                <w:color w:val="EE0000"/>
+                <w:szCs w:val="22"/>
+              </w:rPr>
+            </w:pPr>
+            <w:r>
+              <w:rPr>
+                <w:rFonts w:asciiTheme="majorHAnsi" w:hAnsiTheme="majorHAnsi" w:cstheme="majorHAnsi"/>
+                <w:color w:val="EE0000"/>
+                <w:szCs w:val="22"/>
+              </w:rPr>
+              <w:t>P-Value</w:t>
+            </w:r>
+          </w:p>
+        </w:tc>
+      </w:tr>
+      <w:tr>
+        <w:tc>
+          <w:tcPr>
+            <w:tcW w:w="3596" w:type="dxa"/>
+          </w:tcPr>
+          <w:p>
+            <w:pPr>
+              <w:spacing w:beforeAutospacing="1" w:afterAutospacing="1"/>
+              <w:rPr>
+                <w:rFonts w:asciiTheme="majorHAnsi" w:hAnsiTheme="majorHAnsi" w:cstheme="majorHAnsi"/>
+                <w:color w:val="EE0000"/>
+                <w:szCs w:val="22"/>
+              </w:rPr>
+            </w:pPr>
+            <w:r>
+              <w:rPr>
+                <w:rFonts w:asciiTheme="majorHAnsi" w:hAnsiTheme="majorHAnsi" w:cstheme="majorHAnsi"/>
+                <w:color w:val="EE0000"/>
+                <w:szCs w:val="22"/>
+              </w:rPr>
+              <w:t>10 100</w:t>
+            </w:r>
+          </w:p>
+        </w:tc>
+        <w:tc>
+          <w:tcPr>
+            <w:tcW w:w="3597" w:type="dxa"/>
+          </w:tcPr>
+          <w:p>
+            <w:pPr>
+              <w:spacing w:beforeAutospacing="1" w:afterAutospacing="1"/>
+              <w:rPr>
+                <w:rFonts w:asciiTheme="majorHAnsi" w:hAnsiTheme="majorHAnsi" w:cstheme="majorHAnsi"/>
+                <w:color w:val="EE0000"/>
+                <w:szCs w:val="22"/>
+              </w:rPr>
+            </w:pPr>
+            <w:r>
+              <w:rPr>
+                <w:rFonts w:asciiTheme="majorHAnsi" w:hAnsiTheme="majorHAnsi" w:cstheme="majorHAnsi"/>
+                <w:color w:val="EE0000"/>
+                <w:szCs w:val="22"/>
+              </w:rPr>
+              <w:t>31.349738277889923</w:t>
+            </w:r>
+          </w:p>
+        </w:tc>
+        <w:tc>
+          <w:tcPr>
+            <w:tcW w:w="3597" w:type="dxa"/>
+          </w:tcPr>
+          <w:p>
+            <w:pPr>
+              <w:spacing w:beforeAutospacing="1" w:afterAutospacing="1"/>
+              <w:rPr>
+                <w:rFonts w:asciiTheme="majorHAnsi" w:hAnsiTheme="majorHAnsi" w:cstheme="majorHAnsi"/>
+                <w:color w:val="EE0000"/>
+                <w:szCs w:val="22"/>
+              </w:rPr>
+            </w:pPr>
+            <w:r>
+              <w:rPr>
+                <w:rFonts w:asciiTheme="majorHAnsi" w:hAnsiTheme="majorHAnsi" w:cstheme="majorHAnsi"/>
+                <w:color w:val="EE0000"/>
+                <w:szCs w:val="22"/>
+              </w:rPr>
+              <w:t>2.5974862827933456e-06</w:t>
+            </w:r>
+          </w:p>
+        </w:tc>
+      </w:tr>
+      <w:tr>
+        <w:tc>
+          <w:tcPr>
+            <w:tcW w:w="3596" w:type="dxa"/>
+          </w:tcPr>
+          <w:p>
+            <w:pPr>
+              <w:spacing w:beforeAutospacing="1" w:afterAutospacing="1"/>
+              <w:rPr>
+                <w:rFonts w:asciiTheme="majorHAnsi" w:hAnsiTheme="majorHAnsi" w:cstheme="majorHAnsi"/>
+                <w:color w:val="EE0000"/>
+                <w:szCs w:val="22"/>
+              </w:rPr>
+            </w:pPr>
+            <w:r>
+              <w:rPr>
+                <w:rFonts w:asciiTheme="majorHAnsi" w:hAnsiTheme="majorHAnsi" w:cstheme="majorHAnsi"/>
+                <w:color w:val="EE0000"/>
+                <w:szCs w:val="22"/>
+              </w:rPr>
+              <w:t>10 1000</w:t>
+            </w:r>
+          </w:p>
+        </w:tc>
+        <w:tc>
+          <w:tcPr>
+            <w:tcW w:w="3597" w:type="dxa"/>
+          </w:tcPr>
+          <w:p>
+            <w:pPr>
+              <w:spacing w:beforeAutospacing="1" w:afterAutospacing="1"/>
+              <w:rPr>
+                <w:rFonts w:asciiTheme="majorHAnsi" w:hAnsiTheme="majorHAnsi" w:cstheme="majorHAnsi"/>
+                <w:color w:val="EE0000"/>
+                <w:szCs w:val="22"/>
+              </w:rPr>
+            </w:pPr>
+            <w:r>
+              <w:rPr>
+                <w:rFonts w:asciiTheme="majorHAnsi" w:hAnsiTheme="majorHAnsi" w:cstheme="majorHAnsi"/>
+                <w:color w:val="EE0000"/>
+                <w:szCs w:val="22"/>
+              </w:rPr>
+              <w:t>11.908741620988595</w:t>
+            </w:r>
+          </w:p>
+        </w:tc>
+        <w:tc>
+          <w:tcPr>
+            <w:tcW w:w="3597" w:type="dxa"/>
+          </w:tcPr>
+          <w:p>
+            <w:pPr>
+              <w:spacing w:beforeAutospacing="1" w:afterAutospacing="1"/>
+              <w:rPr>
+                <w:rFonts w:asciiTheme="majorHAnsi" w:hAnsiTheme="majorHAnsi" w:cstheme="majorHAnsi"/>
+                <w:color w:val="EE0000"/>
+                <w:szCs w:val="22"/>
+              </w:rPr>
+            </w:pPr>
+            <w:r>
+              <w:rPr>
+                <w:rFonts w:asciiTheme="majorHAnsi" w:hAnsiTheme="majorHAnsi" w:cstheme="majorHAnsi"/>
+                <w:color w:val="EE0000"/>
+                <w:szCs w:val="22"/>
+              </w:rPr>
+              <w:t>0.018042946341352086</w:t>
+            </w:r>
+          </w:p>
+        </w:tc>
+      </w:tr>
+      <w:tr>
+        <w:tc>
+          <w:tcPr>
+            <w:tcW w:w="3596" w:type="dxa"/>
+          </w:tcPr>
+          <w:p>
+            <w:pPr>
+              <w:spacing w:beforeAutospacing="1" w:afterAutospacing="1"/>
+              <w:rPr>
+                <w:rFonts w:asciiTheme="majorHAnsi" w:hAnsiTheme="majorHAnsi" w:cstheme="majorHAnsi"/>
+                <w:color w:val="EE0000"/>
+                <w:szCs w:val="22"/>
+              </w:rPr>
+            </w:pPr>
+            <w:r>
+              <w:rPr>
+                <w:rFonts w:asciiTheme="majorHAnsi" w:hAnsiTheme="majorHAnsi" w:cstheme="majorHAnsi"/>
+                <w:color w:val="EE0000"/>
+                <w:szCs w:val="22"/>
+              </w:rPr>
+              <w:t>10 10000</w:t>
+            </w:r>
+          </w:p>
+        </w:tc>
+        <w:tc>
+          <w:tcPr>
+            <w:tcW w:w="3597" w:type="dxa"/>
+          </w:tcPr>
+          <w:p>
+            <w:pPr>
+              <w:spacing w:beforeAutospacing="1" w:afterAutospacing="1"/>
+              <w:rPr>
+                <w:rFonts w:asciiTheme="majorHAnsi" w:hAnsiTheme="majorHAnsi" w:cstheme="majorHAnsi"/>
+                <w:color w:val="EE0000"/>
+                <w:szCs w:val="22"/>
+              </w:rPr>
+            </w:pPr>
+            <w:r>
+              <w:rPr>
+                <w:rFonts w:asciiTheme="majorHAnsi" w:hAnsiTheme="majorHAnsi" w:cstheme="majorHAnsi"/>
+                <w:color w:val="EE0000"/>
+                <w:szCs w:val="22"/>
+              </w:rPr>
+              <w:t>4.1920578559385495</w:t>
+            </w:r>
+          </w:p>
+        </w:tc>
+        <w:tc>
+          <w:tcPr>
+            <w:tcW w:w="3597" w:type="dxa"/>
+          </w:tcPr>
+          <w:p>
+            <w:pPr>
+              <w:spacing w:beforeAutospacing="1" w:afterAutospacing="1"/>
+              <w:rPr>
+                <w:rFonts w:asciiTheme="majorHAnsi" w:hAnsiTheme="majorHAnsi" w:cstheme="majorHAnsi"/>
+                <w:color w:val="EE0000"/>
+                <w:szCs w:val="22"/>
+              </w:rPr>
+            </w:pPr>
+            <w:r>
+              <w:rPr>
+                <w:rFonts w:asciiTheme="majorHAnsi" w:hAnsiTheme="majorHAnsi" w:cstheme="majorHAnsi"/>
+                <w:color w:val="EE0000"/>
+                <w:szCs w:val="22"/>
+              </w:rPr>
+              <w:t>0.3806371847213647</w:t>
+            </w:r>
+          </w:p>
+        </w:tc>
+      </w:tr>
+      <w:tr>
+        <w:tc>
+          <w:tcPr>
+            <w:tcW w:w="3596" w:type="dxa"/>
+          </w:tcPr>
+          <w:p>
+            <w:pPr>
+              <w:spacing w:beforeAutospacing="1" w:afterAutospacing="1"/>
+              <w:rPr>
+                <w:rFonts w:asciiTheme="majorHAnsi" w:hAnsiTheme="majorHAnsi" w:cstheme="majorHAnsi"/>
+                <w:color w:val="EE0000"/>
+                <w:szCs w:val="22"/>
+              </w:rPr>
+            </w:pPr>
+            <w:r>
+              <w:rPr>
+                <w:rFonts w:asciiTheme="majorHAnsi" w:hAnsiTheme="majorHAnsi" w:cstheme="majorHAnsi"/>
+                <w:color w:val="EE0000"/>
+                <w:szCs w:val="22"/>
+              </w:rPr>
+              <w:t>100 1000</w:t>
+            </w:r>
+          </w:p>
+        </w:tc>
+        <w:tc>
+          <w:tcPr>
+            <w:tcW w:w="3597" w:type="dxa"/>
+          </w:tcPr>
+          <w:p>
+            <w:pPr>
+              <w:spacing w:beforeAutospacing="1" w:afterAutospacing="1"/>
+              <w:rPr>
+                <w:rFonts w:asciiTheme="majorHAnsi" w:hAnsiTheme="majorHAnsi" w:cstheme="majorHAnsi"/>
+                <w:color w:val="EE0000"/>
+                <w:szCs w:val="22"/>
+              </w:rPr>
+            </w:pPr>
+            <w:r>
+              <w:rPr>
+                <w:rFonts w:asciiTheme="majorHAnsi" w:hAnsiTheme="majorHAnsi" w:cstheme="majorHAnsi"/>
+                <w:color w:val="EE0000"/>
+                <w:szCs w:val="22"/>
+              </w:rPr>
+              <w:t>1003.3414520698971</w:t>
+            </w:r>
+          </w:p>
+        </w:tc>
+        <w:tc>
+          <w:tcPr>
+            <w:tcW w:w="3597" w:type="dxa"/>
+          </w:tcPr>
+          <w:p>
+            <w:pPr>
+              <w:spacing w:beforeAutospacing="1" w:afterAutospacing="1"/>
+              <w:rPr>
+                <w:rFonts w:asciiTheme="majorHAnsi" w:hAnsiTheme="majorHAnsi" w:cstheme="majorHAnsi"/>
+                <w:color w:val="EE0000"/>
+                <w:szCs w:val="22"/>
+              </w:rPr>
+            </w:pPr>
+            <w:r>
+              <w:rPr>
+                <w:rFonts w:asciiTheme="majorHAnsi" w:hAnsiTheme="majorHAnsi" w:cstheme="majorHAnsi"/>
+                <w:color w:val="EE0000"/>
+                <w:szCs w:val="22"/>
+              </w:rPr>
+              <w:t>6.736829322425023e-216</w:t>
+            </w:r>
+          </w:p>
+        </w:tc>
+      </w:tr>
+      <w:tr>
+        <w:tc>
+          <w:tcPr>
+            <w:tcW w:w="3596" w:type="dxa"/>
+          </w:tcPr>
+          <w:p>
+            <w:pPr>
+              <w:spacing w:beforeAutospacing="1" w:afterAutospacing="1"/>
+              <w:rPr>
+                <w:rFonts w:asciiTheme="majorHAnsi" w:hAnsiTheme="majorHAnsi" w:cstheme="majorHAnsi"/>
+                <w:color w:val="EE0000"/>
+                <w:szCs w:val="22"/>
+              </w:rPr>
+            </w:pPr>
+            <w:r>
+              <w:rPr>
+                <w:rFonts w:asciiTheme="majorHAnsi" w:hAnsiTheme="majorHAnsi" w:cstheme="majorHAnsi"/>
+                <w:color w:val="EE0000"/>
+                <w:szCs w:val="22"/>
+              </w:rPr>
+              <w:t>100 10000</w:t>
+            </w:r>
+          </w:p>
+        </w:tc>
+        <w:tc>
+          <w:tcPr>
+            <w:tcW w:w="3597" w:type="dxa"/>
+          </w:tcPr>
+          <w:p>
+            <w:pPr>
+              <w:spacing w:beforeAutospacing="1" w:afterAutospacing="1"/>
+              <w:rPr>
+                <w:rFonts w:asciiTheme="majorHAnsi" w:hAnsiTheme="majorHAnsi" w:cstheme="majorHAnsi"/>
+                <w:color w:val="EE0000"/>
+                <w:szCs w:val="22"/>
+              </w:rPr>
+            </w:pPr>
+            <w:r>
+              <w:rPr>
+                <w:rFonts w:asciiTheme="majorHAnsi" w:hAnsiTheme="majorHAnsi" w:cstheme="majorHAnsi"/>
+                <w:color w:val="EE0000"/>
+                <w:szCs w:val="22"/>
+              </w:rPr>
+              <w:t>229.59344866509133</w:t>
+            </w:r>
+          </w:p>
+        </w:tc>
+        <w:tc>
+          <w:tcPr>
+            <w:tcW w:w="3597" w:type="dxa"/>
+          </w:tcPr>
+          <w:p>
+            <w:pPr>
+              <w:spacing w:beforeAutospacing="1" w:afterAutospacing="1"/>
+              <w:rPr>
+                <w:rFonts w:asciiTheme="majorHAnsi" w:hAnsiTheme="majorHAnsi" w:cstheme="majorHAnsi"/>
+                <w:color w:val="EE0000"/>
+                <w:szCs w:val="22"/>
+              </w:rPr>
+            </w:pPr>
+            <w:r>
+              <w:rPr>
+                <w:rFonts w:asciiTheme="majorHAnsi" w:hAnsiTheme="majorHAnsi" w:cstheme="majorHAnsi"/>
+                <w:color w:val="EE0000"/>
+                <w:szCs w:val="22"/>
+              </w:rPr>
+              <w:t>1.6147762603973358e-48</w:t>
+            </w:r>
+          </w:p>
+        </w:tc>
+      </w:tr>
+      <w:tr>
+        <w:tc>
+          <w:tcPr>
+            <w:tcW w:w="3596" w:type="dxa"/>
+          </w:tcPr>
+          <w:p>
+            <w:pPr>
+              <w:spacing w:beforeAutospacing="1" w:afterAutospacing="1"/>
+              <w:rPr>
+                <w:rFonts w:asciiTheme="majorHAnsi" w:hAnsiTheme="majorHAnsi" w:cstheme="majorHAnsi"/>
+                <w:color w:val="EE0000"/>
+                <w:szCs w:val="22"/>
+              </w:rPr>
+            </w:pPr>
+            <w:r>
+              <w:rPr>
+                <w:rFonts w:asciiTheme="majorHAnsi" w:hAnsiTheme="majorHAnsi" w:cstheme="majorHAnsi"/>
+                <w:color w:val="EE0000"/>
+                <w:szCs w:val="22"/>
+              </w:rPr>
+              <w:t>1000 10000</w:t>
+            </w:r>
+          </w:p>
+        </w:tc>
+        <w:tc>
+          <w:tcPr>
+            <w:tcW w:w="3597" w:type="dxa"/>
+          </w:tcPr>
+          <w:p>
+            <w:pPr>
+              <w:spacing w:beforeAutospacing="1" w:afterAutospacing="1"/>
+              <w:rPr>
+                <w:rFonts w:asciiTheme="majorHAnsi" w:hAnsiTheme="majorHAnsi" w:cstheme="majorHAnsi"/>
+                <w:color w:val="EE0000"/>
+                <w:szCs w:val="22"/>
+              </w:rPr>
+            </w:pPr>
+            <w:r>
+              <w:rPr>
+                <w:rFonts w:asciiTheme="majorHAnsi" w:hAnsiTheme="majorHAnsi" w:cstheme="majorHAnsi"/>
+                <w:color w:val="EE0000"/>
+                <w:szCs w:val="22"/>
+              </w:rPr>
+              <w:t>404.11584099847875</w:t>
+            </w:r>
+          </w:p>
+        </w:tc>
+        <w:tc>
+          <w:tcPr>
+            <w:tcW w:w="3597" w:type="dxa"/>
+          </w:tcPr>
+          <w:p>
+            <w:pPr>
+              <w:spacing w:beforeAutospacing="1" w:afterAutospacing="1"/>
+              <w:rPr>
+                <w:rFonts w:asciiTheme="majorHAnsi" w:hAnsiTheme="majorHAnsi" w:cstheme="majorHAnsi"/>
+                <w:color w:val="EE0000"/>
+                <w:szCs w:val="22"/>
+              </w:rPr>
+            </w:pPr>
+            <w:r>
+              <w:rPr>
+                <w:rFonts w:asciiTheme="majorHAnsi" w:hAnsiTheme="majorHAnsi" w:cstheme="majorHAnsi"/>
+                <w:color w:val="EE0000"/>
+                <w:szCs w:val="22"/>
+              </w:rPr>
+              <w:t>3.5890543632978025e-86</w:t>
+            </w:r>
+          </w:p>
+        </w:tc>
+      </w:tr>
+    </w:tbl>
     <w:p>
       <w:pPr>
         <w:spacing w:beforeAutospacing="1" w:afterAutospacing="1"/>
@@ -1502,50 +2031,6 @@
           <w:szCs w:val="22"/>
         </w:rPr>
       </w:pPr>
-      <w:r>
-        <w:rPr>
-          <w:rFonts w:ascii="Calibri Light" w:hAnsi="Calibri Light" w:cstheme="majorHAnsi"/>
-          <w:color w:val="EE0000"/>
-          <w:szCs w:val="22"/>
-        </w:rPr>
-        <w:t xml:space="preserve">For gene counts 10-10,000 of the most variable genes, the Gaussian mixture model indicated that increasing the number of genes increased the cluster size. A comparison was done for each pair of gene counts. </w:t>
-      </w:r>
-      <w:proofErr w:type="gramStart"/>
-      <w:r>
-        <w:rPr>
-          <w:rFonts w:ascii="Calibri Light" w:hAnsi="Calibri Light" w:cstheme="majorHAnsi"/>
-          <w:color w:val="EE0000"/>
-          <w:szCs w:val="22"/>
-        </w:rPr>
-        <w:t>Most</w:t>
-      </w:r>
-      <w:proofErr w:type="gramEnd"/>
-      <w:r>
-        <w:rPr>
-          <w:rFonts w:ascii="Calibri Light" w:hAnsi="Calibri Light" w:cstheme="majorHAnsi"/>
-          <w:color w:val="EE0000"/>
-          <w:szCs w:val="22"/>
-        </w:rPr>
-        <w:t xml:space="preserve"> comparisons were significant according to the Chi-squared tests p-value. However, 10 to 10,000 genes </w:t>
-      </w:r>
-      <w:proofErr w:type="gramStart"/>
-      <w:r>
-        <w:rPr>
-          <w:rFonts w:ascii="Calibri Light" w:hAnsi="Calibri Light" w:cstheme="majorHAnsi"/>
-          <w:color w:val="EE0000"/>
-          <w:szCs w:val="22"/>
-        </w:rPr>
-        <w:t>was</w:t>
-      </w:r>
-      <w:proofErr w:type="gramEnd"/>
-      <w:r>
-        <w:rPr>
-          <w:rFonts w:ascii="Calibri Light" w:hAnsi="Calibri Light" w:cstheme="majorHAnsi"/>
-          <w:color w:val="EE0000"/>
-          <w:szCs w:val="22"/>
-        </w:rPr>
-        <w:t xml:space="preserve"> not statistically significant, as it only had a p value of 0.381. This means that there is low association between the two clustering results. </w:t>
-      </w:r>
     </w:p>
     <w:p>
       <w:pPr>

</xml_diff>

<commit_message>
Assignment 3: added summary for table
</commit_message>
<xml_diff>
--- a/Assignment-3/CGS4144_Assn3.docx
+++ b/Assignment-3/CGS4144_Assn3.docx
@@ -2031,6 +2031,14 @@
           <w:szCs w:val="22"/>
         </w:rPr>
       </w:pPr>
+      <w:r>
+        <w:rPr>
+          <w:rFonts w:asciiTheme="majorHAnsi" w:hAnsiTheme="majorHAnsi" w:cstheme="majorHAnsi"/>
+          <w:color w:val="EE0000"/>
+          <w:szCs w:val="22"/>
+        </w:rPr>
+        <w:t>This table compares Gaussian mixture clustering results from varying number of genes. The chi squared values were calculated by comparing each pair of gene count to see if there was a high association between the cluster membership. The p-values showed that most of the comparisons were statistically significant as they were under 0.05.</w:t>
+      </w:r>
     </w:p>
     <w:p>
       <w:pPr>

</xml_diff>

<commit_message>
Assignment 3: Forgot to save docx, now its pushed
</commit_message>
<xml_diff>
--- a/Assignment-3/CGS4144_Assn3.docx
+++ b/Assignment-3/CGS4144_Assn3.docx
@@ -1,6 +1,6 @@
 
 <file path=word/document.xml><?xml version="1.0" encoding="utf-8"?>
-<w:document xmlns:wpc="http://schemas.microsoft.com/office/word/2010/wordprocessingCanvas" xmlns:cx="http://schemas.microsoft.com/office/drawing/2014/chartex" xmlns:cx1="http://schemas.microsoft.com/office/drawing/2015/9/8/chartex" xmlns:cx2="http://schemas.microsoft.com/office/drawing/2015/10/21/chartex" xmlns:cx3="http://schemas.microsoft.com/office/drawing/2016/5/9/chartex" xmlns:cx4="http://schemas.microsoft.com/office/drawing/2016/5/10/chartex" xmlns:cx5="http://schemas.microsoft.com/office/drawing/2016/5/11/chartex" xmlns:cx6="http://schemas.microsoft.com/office/drawing/2016/5/12/chartex" xmlns:cx7="http://schemas.microsoft.com/office/drawing/2016/5/13/chartex" xmlns:cx8="http://schemas.microsoft.com/office/drawing/2016/5/14/chartex" xmlns:mc="http://schemas.openxmlformats.org/markup-compatibility/2006" xmlns:aink="http://schemas.microsoft.com/office/drawing/2016/ink" xmlns:am3d="http://schemas.microsoft.com/office/drawing/2017/model3d" xmlns:o="urn:schemas-microsoft-com:office:office" xmlns:oel="http://schemas.microsoft.com/office/2019/extlst" xmlns:r="http://schemas.openxmlformats.org/officeDocument/2006/relationships" xmlns:m="http://schemas.openxmlformats.org/officeDocument/2006/math" xmlns:v="urn:schemas-microsoft-com:vml" xmlns:wp14="http://schemas.microsoft.com/office/word/2010/wordprocessingDrawing" xmlns:wp="http://schemas.openxmlformats.org/drawingml/2006/wordprocessingDrawing" xmlns:w10="urn:schemas-microsoft-com:office:word" xmlns:w="http://schemas.openxmlformats.org/wordprocessingml/2006/main" xmlns:w14="http://schemas.microsoft.com/office/word/2010/wordml" xmlns:w15="http://schemas.microsoft.com/office/word/2012/wordml" xmlns:w16cex="http://schemas.microsoft.com/office/word/2018/wordml/cex" xmlns:w16cid="http://schemas.microsoft.com/office/word/2016/wordml/cid" xmlns:w16="http://schemas.microsoft.com/office/word/2018/wordml" xmlns:w16du="http://schemas.microsoft.com/office/word/2023/wordml/word16du" xmlns:w16sdtdh="http://schemas.microsoft.com/office/word/2020/wordml/sdtdatahash" xmlns:w16sdtfl="http://schemas.microsoft.com/office/word/2024/wordml/sdtformatlock" xmlns:w16se="http://schemas.microsoft.com/office/word/2015/wordml/symex" xmlns:wpg="http://schemas.microsoft.com/office/word/2010/wordprocessingGroup" xmlns:wpi="http://schemas.microsoft.com/office/word/2010/wordprocessingInk" xmlns:wne="http://schemas.microsoft.com/office/word/2006/wordml" xmlns:wps="http://schemas.microsoft.com/office/word/2010/wordprocessingShape" mc:Ignorable="w14 w15 w16se w16cid w16 w16cex w16sdtdh w16sdtfl w16du wp14">
+<w:document xmlns:wpc="http://schemas.microsoft.com/office/word/2010/wordprocessingCanvas" xmlns:cx="http://schemas.microsoft.com/office/drawing/2014/chartex" xmlns:cx1="http://schemas.microsoft.com/office/drawing/2015/9/8/chartex" xmlns:cx2="http://schemas.microsoft.com/office/drawing/2015/10/21/chartex" xmlns:cx3="http://schemas.microsoft.com/office/drawing/2016/5/9/chartex" xmlns:cx4="http://schemas.microsoft.com/office/drawing/2016/5/10/chartex" xmlns:cx5="http://schemas.microsoft.com/office/drawing/2016/5/11/chartex" xmlns:cx6="http://schemas.microsoft.com/office/drawing/2016/5/12/chartex" xmlns:cx7="http://schemas.microsoft.com/office/drawing/2016/5/13/chartex" xmlns:cx8="http://schemas.microsoft.com/office/drawing/2016/5/14/chartex" xmlns:mc="http://schemas.openxmlformats.org/markup-compatibility/2006" xmlns:aink="http://schemas.microsoft.com/office/drawing/2016/ink" xmlns:am3d="http://schemas.microsoft.com/office/drawing/2017/model3d" xmlns:o="urn:schemas-microsoft-com:office:office" xmlns:oel="http://schemas.microsoft.com/office/2019/extlst" xmlns:r="http://schemas.openxmlformats.org/officeDocument/2006/relationships" xmlns:m="http://schemas.openxmlformats.org/officeDocument/2006/math" xmlns:v="urn:schemas-microsoft-com:vml" xmlns:wp14="http://schemas.microsoft.com/office/word/2010/wordprocessingDrawing" xmlns:wp="http://schemas.openxmlformats.org/drawingml/2006/wordprocessingDrawing" xmlns:w10="urn:schemas-microsoft-com:office:word" xmlns:w="http://schemas.openxmlformats.org/wordprocessingml/2006/main" xmlns:w14="http://schemas.microsoft.com/office/word/2010/wordml" xmlns:w15="http://schemas.microsoft.com/office/word/2012/wordml" xmlns:w16cex="http://schemas.microsoft.com/office/word/2018/wordml/cex" xmlns:w16cid="http://schemas.microsoft.com/office/word/2016/wordml/cid" xmlns:w16="http://schemas.microsoft.com/office/word/2018/wordml" xmlns:w16du="http://schemas.microsoft.com/office/word/2023/wordml/word16du" xmlns:w16sdtdh="http://schemas.microsoft.com/office/word/2020/wordml/sdtdatahash" xmlns:w16se="http://schemas.microsoft.com/office/word/2015/wordml/symex" xmlns:wpg="http://schemas.microsoft.com/office/word/2010/wordprocessingGroup" xmlns:wpi="http://schemas.microsoft.com/office/word/2010/wordprocessingInk" xmlns:wne="http://schemas.microsoft.com/office/word/2006/wordml" xmlns:wps="http://schemas.microsoft.com/office/word/2010/wordprocessingShape" mc:Ignorable="w14 w15 w16se w16cid w16 w16cex w16sdtdh w16du wp14">
   <w:body>
     <w:p>
       <w:pPr>
@@ -116,7 +116,7 @@
               </wp:anchor>
             </w:drawing>
           </mc:Choice>
-          <mc:Fallback xmlns:pic="http://schemas.openxmlformats.org/drawingml/2006/picture">
+          <mc:Fallback xmlns:pic="http://schemas.openxmlformats.org/drawingml/2006/picture" xmlns:w16sdtfl="http://schemas.microsoft.com/office/word/2024/wordml/sdtformatlock">
             <w:pict>
               <v:line id="shape_0" from="0pt,-0.05pt" to="542.15pt,-0.05pt" stroked="t" o:allowincell="f" style="position:absolute" wp14:anchorId="3F3D3C7B">
                 <v:stroke color="#bdd7ee" weight="12600" joinstyle="miter" endcap="flat"/>
@@ -268,13 +268,7 @@
               <w:rPr>
                 <w:color w:val="054361"/>
               </w:rPr>
-              <w:t>github.com/</w:t>
-            </w:r>
-            <w:r>
-              <w:rPr>
-                <w:color w:val="054361"/>
-              </w:rPr>
-              <w:t>E53klasky</w:t>
+              <w:t>github.com/E53klasky</w:t>
             </w:r>
           </w:p>
         </w:tc>
@@ -294,8 +288,16 @@
               <w:rPr>
                 <w:color w:val="054361"/>
               </w:rPr>
-              <w:t>Amit Athi Kesavan</w:t>
-            </w:r>
+              <w:t xml:space="preserve">Amit Athi </w:t>
+            </w:r>
+            <w:proofErr w:type="spellStart"/>
+            <w:r>
+              <w:rPr>
+                <w:color w:val="054361"/>
+              </w:rPr>
+              <w:t>Kesavan</w:t>
+            </w:r>
+            <w:proofErr w:type="spellEnd"/>
           </w:p>
         </w:tc>
         <w:tc>
@@ -526,7 +528,7 @@
               </wp:anchor>
             </w:drawing>
           </mc:Choice>
-          <mc:Fallback xmlns:pic="http://schemas.openxmlformats.org/drawingml/2006/picture">
+          <mc:Fallback xmlns:pic="http://schemas.openxmlformats.org/drawingml/2006/picture" xmlns:w16sdtfl="http://schemas.microsoft.com/office/word/2024/wordml/sdtformatlock">
             <w:pict>
               <v:line id="shape_0" from="-0.3pt,14.4pt" to="541.85pt,14.4pt" stroked="t" o:allowincell="f" style="position:absolute" wp14:anchorId="5FC03F4E">
                 <v:stroke color="#bdd7ee" weight="12600" joinstyle="miter" endcap="flat"/>
@@ -583,6 +585,7 @@
         <w:t xml:space="preserve">Unsupervised Analysis (e.g. using </w:t>
       </w:r>
       <w:hyperlink r:id="rId9">
+        <w:proofErr w:type="spellStart"/>
         <w:r>
           <w:rPr>
             <w:rStyle w:val="Hyperlink"/>
@@ -591,6 +594,7 @@
           </w:rPr>
           <w:t>TidyClust</w:t>
         </w:r>
+        <w:proofErr w:type="spellEnd"/>
       </w:hyperlink>
       <w:r>
         <w:rPr>
@@ -810,7 +814,25 @@
           <w:iCs/>
           <w:color w:val="064462"/>
         </w:rPr>
-        <w:t>(e.g. hclust)</w:t>
+        <w:t xml:space="preserve">(e.g. </w:t>
+      </w:r>
+      <w:proofErr w:type="spellStart"/>
+      <w:r>
+        <w:rPr>
+          <w:i/>
+          <w:iCs/>
+          <w:color w:val="064462"/>
+        </w:rPr>
+        <w:t>hclust</w:t>
+      </w:r>
+      <w:proofErr w:type="spellEnd"/>
+      <w:r>
+        <w:rPr>
+          <w:i/>
+          <w:iCs/>
+          <w:color w:val="064462"/>
+        </w:rPr>
+        <w:t>)</w:t>
       </w:r>
       <w:r>
         <w:rPr>
@@ -889,6 +911,7 @@
         </w:rPr>
       </w:pPr>
       <w:hyperlink r:id="rId14">
+        <w:proofErr w:type="spellStart"/>
         <w:r>
           <w:rPr>
             <w:rStyle w:val="Hyperlink"/>
@@ -897,6 +920,7 @@
           </w:rPr>
           <w:t>ConsensusClusterPlus</w:t>
         </w:r>
+        <w:proofErr w:type="spellEnd"/>
       </w:hyperlink>
     </w:p>
     <w:p>
@@ -1127,7 +1151,24 @@
         </w:rPr>
         <w:lastRenderedPageBreak/>
         <w:tab/>
-        <w:t xml:space="preserve">i. </w:t>
+      </w:r>
+      <w:proofErr w:type="spellStart"/>
+      <w:r>
+        <w:rPr>
+          <w:rFonts w:ascii="Calibri Light" w:hAnsi="Calibri Light" w:cstheme="majorHAnsi"/>
+          <w:color w:val="EE0000"/>
+          <w:szCs w:val="22"/>
+        </w:rPr>
+        <w:t>i</w:t>
+      </w:r>
+      <w:proofErr w:type="spellEnd"/>
+      <w:r>
+        <w:rPr>
+          <w:rFonts w:ascii="Calibri Light" w:hAnsi="Calibri Light" w:cstheme="majorHAnsi"/>
+          <w:color w:val="EE0000"/>
+          <w:szCs w:val="22"/>
+        </w:rPr>
+        <w:t xml:space="preserve">. </w:t>
       </w:r>
       <w:r>
         <w:rPr>
@@ -1147,67 +1188,2290 @@
           <w:szCs w:val="22"/>
         </w:rPr>
       </w:pPr>
+      <w:proofErr w:type="spellStart"/>
       <w:r>
         <w:rPr>
           <w:rFonts w:ascii="Calibri Light" w:hAnsi="Calibri Light" w:cstheme="majorHAnsi"/>
           <w:color w:val="EE0000"/>
           <w:szCs w:val="22"/>
         </w:rPr>
-        <w:t>ei. When I changed the number of genes I found that the lower the number of genes the greater accuracy there was in the hierarchical clustering means procedure</w:t>
-      </w:r>
-    </w:p>
-    <w:p>
-      <w:pPr>
-        <w:spacing w:beforeAutospacing="1" w:afterAutospacing="1"/>
+        <w:t>ei</w:t>
+      </w:r>
+      <w:proofErr w:type="spellEnd"/>
+      <w:r>
         <w:rPr>
           <w:rFonts w:ascii="Calibri Light" w:hAnsi="Calibri Light" w:cstheme="majorHAnsi"/>
           <w:color w:val="EE0000"/>
           <w:szCs w:val="22"/>
         </w:rPr>
-      </w:pPr>
-      <w:r>
+        <w:t>. When I changed the number of genes I found that the lower the number of genes the greater accuracy there was in the hierarchical clustering means procedure</w:t>
+      </w:r>
+    </w:p>
+    <w:p>
+      <w:pPr>
+        <w:spacing w:beforeAutospacing="1" w:afterAutospacing="1"/>
         <w:rPr>
           <w:rFonts w:ascii="Calibri Light" w:hAnsi="Calibri Light" w:cstheme="majorHAnsi"/>
           <w:color w:val="EE0000"/>
           <w:szCs w:val="22"/>
         </w:rPr>
-        <w:t>Another method used was the Gaussian Mixture Model in python. After extracting the 5,000 most variable genes and using the GaussianMixture models, 6 cluster sizes were generated and compared. The cluster sizes ranged from 2-7 and of them, cluster 2 had the highest silhouette score of 0.0453. The second highest cluster was cluster 4 which had a score of 0.0199, though all the rother clusters had similar scores. Therefore, increasing the value k for number of clusters didn’t improve the separation of the data, it in fact decreased starting from k=3.</w:t>
-      </w:r>
-    </w:p>
-    <w:p>
-      <w:pPr>
-        <w:spacing w:beforeAutospacing="1" w:afterAutospacing="1"/>
+      </w:pPr>
+      <w:r>
         <w:rPr>
           <w:rFonts w:ascii="Calibri Light" w:hAnsi="Calibri Light" w:cstheme="majorHAnsi"/>
           <w:color w:val="EE0000"/>
           <w:szCs w:val="22"/>
         </w:rPr>
-      </w:pPr>
+        <w:t xml:space="preserve">Another method used was the Gaussian Mixture Model in python. After extracting the 5,000 most variable genes and using the </w:t>
+      </w:r>
+      <w:proofErr w:type="spellStart"/>
       <w:r>
         <w:rPr>
           <w:rFonts w:ascii="Calibri Light" w:hAnsi="Calibri Light" w:cstheme="majorHAnsi"/>
           <w:color w:val="EE0000"/>
           <w:szCs w:val="22"/>
         </w:rPr>
-        <w:t xml:space="preserve">For gene counts 10-10,000 of the most variable genes, the Gaussian mixture model indicated that increasing the number of genes increased the cluster size. A comparison was done for each pair of gene counts. Most comparisons were significant according to the Chi-squared tests p-value. However, 10 to 10,000 genes was not statistically significant, as it only had a p value of 0.381. This means that there is low association between the two clustering results. </w:t>
-      </w:r>
-    </w:p>
-    <w:p>
-      <w:pPr>
-        <w:spacing w:beforeAutospacing="1" w:afterAutospacing="1"/>
+        <w:t>GaussianMixture</w:t>
+      </w:r>
+      <w:proofErr w:type="spellEnd"/>
+      <w:r>
         <w:rPr>
           <w:rFonts w:ascii="Calibri Light" w:hAnsi="Calibri Light" w:cstheme="majorHAnsi"/>
           <w:color w:val="EE0000"/>
           <w:szCs w:val="22"/>
         </w:rPr>
-      </w:pPr>
-      <w:r>
+        <w:t xml:space="preserve"> models, 6 cluster sizes were generated and compared. The cluster sizes ranged from 2-7 and of them, cluster 2 had the highest silhouette score of 0.0453. The second highest cluster was cluster 4 which had a score of 0.0199, though all the rother clusters had similar scores. Therefore, increasing the value k for number of clusters didn’t improve the separation of the data, it in fact decreased starting from k=3.</w:t>
+      </w:r>
+    </w:p>
+    <w:p>
+      <w:pPr>
+        <w:spacing w:beforeAutospacing="1" w:afterAutospacing="1"/>
         <w:rPr>
           <w:rFonts w:ascii="Calibri Light" w:hAnsi="Calibri Light" w:cstheme="majorHAnsi"/>
           <w:color w:val="EE0000"/>
           <w:szCs w:val="22"/>
         </w:rPr>
+      </w:pPr>
+      <w:r>
+        <w:rPr>
+          <w:rFonts w:ascii="Calibri Light" w:hAnsi="Calibri Light" w:cstheme="majorHAnsi"/>
+          <w:color w:val="EE0000"/>
+          <w:szCs w:val="22"/>
+        </w:rPr>
+        <w:t xml:space="preserve">For gene counts 10-10,000 of the most variable genes, the Gaussian mixture model indicated that increasing the number of genes increased the cluster size. A comparison was done for each pair of gene counts. Most comparisons were significant according to the Chi-squared tests p-value. However, 10 to 10,000 genes </w:t>
+      </w:r>
+      <w:proofErr w:type="gramStart"/>
+      <w:r>
+        <w:rPr>
+          <w:rFonts w:ascii="Calibri Light" w:hAnsi="Calibri Light" w:cstheme="majorHAnsi"/>
+          <w:color w:val="EE0000"/>
+          <w:szCs w:val="22"/>
+        </w:rPr>
+        <w:t>was</w:t>
+      </w:r>
+      <w:proofErr w:type="gramEnd"/>
+      <w:r>
+        <w:rPr>
+          <w:rFonts w:ascii="Calibri Light" w:hAnsi="Calibri Light" w:cstheme="majorHAnsi"/>
+          <w:color w:val="EE0000"/>
+          <w:szCs w:val="22"/>
+        </w:rPr>
+        <w:t xml:space="preserve"> not statistically significant, as it only had a p value of 0.381. This means that there is low association between the two clustering results. </w:t>
+      </w:r>
+    </w:p>
+    <w:p>
+      <w:pPr>
+        <w:spacing w:beforeAutospacing="1" w:afterAutospacing="1"/>
+        <w:rPr>
+          <w:rFonts w:ascii="Calibri Light" w:hAnsi="Calibri Light" w:cstheme="majorHAnsi"/>
+          <w:color w:val="EE0000"/>
+          <w:szCs w:val="22"/>
+        </w:rPr>
+      </w:pPr>
+      <w:r>
+        <w:rPr>
+          <w:rFonts w:ascii="Calibri Light" w:hAnsi="Calibri Light" w:cstheme="majorHAnsi"/>
+          <w:color w:val="EE0000"/>
+          <w:szCs w:val="22"/>
+        </w:rPr>
         <w:t>ii.</w:t>
+      </w:r>
+    </w:p>
+    <w:tbl>
+      <w:tblPr>
+        <w:tblStyle w:val="TableGrid"/>
+        <w:tblW w:w="0" w:type="auto"/>
+        <w:tblLook w:val="04A0" w:firstRow="1" w:lastRow="0" w:firstColumn="1" w:lastColumn="0" w:noHBand="0" w:noVBand="1"/>
+      </w:tblPr>
+      <w:tblGrid>
+        <w:gridCol w:w="1095"/>
+        <w:gridCol w:w="2389"/>
+        <w:gridCol w:w="1400"/>
+        <w:gridCol w:w="1398"/>
+        <w:gridCol w:w="2166"/>
+        <w:gridCol w:w="2342"/>
+      </w:tblGrid>
+      <w:tr>
+        <w:tc>
+          <w:tcPr>
+            <w:tcW w:w="1798" w:type="dxa"/>
+          </w:tcPr>
+          <w:p>
+            <w:pPr>
+              <w:spacing w:beforeAutospacing="1" w:afterAutospacing="1"/>
+              <w:rPr>
+                <w:rFonts w:ascii="Calibri Light" w:hAnsi="Calibri Light" w:cstheme="majorHAnsi"/>
+                <w:color w:val="EE0000"/>
+                <w:szCs w:val="22"/>
+              </w:rPr>
+            </w:pPr>
+            <w:r>
+              <w:rPr>
+                <w:rFonts w:ascii="Calibri Light" w:hAnsi="Calibri Light" w:cstheme="majorHAnsi"/>
+                <w:color w:val="EE0000"/>
+                <w:szCs w:val="22"/>
+              </w:rPr>
+              <w:t>K</w:t>
+            </w:r>
+          </w:p>
+        </w:tc>
+        <w:tc>
+          <w:tcPr>
+            <w:tcW w:w="1798" w:type="dxa"/>
+          </w:tcPr>
+          <w:p>
+            <w:pPr>
+              <w:spacing w:beforeAutospacing="1" w:afterAutospacing="1"/>
+              <w:rPr>
+                <w:rFonts w:ascii="Calibri Light" w:hAnsi="Calibri Light" w:cstheme="majorHAnsi"/>
+                <w:color w:val="EE0000"/>
+                <w:szCs w:val="22"/>
+              </w:rPr>
+            </w:pPr>
+            <w:r>
+              <w:rPr>
+                <w:rFonts w:ascii="Calibri Light" w:hAnsi="Calibri Light" w:cstheme="majorHAnsi"/>
+                <w:color w:val="EE0000"/>
+                <w:szCs w:val="22"/>
+              </w:rPr>
+              <w:t>Silhouette Score</w:t>
+            </w:r>
+          </w:p>
+        </w:tc>
+        <w:tc>
+          <w:tcPr>
+            <w:tcW w:w="1798" w:type="dxa"/>
+          </w:tcPr>
+          <w:p>
+            <w:pPr>
+              <w:spacing w:beforeAutospacing="1" w:afterAutospacing="1"/>
+              <w:rPr>
+                <w:rFonts w:ascii="Calibri Light" w:hAnsi="Calibri Light" w:cstheme="majorHAnsi"/>
+                <w:color w:val="EE0000"/>
+                <w:szCs w:val="22"/>
+              </w:rPr>
+            </w:pPr>
+            <w:r>
+              <w:rPr>
+                <w:rFonts w:ascii="Calibri Light" w:hAnsi="Calibri Light" w:cstheme="majorHAnsi"/>
+                <w:color w:val="EE0000"/>
+                <w:szCs w:val="22"/>
+              </w:rPr>
+              <w:t>Num in Clusters</w:t>
+            </w:r>
+          </w:p>
+          <w:p>
+            <w:pPr>
+              <w:spacing w:beforeAutospacing="1" w:afterAutospacing="1"/>
+              <w:rPr>
+                <w:rFonts w:ascii="Calibri Light" w:hAnsi="Calibri Light" w:cstheme="majorHAnsi"/>
+                <w:color w:val="EE0000"/>
+                <w:szCs w:val="22"/>
+              </w:rPr>
+            </w:pPr>
+            <w:r>
+              <w:rPr>
+                <w:rFonts w:ascii="Calibri Light" w:hAnsi="Calibri Light" w:cstheme="majorHAnsi"/>
+                <w:color w:val="EE0000"/>
+                <w:szCs w:val="22"/>
+              </w:rPr>
+              <w:t>[cluster #, num in clusters]</w:t>
+            </w:r>
+          </w:p>
+        </w:tc>
+        <w:tc>
+          <w:tcPr>
+            <w:tcW w:w="1798" w:type="dxa"/>
+          </w:tcPr>
+          <w:p>
+            <w:pPr>
+              <w:spacing w:beforeAutospacing="1" w:afterAutospacing="1"/>
+              <w:rPr>
+                <w:rFonts w:ascii="Calibri Light" w:hAnsi="Calibri Light" w:cstheme="majorHAnsi"/>
+                <w:color w:val="EE0000"/>
+                <w:szCs w:val="22"/>
+              </w:rPr>
+            </w:pPr>
+            <w:r>
+              <w:rPr>
+                <w:rFonts w:ascii="Calibri Light" w:hAnsi="Calibri Light" w:cstheme="majorHAnsi"/>
+                <w:color w:val="EE0000"/>
+                <w:szCs w:val="22"/>
+              </w:rPr>
+              <w:t>TB vs Healthy Chi-Squared Tests</w:t>
+            </w:r>
+          </w:p>
+          <w:p>
+            <w:pPr>
+              <w:spacing w:beforeAutospacing="1" w:afterAutospacing="1"/>
+              <w:rPr>
+                <w:rFonts w:ascii="Calibri Light" w:hAnsi="Calibri Light" w:cstheme="majorHAnsi"/>
+                <w:color w:val="EE0000"/>
+                <w:szCs w:val="22"/>
+              </w:rPr>
+            </w:pPr>
+            <w:r>
+              <w:rPr>
+                <w:rFonts w:ascii="Calibri Light" w:hAnsi="Calibri Light" w:cstheme="majorHAnsi"/>
+                <w:color w:val="EE0000"/>
+                <w:szCs w:val="22"/>
+              </w:rPr>
+              <w:t>[TB, Healthy]</w:t>
+            </w:r>
+          </w:p>
+          <w:p>
+            <w:pPr>
+              <w:spacing w:beforeAutospacing="1" w:afterAutospacing="1"/>
+              <w:rPr>
+                <w:rFonts w:ascii="Calibri Light" w:hAnsi="Calibri Light" w:cstheme="majorHAnsi"/>
+                <w:color w:val="EE0000"/>
+                <w:szCs w:val="22"/>
+              </w:rPr>
+            </w:pPr>
+            <w:r>
+              <w:rPr>
+                <w:rFonts w:ascii="Calibri Light" w:hAnsi="Calibri Light" w:cstheme="majorHAnsi"/>
+                <w:color w:val="EE0000"/>
+                <w:szCs w:val="22"/>
+              </w:rPr>
+              <w:t>Each row is new cluster</w:t>
+            </w:r>
+          </w:p>
+        </w:tc>
+        <w:tc>
+          <w:tcPr>
+            <w:tcW w:w="1799" w:type="dxa"/>
+          </w:tcPr>
+          <w:p>
+            <w:pPr>
+              <w:spacing w:beforeAutospacing="1" w:afterAutospacing="1"/>
+              <w:rPr>
+                <w:rFonts w:ascii="Calibri Light" w:hAnsi="Calibri Light" w:cstheme="majorHAnsi"/>
+                <w:color w:val="EE0000"/>
+                <w:szCs w:val="22"/>
+              </w:rPr>
+            </w:pPr>
+            <w:r>
+              <w:rPr>
+                <w:rFonts w:ascii="Calibri Light" w:hAnsi="Calibri Light" w:cstheme="majorHAnsi"/>
+                <w:color w:val="EE0000"/>
+                <w:szCs w:val="22"/>
+              </w:rPr>
+              <w:t>Chi-Squared Value</w:t>
+            </w:r>
+          </w:p>
+        </w:tc>
+        <w:tc>
+          <w:tcPr>
+            <w:tcW w:w="1799" w:type="dxa"/>
+          </w:tcPr>
+          <w:p>
+            <w:pPr>
+              <w:spacing w:beforeAutospacing="1" w:afterAutospacing="1"/>
+              <w:rPr>
+                <w:rFonts w:ascii="Calibri Light" w:hAnsi="Calibri Light" w:cstheme="majorHAnsi"/>
+                <w:color w:val="EE0000"/>
+                <w:szCs w:val="22"/>
+              </w:rPr>
+            </w:pPr>
+            <w:r>
+              <w:rPr>
+                <w:rFonts w:ascii="Calibri Light" w:hAnsi="Calibri Light" w:cstheme="majorHAnsi"/>
+                <w:color w:val="EE0000"/>
+                <w:szCs w:val="22"/>
+              </w:rPr>
+              <w:t>P-Value</w:t>
+            </w:r>
+          </w:p>
+        </w:tc>
+      </w:tr>
+      <w:tr>
+        <w:tc>
+          <w:tcPr>
+            <w:tcW w:w="1798" w:type="dxa"/>
+          </w:tcPr>
+          <w:p>
+            <w:pPr>
+              <w:spacing w:beforeAutospacing="1" w:afterAutospacing="1"/>
+              <w:rPr>
+                <w:rFonts w:ascii="Calibri Light" w:hAnsi="Calibri Light" w:cstheme="majorHAnsi"/>
+                <w:color w:val="EE0000"/>
+                <w:szCs w:val="22"/>
+              </w:rPr>
+            </w:pPr>
+            <w:r>
+              <w:rPr>
+                <w:rFonts w:ascii="Calibri Light" w:hAnsi="Calibri Light" w:cstheme="majorHAnsi"/>
+                <w:color w:val="EE0000"/>
+                <w:szCs w:val="22"/>
+              </w:rPr>
+              <w:t>2</w:t>
+            </w:r>
+          </w:p>
+        </w:tc>
+        <w:tc>
+          <w:tcPr>
+            <w:tcW w:w="1798" w:type="dxa"/>
+          </w:tcPr>
+          <w:p>
+            <w:pPr>
+              <w:spacing w:beforeAutospacing="1" w:afterAutospacing="1"/>
+              <w:rPr>
+                <w:rFonts w:ascii="Calibri Light" w:hAnsi="Calibri Light" w:cstheme="majorHAnsi"/>
+                <w:color w:val="EE0000"/>
+                <w:szCs w:val="22"/>
+              </w:rPr>
+            </w:pPr>
+            <w:r>
+              <w:rPr>
+                <w:rFonts w:ascii="Calibri Light" w:hAnsi="Calibri Light" w:cstheme="majorHAnsi"/>
+                <w:color w:val="EE0000"/>
+                <w:szCs w:val="22"/>
+              </w:rPr>
+              <w:t>0.04527346490545073</w:t>
+            </w:r>
+          </w:p>
+        </w:tc>
+        <w:tc>
+          <w:tcPr>
+            <w:tcW w:w="1798" w:type="dxa"/>
+          </w:tcPr>
+          <w:p>
+            <w:pPr>
+              <w:spacing w:beforeAutospacing="1" w:afterAutospacing="1"/>
+              <w:rPr>
+                <w:rFonts w:ascii="Calibri Light" w:hAnsi="Calibri Light" w:cstheme="majorHAnsi"/>
+                <w:color w:val="EE0000"/>
+                <w:szCs w:val="22"/>
+              </w:rPr>
+            </w:pPr>
+            <w:r>
+              <w:rPr>
+                <w:rFonts w:ascii="Calibri Light" w:hAnsi="Calibri Light" w:cstheme="majorHAnsi"/>
+                <w:color w:val="EE0000"/>
+                <w:szCs w:val="22"/>
+              </w:rPr>
+              <w:t>0    387</w:t>
+            </w:r>
+          </w:p>
+          <w:p>
+            <w:pPr>
+              <w:spacing w:beforeAutospacing="1" w:afterAutospacing="1"/>
+              <w:rPr>
+                <w:rFonts w:ascii="Calibri Light" w:hAnsi="Calibri Light" w:cstheme="majorHAnsi"/>
+                <w:color w:val="EE0000"/>
+                <w:szCs w:val="22"/>
+              </w:rPr>
+            </w:pPr>
+            <w:r>
+              <w:rPr>
+                <w:rFonts w:ascii="Calibri Light" w:hAnsi="Calibri Light" w:cstheme="majorHAnsi"/>
+                <w:color w:val="EE0000"/>
+                <w:szCs w:val="22"/>
+              </w:rPr>
+              <w:t>1    432</w:t>
+            </w:r>
+          </w:p>
+          <w:p>
+            <w:pPr>
+              <w:spacing w:beforeAutospacing="1" w:afterAutospacing="1"/>
+              <w:rPr>
+                <w:rFonts w:ascii="Calibri Light" w:hAnsi="Calibri Light" w:cstheme="majorHAnsi"/>
+                <w:color w:val="EE0000"/>
+                <w:szCs w:val="22"/>
+              </w:rPr>
+            </w:pPr>
+          </w:p>
+        </w:tc>
+        <w:tc>
+          <w:tcPr>
+            <w:tcW w:w="1798" w:type="dxa"/>
+          </w:tcPr>
+          <w:p>
+            <w:pPr>
+              <w:spacing w:beforeAutospacing="1" w:afterAutospacing="1"/>
+              <w:rPr>
+                <w:rFonts w:ascii="Calibri Light" w:hAnsi="Calibri Light" w:cstheme="majorHAnsi"/>
+                <w:color w:val="EE0000"/>
+                <w:szCs w:val="22"/>
+              </w:rPr>
+            </w:pPr>
+            <w:r>
+              <w:rPr>
+                <w:rFonts w:ascii="Calibri Light" w:hAnsi="Calibri Light" w:cstheme="majorHAnsi"/>
+                <w:color w:val="EE0000"/>
+                <w:szCs w:val="22"/>
+              </w:rPr>
+              <w:t>[[ 12 375]</w:t>
+            </w:r>
+          </w:p>
+          <w:p>
+            <w:pPr>
+              <w:spacing w:beforeAutospacing="1" w:afterAutospacing="1"/>
+              <w:rPr>
+                <w:rFonts w:ascii="Calibri Light" w:hAnsi="Calibri Light" w:cstheme="majorHAnsi"/>
+                <w:color w:val="EE0000"/>
+                <w:szCs w:val="22"/>
+              </w:rPr>
+            </w:pPr>
+            <w:r>
+              <w:rPr>
+                <w:rFonts w:ascii="Calibri Light" w:hAnsi="Calibri Light" w:cstheme="majorHAnsi"/>
+                <w:color w:val="EE0000"/>
+                <w:szCs w:val="22"/>
+              </w:rPr>
+              <w:t xml:space="preserve"> [ 66 366]]</w:t>
+            </w:r>
+          </w:p>
+          <w:p>
+            <w:pPr>
+              <w:spacing w:beforeAutospacing="1" w:afterAutospacing="1"/>
+              <w:rPr>
+                <w:rFonts w:ascii="Calibri Light" w:hAnsi="Calibri Light" w:cstheme="majorHAnsi"/>
+                <w:color w:val="EE0000"/>
+                <w:szCs w:val="22"/>
+              </w:rPr>
+            </w:pPr>
+          </w:p>
+        </w:tc>
+        <w:tc>
+          <w:tcPr>
+            <w:tcW w:w="1799" w:type="dxa"/>
+          </w:tcPr>
+          <w:p>
+            <w:pPr>
+              <w:spacing w:beforeAutospacing="1" w:afterAutospacing="1"/>
+              <w:rPr>
+                <w:rFonts w:ascii="Calibri Light" w:hAnsi="Calibri Light" w:cstheme="majorHAnsi"/>
+                <w:color w:val="EE0000"/>
+                <w:szCs w:val="22"/>
+              </w:rPr>
+            </w:pPr>
+            <w:r>
+              <w:rPr>
+                <w:rFonts w:ascii="Calibri Light" w:hAnsi="Calibri Light" w:cstheme="majorHAnsi"/>
+                <w:color w:val="EE0000"/>
+                <w:szCs w:val="22"/>
+              </w:rPr>
+              <w:t>33.72848773459811</w:t>
+            </w:r>
+          </w:p>
+        </w:tc>
+        <w:tc>
+          <w:tcPr>
+            <w:tcW w:w="1799" w:type="dxa"/>
+          </w:tcPr>
+          <w:p>
+            <w:pPr>
+              <w:spacing w:beforeAutospacing="1" w:afterAutospacing="1"/>
+              <w:rPr>
+                <w:rFonts w:ascii="Calibri Light" w:hAnsi="Calibri Light" w:cstheme="majorHAnsi"/>
+                <w:color w:val="EE0000"/>
+                <w:szCs w:val="22"/>
+              </w:rPr>
+            </w:pPr>
+            <w:r>
+              <w:rPr>
+                <w:rFonts w:ascii="Calibri Light" w:hAnsi="Calibri Light" w:cstheme="majorHAnsi"/>
+                <w:color w:val="EE0000"/>
+                <w:szCs w:val="22"/>
+              </w:rPr>
+              <w:t>6.336590620343957e-09</w:t>
+            </w:r>
+          </w:p>
+        </w:tc>
+      </w:tr>
+      <w:tr>
+        <w:tc>
+          <w:tcPr>
+            <w:tcW w:w="1798" w:type="dxa"/>
+          </w:tcPr>
+          <w:p>
+            <w:pPr>
+              <w:spacing w:beforeAutospacing="1" w:afterAutospacing="1"/>
+              <w:rPr>
+                <w:rFonts w:ascii="Calibri Light" w:hAnsi="Calibri Light" w:cstheme="majorHAnsi"/>
+                <w:color w:val="EE0000"/>
+                <w:szCs w:val="22"/>
+              </w:rPr>
+            </w:pPr>
+            <w:r>
+              <w:rPr>
+                <w:rFonts w:ascii="Calibri Light" w:hAnsi="Calibri Light" w:cstheme="majorHAnsi"/>
+                <w:color w:val="EE0000"/>
+                <w:szCs w:val="22"/>
+              </w:rPr>
+              <w:t>3</w:t>
+            </w:r>
+          </w:p>
+        </w:tc>
+        <w:tc>
+          <w:tcPr>
+            <w:tcW w:w="1798" w:type="dxa"/>
+          </w:tcPr>
+          <w:p>
+            <w:pPr>
+              <w:spacing w:beforeAutospacing="1" w:afterAutospacing="1"/>
+              <w:rPr>
+                <w:rFonts w:ascii="Calibri Light" w:hAnsi="Calibri Light" w:cstheme="majorHAnsi"/>
+                <w:color w:val="EE0000"/>
+                <w:szCs w:val="22"/>
+              </w:rPr>
+            </w:pPr>
+            <w:r>
+              <w:rPr>
+                <w:rFonts w:ascii="Calibri Light" w:hAnsi="Calibri Light" w:cstheme="majorHAnsi"/>
+                <w:color w:val="EE0000"/>
+                <w:szCs w:val="22"/>
+              </w:rPr>
+              <w:t>0.017610272515408656</w:t>
+            </w:r>
+          </w:p>
+        </w:tc>
+        <w:tc>
+          <w:tcPr>
+            <w:tcW w:w="1798" w:type="dxa"/>
+          </w:tcPr>
+          <w:p>
+            <w:pPr>
+              <w:spacing w:beforeAutospacing="1" w:afterAutospacing="1"/>
+              <w:rPr>
+                <w:rFonts w:ascii="Calibri Light" w:hAnsi="Calibri Light" w:cstheme="majorHAnsi"/>
+                <w:color w:val="EE0000"/>
+                <w:szCs w:val="22"/>
+              </w:rPr>
+            </w:pPr>
+            <w:r>
+              <w:rPr>
+                <w:rFonts w:ascii="Calibri Light" w:hAnsi="Calibri Light" w:cstheme="majorHAnsi"/>
+                <w:color w:val="EE0000"/>
+                <w:szCs w:val="22"/>
+              </w:rPr>
+              <w:t>0    325</w:t>
+            </w:r>
+          </w:p>
+          <w:p>
+            <w:pPr>
+              <w:spacing w:beforeAutospacing="1" w:afterAutospacing="1"/>
+              <w:rPr>
+                <w:rFonts w:ascii="Calibri Light" w:hAnsi="Calibri Light" w:cstheme="majorHAnsi"/>
+                <w:color w:val="EE0000"/>
+                <w:szCs w:val="22"/>
+              </w:rPr>
+            </w:pPr>
+            <w:r>
+              <w:rPr>
+                <w:rFonts w:ascii="Calibri Light" w:hAnsi="Calibri Light" w:cstheme="majorHAnsi"/>
+                <w:color w:val="EE0000"/>
+                <w:szCs w:val="22"/>
+              </w:rPr>
+              <w:t>1    286</w:t>
+            </w:r>
+          </w:p>
+          <w:p>
+            <w:pPr>
+              <w:spacing w:beforeAutospacing="1" w:afterAutospacing="1"/>
+              <w:rPr>
+                <w:rFonts w:ascii="Calibri Light" w:hAnsi="Calibri Light" w:cstheme="majorHAnsi"/>
+                <w:color w:val="EE0000"/>
+                <w:szCs w:val="22"/>
+              </w:rPr>
+            </w:pPr>
+            <w:r>
+              <w:rPr>
+                <w:rFonts w:ascii="Calibri Light" w:hAnsi="Calibri Light" w:cstheme="majorHAnsi"/>
+                <w:color w:val="EE0000"/>
+                <w:szCs w:val="22"/>
+              </w:rPr>
+              <w:t>2    208</w:t>
+            </w:r>
+          </w:p>
+          <w:p>
+            <w:pPr>
+              <w:spacing w:beforeAutospacing="1" w:afterAutospacing="1"/>
+              <w:rPr>
+                <w:rFonts w:ascii="Calibri Light" w:hAnsi="Calibri Light" w:cstheme="majorHAnsi"/>
+                <w:color w:val="EE0000"/>
+                <w:szCs w:val="22"/>
+              </w:rPr>
+            </w:pPr>
+          </w:p>
+        </w:tc>
+        <w:tc>
+          <w:tcPr>
+            <w:tcW w:w="1798" w:type="dxa"/>
+          </w:tcPr>
+          <w:p>
+            <w:pPr>
+              <w:spacing w:beforeAutospacing="1" w:afterAutospacing="1"/>
+              <w:rPr>
+                <w:rFonts w:ascii="Calibri Light" w:hAnsi="Calibri Light" w:cstheme="majorHAnsi"/>
+                <w:color w:val="EE0000"/>
+                <w:szCs w:val="22"/>
+              </w:rPr>
+            </w:pPr>
+            <w:r>
+              <w:rPr>
+                <w:rFonts w:ascii="Calibri Light" w:hAnsi="Calibri Light" w:cstheme="majorHAnsi"/>
+                <w:color w:val="EE0000"/>
+                <w:szCs w:val="22"/>
+              </w:rPr>
+              <w:t>[</w:t>
+            </w:r>
+            <w:proofErr w:type="gramStart"/>
+            <w:r>
+              <w:rPr>
+                <w:rFonts w:ascii="Calibri Light" w:hAnsi="Calibri Light" w:cstheme="majorHAnsi"/>
+                <w:color w:val="EE0000"/>
+                <w:szCs w:val="22"/>
+              </w:rPr>
+              <w:t>[  8</w:t>
+            </w:r>
+            <w:proofErr w:type="gramEnd"/>
+            <w:r>
+              <w:rPr>
+                <w:rFonts w:ascii="Calibri Light" w:hAnsi="Calibri Light" w:cstheme="majorHAnsi"/>
+                <w:color w:val="EE0000"/>
+                <w:szCs w:val="22"/>
+              </w:rPr>
+              <w:t xml:space="preserve"> 317]</w:t>
+            </w:r>
+          </w:p>
+          <w:p>
+            <w:pPr>
+              <w:spacing w:beforeAutospacing="1" w:afterAutospacing="1"/>
+              <w:rPr>
+                <w:rFonts w:ascii="Calibri Light" w:hAnsi="Calibri Light" w:cstheme="majorHAnsi"/>
+                <w:color w:val="EE0000"/>
+                <w:szCs w:val="22"/>
+              </w:rPr>
+            </w:pPr>
+            <w:r>
+              <w:rPr>
+                <w:rFonts w:ascii="Calibri Light" w:hAnsi="Calibri Light" w:cstheme="majorHAnsi"/>
+                <w:color w:val="EE0000"/>
+                <w:szCs w:val="22"/>
+              </w:rPr>
+              <w:t xml:space="preserve"> [ 47 239]</w:t>
+            </w:r>
+          </w:p>
+          <w:p>
+            <w:pPr>
+              <w:spacing w:beforeAutospacing="1" w:afterAutospacing="1"/>
+              <w:rPr>
+                <w:rFonts w:ascii="Calibri Light" w:hAnsi="Calibri Light" w:cstheme="majorHAnsi"/>
+                <w:color w:val="EE0000"/>
+                <w:szCs w:val="22"/>
+              </w:rPr>
+            </w:pPr>
+            <w:r>
+              <w:rPr>
+                <w:rFonts w:ascii="Calibri Light" w:hAnsi="Calibri Light" w:cstheme="majorHAnsi"/>
+                <w:color w:val="EE0000"/>
+                <w:szCs w:val="22"/>
+              </w:rPr>
+              <w:t xml:space="preserve"> [ 23 185]]</w:t>
+            </w:r>
+          </w:p>
+          <w:p>
+            <w:pPr>
+              <w:spacing w:beforeAutospacing="1" w:afterAutospacing="1"/>
+              <w:rPr>
+                <w:rFonts w:ascii="Calibri Light" w:hAnsi="Calibri Light" w:cstheme="majorHAnsi"/>
+                <w:color w:val="EE0000"/>
+                <w:szCs w:val="22"/>
+              </w:rPr>
+            </w:pPr>
+          </w:p>
+        </w:tc>
+        <w:tc>
+          <w:tcPr>
+            <w:tcW w:w="1799" w:type="dxa"/>
+          </w:tcPr>
+          <w:p>
+            <w:pPr>
+              <w:spacing w:beforeAutospacing="1" w:afterAutospacing="1"/>
+              <w:rPr>
+                <w:rFonts w:ascii="Calibri Light" w:hAnsi="Calibri Light" w:cstheme="majorHAnsi"/>
+                <w:color w:val="EE0000"/>
+                <w:szCs w:val="22"/>
+              </w:rPr>
+            </w:pPr>
+            <w:r>
+              <w:rPr>
+                <w:rFonts w:ascii="Calibri Light" w:hAnsi="Calibri Light" w:cstheme="majorHAnsi"/>
+                <w:color w:val="EE0000"/>
+                <w:szCs w:val="22"/>
+              </w:rPr>
+              <w:t>35.22658216783217</w:t>
+            </w:r>
+          </w:p>
+        </w:tc>
+        <w:tc>
+          <w:tcPr>
+            <w:tcW w:w="1799" w:type="dxa"/>
+          </w:tcPr>
+          <w:p>
+            <w:pPr>
+              <w:spacing w:beforeAutospacing="1" w:afterAutospacing="1"/>
+              <w:rPr>
+                <w:rFonts w:ascii="Calibri Light" w:hAnsi="Calibri Light" w:cstheme="majorHAnsi"/>
+                <w:color w:val="EE0000"/>
+                <w:szCs w:val="22"/>
+              </w:rPr>
+            </w:pPr>
+            <w:r>
+              <w:rPr>
+                <w:rFonts w:ascii="Calibri Light" w:hAnsi="Calibri Light" w:cstheme="majorHAnsi"/>
+                <w:color w:val="EE0000"/>
+                <w:szCs w:val="22"/>
+              </w:rPr>
+              <w:t>2.2420478344463936e-08</w:t>
+            </w:r>
+          </w:p>
+        </w:tc>
+      </w:tr>
+      <w:tr>
+        <w:tc>
+          <w:tcPr>
+            <w:tcW w:w="1798" w:type="dxa"/>
+          </w:tcPr>
+          <w:p>
+            <w:pPr>
+              <w:spacing w:beforeAutospacing="1" w:afterAutospacing="1"/>
+              <w:rPr>
+                <w:rFonts w:ascii="Calibri Light" w:hAnsi="Calibri Light" w:cstheme="majorHAnsi"/>
+                <w:color w:val="EE0000"/>
+                <w:szCs w:val="22"/>
+              </w:rPr>
+            </w:pPr>
+            <w:r>
+              <w:rPr>
+                <w:rFonts w:ascii="Calibri Light" w:hAnsi="Calibri Light" w:cstheme="majorHAnsi"/>
+                <w:color w:val="EE0000"/>
+                <w:szCs w:val="22"/>
+              </w:rPr>
+              <w:t>4</w:t>
+            </w:r>
+          </w:p>
+        </w:tc>
+        <w:tc>
+          <w:tcPr>
+            <w:tcW w:w="1798" w:type="dxa"/>
+          </w:tcPr>
+          <w:p>
+            <w:pPr>
+              <w:spacing w:beforeAutospacing="1" w:afterAutospacing="1"/>
+              <w:rPr>
+                <w:rFonts w:ascii="Calibri Light" w:hAnsi="Calibri Light" w:cstheme="majorHAnsi"/>
+                <w:color w:val="EE0000"/>
+                <w:szCs w:val="22"/>
+              </w:rPr>
+            </w:pPr>
+            <w:r>
+              <w:rPr>
+                <w:rFonts w:ascii="Calibri Light" w:hAnsi="Calibri Light" w:cstheme="majorHAnsi"/>
+                <w:color w:val="EE0000"/>
+                <w:szCs w:val="22"/>
+              </w:rPr>
+              <w:t>0.019937017197397745</w:t>
+            </w:r>
+          </w:p>
+        </w:tc>
+        <w:tc>
+          <w:tcPr>
+            <w:tcW w:w="1798" w:type="dxa"/>
+          </w:tcPr>
+          <w:p>
+            <w:pPr>
+              <w:spacing w:beforeAutospacing="1" w:afterAutospacing="1"/>
+              <w:rPr>
+                <w:rFonts w:ascii="Calibri Light" w:hAnsi="Calibri Light" w:cstheme="majorHAnsi"/>
+                <w:color w:val="EE0000"/>
+                <w:szCs w:val="22"/>
+              </w:rPr>
+            </w:pPr>
+            <w:r>
+              <w:rPr>
+                <w:rFonts w:ascii="Calibri Light" w:hAnsi="Calibri Light" w:cstheme="majorHAnsi"/>
+                <w:color w:val="EE0000"/>
+                <w:szCs w:val="22"/>
+              </w:rPr>
+              <w:t>0    265</w:t>
+            </w:r>
+          </w:p>
+          <w:p>
+            <w:pPr>
+              <w:spacing w:beforeAutospacing="1" w:afterAutospacing="1"/>
+              <w:rPr>
+                <w:rFonts w:ascii="Calibri Light" w:hAnsi="Calibri Light" w:cstheme="majorHAnsi"/>
+                <w:color w:val="EE0000"/>
+                <w:szCs w:val="22"/>
+              </w:rPr>
+            </w:pPr>
+            <w:r>
+              <w:rPr>
+                <w:rFonts w:ascii="Calibri Light" w:hAnsi="Calibri Light" w:cstheme="majorHAnsi"/>
+                <w:color w:val="EE0000"/>
+                <w:szCs w:val="22"/>
+              </w:rPr>
+              <w:t>1    182</w:t>
+            </w:r>
+          </w:p>
+          <w:p>
+            <w:pPr>
+              <w:spacing w:beforeAutospacing="1" w:afterAutospacing="1"/>
+              <w:rPr>
+                <w:rFonts w:ascii="Calibri Light" w:hAnsi="Calibri Light" w:cstheme="majorHAnsi"/>
+                <w:color w:val="EE0000"/>
+                <w:szCs w:val="22"/>
+              </w:rPr>
+            </w:pPr>
+            <w:r>
+              <w:rPr>
+                <w:rFonts w:ascii="Calibri Light" w:hAnsi="Calibri Light" w:cstheme="majorHAnsi"/>
+                <w:color w:val="EE0000"/>
+                <w:szCs w:val="22"/>
+              </w:rPr>
+              <w:t>2    198</w:t>
+            </w:r>
+          </w:p>
+          <w:p>
+            <w:pPr>
+              <w:spacing w:beforeAutospacing="1" w:afterAutospacing="1"/>
+              <w:rPr>
+                <w:rFonts w:ascii="Calibri Light" w:hAnsi="Calibri Light" w:cstheme="majorHAnsi"/>
+                <w:color w:val="EE0000"/>
+                <w:szCs w:val="22"/>
+              </w:rPr>
+            </w:pPr>
+            <w:r>
+              <w:rPr>
+                <w:rFonts w:ascii="Calibri Light" w:hAnsi="Calibri Light" w:cstheme="majorHAnsi"/>
+                <w:color w:val="EE0000"/>
+                <w:szCs w:val="22"/>
+              </w:rPr>
+              <w:t>3    174</w:t>
+            </w:r>
+          </w:p>
+          <w:p>
+            <w:pPr>
+              <w:spacing w:beforeAutospacing="1" w:afterAutospacing="1"/>
+              <w:rPr>
+                <w:rFonts w:ascii="Calibri Light" w:hAnsi="Calibri Light" w:cstheme="majorHAnsi"/>
+                <w:color w:val="EE0000"/>
+                <w:szCs w:val="22"/>
+              </w:rPr>
+            </w:pPr>
+          </w:p>
+        </w:tc>
+        <w:tc>
+          <w:tcPr>
+            <w:tcW w:w="1798" w:type="dxa"/>
+          </w:tcPr>
+          <w:p>
+            <w:pPr>
+              <w:spacing w:beforeAutospacing="1" w:afterAutospacing="1"/>
+              <w:rPr>
+                <w:rFonts w:ascii="Calibri Light" w:hAnsi="Calibri Light" w:cstheme="majorHAnsi"/>
+                <w:color w:val="EE0000"/>
+                <w:szCs w:val="22"/>
+              </w:rPr>
+            </w:pPr>
+            <w:r>
+              <w:rPr>
+                <w:rFonts w:ascii="Calibri Light" w:hAnsi="Calibri Light" w:cstheme="majorHAnsi"/>
+                <w:color w:val="EE0000"/>
+                <w:szCs w:val="22"/>
+              </w:rPr>
+              <w:lastRenderedPageBreak/>
+              <w:t>[[ 18 247]</w:t>
+            </w:r>
+          </w:p>
+          <w:p>
+            <w:pPr>
+              <w:spacing w:beforeAutospacing="1" w:afterAutospacing="1"/>
+              <w:rPr>
+                <w:rFonts w:ascii="Calibri Light" w:hAnsi="Calibri Light" w:cstheme="majorHAnsi"/>
+                <w:color w:val="EE0000"/>
+                <w:szCs w:val="22"/>
+              </w:rPr>
+            </w:pPr>
+            <w:r>
+              <w:rPr>
+                <w:rFonts w:ascii="Calibri Light" w:hAnsi="Calibri Light" w:cstheme="majorHAnsi"/>
+                <w:color w:val="EE0000"/>
+                <w:szCs w:val="22"/>
+              </w:rPr>
+              <w:t xml:space="preserve"> [ 34 148]</w:t>
+            </w:r>
+          </w:p>
+          <w:p>
+            <w:pPr>
+              <w:spacing w:beforeAutospacing="1" w:afterAutospacing="1"/>
+              <w:rPr>
+                <w:rFonts w:ascii="Calibri Light" w:hAnsi="Calibri Light" w:cstheme="majorHAnsi"/>
+                <w:color w:val="EE0000"/>
+                <w:szCs w:val="22"/>
+              </w:rPr>
+            </w:pPr>
+            <w:r>
+              <w:rPr>
+                <w:rFonts w:ascii="Calibri Light" w:hAnsi="Calibri Light" w:cstheme="majorHAnsi"/>
+                <w:color w:val="EE0000"/>
+                <w:szCs w:val="22"/>
+              </w:rPr>
+              <w:t xml:space="preserve"> [ 22 176]</w:t>
+            </w:r>
+          </w:p>
+          <w:p>
+            <w:pPr>
+              <w:spacing w:beforeAutospacing="1" w:afterAutospacing="1"/>
+              <w:rPr>
+                <w:rFonts w:ascii="Calibri Light" w:hAnsi="Calibri Light" w:cstheme="majorHAnsi"/>
+                <w:color w:val="EE0000"/>
+                <w:szCs w:val="22"/>
+              </w:rPr>
+            </w:pPr>
+            <w:r>
+              <w:rPr>
+                <w:rFonts w:ascii="Calibri Light" w:hAnsi="Calibri Light" w:cstheme="majorHAnsi"/>
+                <w:color w:val="EE0000"/>
+                <w:szCs w:val="22"/>
+              </w:rPr>
+              <w:t xml:space="preserve"> </w:t>
+            </w:r>
+            <w:proofErr w:type="gramStart"/>
+            <w:r>
+              <w:rPr>
+                <w:rFonts w:ascii="Calibri Light" w:hAnsi="Calibri Light" w:cstheme="majorHAnsi"/>
+                <w:color w:val="EE0000"/>
+                <w:szCs w:val="22"/>
+              </w:rPr>
+              <w:t>[  4</w:t>
+            </w:r>
+            <w:proofErr w:type="gramEnd"/>
+            <w:r>
+              <w:rPr>
+                <w:rFonts w:ascii="Calibri Light" w:hAnsi="Calibri Light" w:cstheme="majorHAnsi"/>
+                <w:color w:val="EE0000"/>
+                <w:szCs w:val="22"/>
+              </w:rPr>
+              <w:t xml:space="preserve"> 170]]</w:t>
+            </w:r>
+          </w:p>
+          <w:p>
+            <w:pPr>
+              <w:spacing w:beforeAutospacing="1" w:afterAutospacing="1"/>
+              <w:rPr>
+                <w:rFonts w:ascii="Calibri Light" w:hAnsi="Calibri Light" w:cstheme="majorHAnsi"/>
+                <w:color w:val="EE0000"/>
+                <w:szCs w:val="22"/>
+              </w:rPr>
+            </w:pPr>
+          </w:p>
+        </w:tc>
+        <w:tc>
+          <w:tcPr>
+            <w:tcW w:w="1799" w:type="dxa"/>
+          </w:tcPr>
+          <w:p>
+            <w:pPr>
+              <w:spacing w:beforeAutospacing="1" w:afterAutospacing="1"/>
+              <w:rPr>
+                <w:rFonts w:ascii="Calibri Light" w:hAnsi="Calibri Light" w:cstheme="majorHAnsi"/>
+                <w:color w:val="EE0000"/>
+                <w:szCs w:val="22"/>
+              </w:rPr>
+            </w:pPr>
+            <w:r>
+              <w:rPr>
+                <w:rFonts w:ascii="Calibri Light" w:hAnsi="Calibri Light" w:cstheme="majorHAnsi"/>
+                <w:color w:val="EE0000"/>
+                <w:szCs w:val="22"/>
+              </w:rPr>
+              <w:lastRenderedPageBreak/>
+              <w:t>31.126672444085045</w:t>
+            </w:r>
+          </w:p>
+        </w:tc>
+        <w:tc>
+          <w:tcPr>
+            <w:tcW w:w="1799" w:type="dxa"/>
+          </w:tcPr>
+          <w:p>
+            <w:pPr>
+              <w:spacing w:beforeAutospacing="1" w:afterAutospacing="1"/>
+              <w:rPr>
+                <w:rFonts w:ascii="Calibri Light" w:hAnsi="Calibri Light" w:cstheme="majorHAnsi"/>
+                <w:color w:val="EE0000"/>
+                <w:szCs w:val="22"/>
+              </w:rPr>
+            </w:pPr>
+            <w:r>
+              <w:rPr>
+                <w:rFonts w:ascii="Calibri Light" w:hAnsi="Calibri Light" w:cstheme="majorHAnsi"/>
+                <w:color w:val="EE0000"/>
+                <w:szCs w:val="22"/>
+              </w:rPr>
+              <w:t>7.994112550267026e-07</w:t>
+            </w:r>
+          </w:p>
+        </w:tc>
+      </w:tr>
+      <w:tr>
+        <w:tc>
+          <w:tcPr>
+            <w:tcW w:w="1798" w:type="dxa"/>
+          </w:tcPr>
+          <w:p>
+            <w:pPr>
+              <w:spacing w:beforeAutospacing="1" w:afterAutospacing="1"/>
+              <w:rPr>
+                <w:rFonts w:ascii="Calibri Light" w:hAnsi="Calibri Light" w:cstheme="majorHAnsi"/>
+                <w:color w:val="EE0000"/>
+                <w:szCs w:val="22"/>
+              </w:rPr>
+            </w:pPr>
+            <w:r>
+              <w:rPr>
+                <w:rFonts w:ascii="Calibri Light" w:hAnsi="Calibri Light" w:cstheme="majorHAnsi"/>
+                <w:color w:val="EE0000"/>
+                <w:szCs w:val="22"/>
+              </w:rPr>
+              <w:t>5</w:t>
+            </w:r>
+          </w:p>
+        </w:tc>
+        <w:tc>
+          <w:tcPr>
+            <w:tcW w:w="1798" w:type="dxa"/>
+          </w:tcPr>
+          <w:p>
+            <w:pPr>
+              <w:spacing w:beforeAutospacing="1" w:afterAutospacing="1"/>
+              <w:rPr>
+                <w:rFonts w:ascii="Calibri Light" w:hAnsi="Calibri Light" w:cstheme="majorHAnsi"/>
+                <w:color w:val="EE0000"/>
+                <w:szCs w:val="22"/>
+              </w:rPr>
+            </w:pPr>
+            <w:r>
+              <w:rPr>
+                <w:rFonts w:ascii="Calibri Light" w:hAnsi="Calibri Light" w:cstheme="majorHAnsi"/>
+                <w:color w:val="EE0000"/>
+                <w:szCs w:val="22"/>
+              </w:rPr>
+              <w:t>0.01988068868426042</w:t>
+            </w:r>
+          </w:p>
+        </w:tc>
+        <w:tc>
+          <w:tcPr>
+            <w:tcW w:w="1798" w:type="dxa"/>
+          </w:tcPr>
+          <w:p>
+            <w:pPr>
+              <w:spacing w:beforeAutospacing="1" w:afterAutospacing="1"/>
+              <w:rPr>
+                <w:rFonts w:ascii="Calibri Light" w:hAnsi="Calibri Light" w:cstheme="majorHAnsi"/>
+                <w:color w:val="EE0000"/>
+                <w:szCs w:val="22"/>
+              </w:rPr>
+            </w:pPr>
+            <w:r>
+              <w:rPr>
+                <w:rFonts w:ascii="Calibri Light" w:hAnsi="Calibri Light" w:cstheme="majorHAnsi"/>
+                <w:color w:val="EE0000"/>
+                <w:szCs w:val="22"/>
+              </w:rPr>
+              <w:t>0    258</w:t>
+            </w:r>
+          </w:p>
+          <w:p>
+            <w:pPr>
+              <w:spacing w:beforeAutospacing="1" w:afterAutospacing="1"/>
+              <w:rPr>
+                <w:rFonts w:ascii="Calibri Light" w:hAnsi="Calibri Light" w:cstheme="majorHAnsi"/>
+                <w:color w:val="EE0000"/>
+                <w:szCs w:val="22"/>
+              </w:rPr>
+            </w:pPr>
+            <w:r>
+              <w:rPr>
+                <w:rFonts w:ascii="Calibri Light" w:hAnsi="Calibri Light" w:cstheme="majorHAnsi"/>
+                <w:color w:val="EE0000"/>
+                <w:szCs w:val="22"/>
+              </w:rPr>
+              <w:t>1    198</w:t>
+            </w:r>
+          </w:p>
+          <w:p>
+            <w:pPr>
+              <w:spacing w:beforeAutospacing="1" w:afterAutospacing="1"/>
+              <w:rPr>
+                <w:rFonts w:ascii="Calibri Light" w:hAnsi="Calibri Light" w:cstheme="majorHAnsi"/>
+                <w:color w:val="EE0000"/>
+                <w:szCs w:val="22"/>
+              </w:rPr>
+            </w:pPr>
+            <w:r>
+              <w:rPr>
+                <w:rFonts w:ascii="Calibri Light" w:hAnsi="Calibri Light" w:cstheme="majorHAnsi"/>
+                <w:color w:val="EE0000"/>
+                <w:szCs w:val="22"/>
+              </w:rPr>
+              <w:t>2    187</w:t>
+            </w:r>
+          </w:p>
+          <w:p>
+            <w:pPr>
+              <w:spacing w:beforeAutospacing="1" w:afterAutospacing="1"/>
+              <w:rPr>
+                <w:rFonts w:ascii="Calibri Light" w:hAnsi="Calibri Light" w:cstheme="majorHAnsi"/>
+                <w:color w:val="EE0000"/>
+                <w:szCs w:val="22"/>
+              </w:rPr>
+            </w:pPr>
+            <w:r>
+              <w:rPr>
+                <w:rFonts w:ascii="Calibri Light" w:hAnsi="Calibri Light" w:cstheme="majorHAnsi"/>
+                <w:color w:val="EE0000"/>
+                <w:szCs w:val="22"/>
+              </w:rPr>
+              <w:t>3    167</w:t>
+            </w:r>
+          </w:p>
+          <w:p>
+            <w:pPr>
+              <w:spacing w:beforeAutospacing="1" w:afterAutospacing="1"/>
+              <w:rPr>
+                <w:rFonts w:ascii="Calibri Light" w:hAnsi="Calibri Light" w:cstheme="majorHAnsi"/>
+                <w:color w:val="EE0000"/>
+                <w:szCs w:val="22"/>
+              </w:rPr>
+            </w:pPr>
+            <w:r>
+              <w:rPr>
+                <w:rFonts w:ascii="Calibri Light" w:hAnsi="Calibri Light" w:cstheme="majorHAnsi"/>
+                <w:color w:val="EE0000"/>
+                <w:szCs w:val="22"/>
+              </w:rPr>
+              <w:t>4      9</w:t>
+            </w:r>
+          </w:p>
+          <w:p>
+            <w:pPr>
+              <w:spacing w:beforeAutospacing="1" w:afterAutospacing="1"/>
+              <w:rPr>
+                <w:rFonts w:ascii="Calibri Light" w:hAnsi="Calibri Light" w:cstheme="majorHAnsi"/>
+                <w:color w:val="EE0000"/>
+                <w:szCs w:val="22"/>
+              </w:rPr>
+            </w:pPr>
+          </w:p>
+        </w:tc>
+        <w:tc>
+          <w:tcPr>
+            <w:tcW w:w="1798" w:type="dxa"/>
+          </w:tcPr>
+          <w:p>
+            <w:pPr>
+              <w:spacing w:beforeAutospacing="1" w:afterAutospacing="1"/>
+              <w:rPr>
+                <w:rFonts w:ascii="Calibri Light" w:hAnsi="Calibri Light" w:cstheme="majorHAnsi"/>
+                <w:color w:val="EE0000"/>
+                <w:szCs w:val="22"/>
+              </w:rPr>
+            </w:pPr>
+            <w:r>
+              <w:rPr>
+                <w:rFonts w:ascii="Calibri Light" w:hAnsi="Calibri Light" w:cstheme="majorHAnsi"/>
+                <w:color w:val="EE0000"/>
+                <w:szCs w:val="22"/>
+              </w:rPr>
+              <w:t>[[ 18 240]</w:t>
+            </w:r>
+          </w:p>
+          <w:p>
+            <w:pPr>
+              <w:spacing w:beforeAutospacing="1" w:afterAutospacing="1"/>
+              <w:rPr>
+                <w:rFonts w:ascii="Calibri Light" w:hAnsi="Calibri Light" w:cstheme="majorHAnsi"/>
+                <w:color w:val="EE0000"/>
+                <w:szCs w:val="22"/>
+              </w:rPr>
+            </w:pPr>
+            <w:r>
+              <w:rPr>
+                <w:rFonts w:ascii="Calibri Light" w:hAnsi="Calibri Light" w:cstheme="majorHAnsi"/>
+                <w:color w:val="EE0000"/>
+                <w:szCs w:val="22"/>
+              </w:rPr>
+              <w:t xml:space="preserve"> [ 34 164]</w:t>
+            </w:r>
+          </w:p>
+          <w:p>
+            <w:pPr>
+              <w:spacing w:beforeAutospacing="1" w:afterAutospacing="1"/>
+              <w:rPr>
+                <w:rFonts w:ascii="Calibri Light" w:hAnsi="Calibri Light" w:cstheme="majorHAnsi"/>
+                <w:color w:val="EE0000"/>
+                <w:szCs w:val="22"/>
+              </w:rPr>
+            </w:pPr>
+            <w:r>
+              <w:rPr>
+                <w:rFonts w:ascii="Calibri Light" w:hAnsi="Calibri Light" w:cstheme="majorHAnsi"/>
+                <w:color w:val="EE0000"/>
+                <w:szCs w:val="22"/>
+              </w:rPr>
+              <w:t xml:space="preserve"> [ 22 165]</w:t>
+            </w:r>
+          </w:p>
+          <w:p>
+            <w:pPr>
+              <w:spacing w:beforeAutospacing="1" w:afterAutospacing="1"/>
+              <w:rPr>
+                <w:rFonts w:ascii="Calibri Light" w:hAnsi="Calibri Light" w:cstheme="majorHAnsi"/>
+                <w:color w:val="EE0000"/>
+                <w:szCs w:val="22"/>
+              </w:rPr>
+            </w:pPr>
+            <w:r>
+              <w:rPr>
+                <w:rFonts w:ascii="Calibri Light" w:hAnsi="Calibri Light" w:cstheme="majorHAnsi"/>
+                <w:color w:val="EE0000"/>
+                <w:szCs w:val="22"/>
+              </w:rPr>
+              <w:t xml:space="preserve"> </w:t>
+            </w:r>
+            <w:proofErr w:type="gramStart"/>
+            <w:r>
+              <w:rPr>
+                <w:rFonts w:ascii="Calibri Light" w:hAnsi="Calibri Light" w:cstheme="majorHAnsi"/>
+                <w:color w:val="EE0000"/>
+                <w:szCs w:val="22"/>
+              </w:rPr>
+              <w:t>[  4</w:t>
+            </w:r>
+            <w:proofErr w:type="gramEnd"/>
+            <w:r>
+              <w:rPr>
+                <w:rFonts w:ascii="Calibri Light" w:hAnsi="Calibri Light" w:cstheme="majorHAnsi"/>
+                <w:color w:val="EE0000"/>
+                <w:szCs w:val="22"/>
+              </w:rPr>
+              <w:t xml:space="preserve"> 163]</w:t>
+            </w:r>
+          </w:p>
+          <w:p>
+            <w:pPr>
+              <w:spacing w:beforeAutospacing="1" w:afterAutospacing="1"/>
+              <w:rPr>
+                <w:rFonts w:ascii="Calibri Light" w:hAnsi="Calibri Light" w:cstheme="majorHAnsi"/>
+                <w:color w:val="EE0000"/>
+                <w:szCs w:val="22"/>
+              </w:rPr>
+            </w:pPr>
+            <w:r>
+              <w:rPr>
+                <w:rFonts w:ascii="Calibri Light" w:hAnsi="Calibri Light" w:cstheme="majorHAnsi"/>
+                <w:color w:val="EE0000"/>
+                <w:szCs w:val="22"/>
+              </w:rPr>
+              <w:t xml:space="preserve"> </w:t>
+            </w:r>
+            <w:proofErr w:type="gramStart"/>
+            <w:r>
+              <w:rPr>
+                <w:rFonts w:ascii="Calibri Light" w:hAnsi="Calibri Light" w:cstheme="majorHAnsi"/>
+                <w:color w:val="EE0000"/>
+                <w:szCs w:val="22"/>
+              </w:rPr>
+              <w:t>[  0</w:t>
+            </w:r>
+            <w:proofErr w:type="gramEnd"/>
+            <w:r>
+              <w:rPr>
+                <w:rFonts w:ascii="Calibri Light" w:hAnsi="Calibri Light" w:cstheme="majorHAnsi"/>
+                <w:color w:val="EE0000"/>
+                <w:szCs w:val="22"/>
+              </w:rPr>
+              <w:t xml:space="preserve">   9]]</w:t>
+            </w:r>
+          </w:p>
+          <w:p>
+            <w:pPr>
+              <w:spacing w:beforeAutospacing="1" w:afterAutospacing="1"/>
+              <w:rPr>
+                <w:rFonts w:ascii="Calibri Light" w:hAnsi="Calibri Light" w:cstheme="majorHAnsi"/>
+                <w:color w:val="EE0000"/>
+                <w:szCs w:val="22"/>
+              </w:rPr>
+            </w:pPr>
+          </w:p>
+        </w:tc>
+        <w:tc>
+          <w:tcPr>
+            <w:tcW w:w="1799" w:type="dxa"/>
+          </w:tcPr>
+          <w:p>
+            <w:pPr>
+              <w:spacing w:beforeAutospacing="1" w:afterAutospacing="1"/>
+              <w:rPr>
+                <w:rFonts w:ascii="Calibri Light" w:hAnsi="Calibri Light" w:cstheme="majorHAnsi"/>
+                <w:color w:val="EE0000"/>
+                <w:szCs w:val="22"/>
+              </w:rPr>
+            </w:pPr>
+            <w:r>
+              <w:rPr>
+                <w:rFonts w:ascii="Calibri Light" w:hAnsi="Calibri Light" w:cstheme="majorHAnsi"/>
+                <w:color w:val="EE0000"/>
+                <w:szCs w:val="22"/>
+              </w:rPr>
+              <w:t>27.268539155987245</w:t>
+            </w:r>
+          </w:p>
+        </w:tc>
+        <w:tc>
+          <w:tcPr>
+            <w:tcW w:w="1799" w:type="dxa"/>
+          </w:tcPr>
+          <w:p>
+            <w:pPr>
+              <w:spacing w:beforeAutospacing="1" w:afterAutospacing="1"/>
+              <w:rPr>
+                <w:rFonts w:ascii="Calibri Light" w:hAnsi="Calibri Light" w:cstheme="majorHAnsi"/>
+                <w:color w:val="EE0000"/>
+                <w:szCs w:val="22"/>
+              </w:rPr>
+            </w:pPr>
+            <w:r>
+              <w:rPr>
+                <w:rFonts w:ascii="Calibri Light" w:hAnsi="Calibri Light" w:cstheme="majorHAnsi"/>
+                <w:color w:val="EE0000"/>
+                <w:szCs w:val="22"/>
+              </w:rPr>
+              <w:t>1.7542157599452283e-05</w:t>
+            </w:r>
+          </w:p>
+        </w:tc>
+      </w:tr>
+      <w:tr>
+        <w:tc>
+          <w:tcPr>
+            <w:tcW w:w="1798" w:type="dxa"/>
+          </w:tcPr>
+          <w:p>
+            <w:pPr>
+              <w:spacing w:beforeAutospacing="1" w:afterAutospacing="1"/>
+              <w:rPr>
+                <w:rFonts w:ascii="Calibri Light" w:hAnsi="Calibri Light" w:cstheme="majorHAnsi"/>
+                <w:color w:val="EE0000"/>
+                <w:szCs w:val="22"/>
+              </w:rPr>
+            </w:pPr>
+            <w:r>
+              <w:rPr>
+                <w:rFonts w:ascii="Calibri Light" w:hAnsi="Calibri Light" w:cstheme="majorHAnsi"/>
+                <w:color w:val="EE0000"/>
+                <w:szCs w:val="22"/>
+              </w:rPr>
+              <w:t>6</w:t>
+            </w:r>
+          </w:p>
+        </w:tc>
+        <w:tc>
+          <w:tcPr>
+            <w:tcW w:w="1798" w:type="dxa"/>
+          </w:tcPr>
+          <w:p>
+            <w:pPr>
+              <w:spacing w:beforeAutospacing="1" w:afterAutospacing="1"/>
+              <w:rPr>
+                <w:rFonts w:ascii="Calibri Light" w:hAnsi="Calibri Light" w:cstheme="majorHAnsi"/>
+                <w:color w:val="EE0000"/>
+                <w:szCs w:val="22"/>
+              </w:rPr>
+            </w:pPr>
+            <w:r>
+              <w:rPr>
+                <w:rFonts w:ascii="Calibri Light" w:hAnsi="Calibri Light" w:cstheme="majorHAnsi"/>
+                <w:color w:val="EE0000"/>
+                <w:szCs w:val="22"/>
+              </w:rPr>
+              <w:t>0.016204006963124823</w:t>
+            </w:r>
+          </w:p>
+        </w:tc>
+        <w:tc>
+          <w:tcPr>
+            <w:tcW w:w="1798" w:type="dxa"/>
+          </w:tcPr>
+          <w:p>
+            <w:pPr>
+              <w:spacing w:beforeAutospacing="1" w:afterAutospacing="1"/>
+              <w:rPr>
+                <w:rFonts w:ascii="Calibri Light" w:hAnsi="Calibri Light" w:cstheme="majorHAnsi"/>
+                <w:color w:val="EE0000"/>
+                <w:szCs w:val="22"/>
+              </w:rPr>
+            </w:pPr>
+            <w:r>
+              <w:rPr>
+                <w:rFonts w:ascii="Calibri Light" w:hAnsi="Calibri Light" w:cstheme="majorHAnsi"/>
+                <w:color w:val="EE0000"/>
+                <w:szCs w:val="22"/>
+              </w:rPr>
+              <w:t>0    166</w:t>
+            </w:r>
+          </w:p>
+          <w:p>
+            <w:pPr>
+              <w:spacing w:beforeAutospacing="1" w:afterAutospacing="1"/>
+              <w:rPr>
+                <w:rFonts w:ascii="Calibri Light" w:hAnsi="Calibri Light" w:cstheme="majorHAnsi"/>
+                <w:color w:val="EE0000"/>
+                <w:szCs w:val="22"/>
+              </w:rPr>
+            </w:pPr>
+            <w:r>
+              <w:rPr>
+                <w:rFonts w:ascii="Calibri Light" w:hAnsi="Calibri Light" w:cstheme="majorHAnsi"/>
+                <w:color w:val="EE0000"/>
+                <w:szCs w:val="22"/>
+              </w:rPr>
+              <w:t>1    166</w:t>
+            </w:r>
+          </w:p>
+          <w:p>
+            <w:pPr>
+              <w:spacing w:beforeAutospacing="1" w:afterAutospacing="1"/>
+              <w:rPr>
+                <w:rFonts w:ascii="Calibri Light" w:hAnsi="Calibri Light" w:cstheme="majorHAnsi"/>
+                <w:color w:val="EE0000"/>
+                <w:szCs w:val="22"/>
+              </w:rPr>
+            </w:pPr>
+            <w:r>
+              <w:rPr>
+                <w:rFonts w:ascii="Calibri Light" w:hAnsi="Calibri Light" w:cstheme="majorHAnsi"/>
+                <w:color w:val="EE0000"/>
+                <w:szCs w:val="22"/>
+              </w:rPr>
+              <w:t>2    130</w:t>
+            </w:r>
+          </w:p>
+          <w:p>
+            <w:pPr>
+              <w:spacing w:beforeAutospacing="1" w:afterAutospacing="1"/>
+              <w:rPr>
+                <w:rFonts w:ascii="Calibri Light" w:hAnsi="Calibri Light" w:cstheme="majorHAnsi"/>
+                <w:color w:val="EE0000"/>
+                <w:szCs w:val="22"/>
+              </w:rPr>
+            </w:pPr>
+            <w:r>
+              <w:rPr>
+                <w:rFonts w:ascii="Calibri Light" w:hAnsi="Calibri Light" w:cstheme="majorHAnsi"/>
+                <w:color w:val="EE0000"/>
+                <w:szCs w:val="22"/>
+              </w:rPr>
+              <w:t>3    133</w:t>
+            </w:r>
+          </w:p>
+          <w:p>
+            <w:pPr>
+              <w:spacing w:beforeAutospacing="1" w:afterAutospacing="1"/>
+              <w:rPr>
+                <w:rFonts w:ascii="Calibri Light" w:hAnsi="Calibri Light" w:cstheme="majorHAnsi"/>
+                <w:color w:val="EE0000"/>
+                <w:szCs w:val="22"/>
+              </w:rPr>
+            </w:pPr>
+            <w:r>
+              <w:rPr>
+                <w:rFonts w:ascii="Calibri Light" w:hAnsi="Calibri Light" w:cstheme="majorHAnsi"/>
+                <w:color w:val="EE0000"/>
+                <w:szCs w:val="22"/>
+              </w:rPr>
+              <w:t>4      8</w:t>
+            </w:r>
+          </w:p>
+          <w:p>
+            <w:pPr>
+              <w:spacing w:beforeAutospacing="1" w:afterAutospacing="1"/>
+              <w:rPr>
+                <w:rFonts w:ascii="Calibri Light" w:hAnsi="Calibri Light" w:cstheme="majorHAnsi"/>
+                <w:color w:val="EE0000"/>
+                <w:szCs w:val="22"/>
+              </w:rPr>
+            </w:pPr>
+            <w:r>
+              <w:rPr>
+                <w:rFonts w:ascii="Calibri Light" w:hAnsi="Calibri Light" w:cstheme="majorHAnsi"/>
+                <w:color w:val="EE0000"/>
+                <w:szCs w:val="22"/>
+              </w:rPr>
+              <w:t>5    216</w:t>
+            </w:r>
+          </w:p>
+          <w:p>
+            <w:pPr>
+              <w:spacing w:beforeAutospacing="1" w:afterAutospacing="1"/>
+              <w:rPr>
+                <w:rFonts w:ascii="Calibri Light" w:hAnsi="Calibri Light" w:cstheme="majorHAnsi"/>
+                <w:color w:val="EE0000"/>
+                <w:szCs w:val="22"/>
+              </w:rPr>
+            </w:pPr>
+          </w:p>
+        </w:tc>
+        <w:tc>
+          <w:tcPr>
+            <w:tcW w:w="1798" w:type="dxa"/>
+          </w:tcPr>
+          <w:p>
+            <w:pPr>
+              <w:spacing w:beforeAutospacing="1" w:afterAutospacing="1"/>
+              <w:rPr>
+                <w:rFonts w:ascii="Calibri Light" w:hAnsi="Calibri Light" w:cstheme="majorHAnsi"/>
+                <w:color w:val="EE0000"/>
+                <w:szCs w:val="22"/>
+              </w:rPr>
+            </w:pPr>
+            <w:r>
+              <w:rPr>
+                <w:rFonts w:ascii="Calibri Light" w:hAnsi="Calibri Light" w:cstheme="majorHAnsi"/>
+                <w:color w:val="EE0000"/>
+                <w:szCs w:val="22"/>
+              </w:rPr>
+              <w:t>[[ 12 154]</w:t>
+            </w:r>
+          </w:p>
+          <w:p>
+            <w:pPr>
+              <w:spacing w:beforeAutospacing="1" w:afterAutospacing="1"/>
+              <w:rPr>
+                <w:rFonts w:ascii="Calibri Light" w:hAnsi="Calibri Light" w:cstheme="majorHAnsi"/>
+                <w:color w:val="EE0000"/>
+                <w:szCs w:val="22"/>
+              </w:rPr>
+            </w:pPr>
+            <w:r>
+              <w:rPr>
+                <w:rFonts w:ascii="Calibri Light" w:hAnsi="Calibri Light" w:cstheme="majorHAnsi"/>
+                <w:color w:val="EE0000"/>
+                <w:szCs w:val="22"/>
+              </w:rPr>
+              <w:t xml:space="preserve"> [ 16 150]</w:t>
+            </w:r>
+          </w:p>
+          <w:p>
+            <w:pPr>
+              <w:spacing w:beforeAutospacing="1" w:afterAutospacing="1"/>
+              <w:rPr>
+                <w:rFonts w:ascii="Calibri Light" w:hAnsi="Calibri Light" w:cstheme="majorHAnsi"/>
+                <w:color w:val="EE0000"/>
+                <w:szCs w:val="22"/>
+              </w:rPr>
+            </w:pPr>
+            <w:r>
+              <w:rPr>
+                <w:rFonts w:ascii="Calibri Light" w:hAnsi="Calibri Light" w:cstheme="majorHAnsi"/>
+                <w:color w:val="EE0000"/>
+                <w:szCs w:val="22"/>
+              </w:rPr>
+              <w:t xml:space="preserve"> [ 10 120]</w:t>
+            </w:r>
+          </w:p>
+          <w:p>
+            <w:pPr>
+              <w:spacing w:beforeAutospacing="1" w:afterAutospacing="1"/>
+              <w:rPr>
+                <w:rFonts w:ascii="Calibri Light" w:hAnsi="Calibri Light" w:cstheme="majorHAnsi"/>
+                <w:color w:val="EE0000"/>
+                <w:szCs w:val="22"/>
+              </w:rPr>
+            </w:pPr>
+            <w:r>
+              <w:rPr>
+                <w:rFonts w:ascii="Calibri Light" w:hAnsi="Calibri Light" w:cstheme="majorHAnsi"/>
+                <w:color w:val="EE0000"/>
+                <w:szCs w:val="22"/>
+              </w:rPr>
+              <w:t xml:space="preserve"> </w:t>
+            </w:r>
+            <w:proofErr w:type="gramStart"/>
+            <w:r>
+              <w:rPr>
+                <w:rFonts w:ascii="Calibri Light" w:hAnsi="Calibri Light" w:cstheme="majorHAnsi"/>
+                <w:color w:val="EE0000"/>
+                <w:szCs w:val="22"/>
+              </w:rPr>
+              <w:t>[  2</w:t>
+            </w:r>
+            <w:proofErr w:type="gramEnd"/>
+            <w:r>
+              <w:rPr>
+                <w:rFonts w:ascii="Calibri Light" w:hAnsi="Calibri Light" w:cstheme="majorHAnsi"/>
+                <w:color w:val="EE0000"/>
+                <w:szCs w:val="22"/>
+              </w:rPr>
+              <w:t xml:space="preserve"> 131]</w:t>
+            </w:r>
+          </w:p>
+          <w:p>
+            <w:pPr>
+              <w:spacing w:beforeAutospacing="1" w:afterAutospacing="1"/>
+              <w:rPr>
+                <w:rFonts w:ascii="Calibri Light" w:hAnsi="Calibri Light" w:cstheme="majorHAnsi"/>
+                <w:color w:val="EE0000"/>
+                <w:szCs w:val="22"/>
+              </w:rPr>
+            </w:pPr>
+            <w:r>
+              <w:rPr>
+                <w:rFonts w:ascii="Calibri Light" w:hAnsi="Calibri Light" w:cstheme="majorHAnsi"/>
+                <w:color w:val="EE0000"/>
+                <w:szCs w:val="22"/>
+              </w:rPr>
+              <w:t xml:space="preserve"> </w:t>
+            </w:r>
+            <w:proofErr w:type="gramStart"/>
+            <w:r>
+              <w:rPr>
+                <w:rFonts w:ascii="Calibri Light" w:hAnsi="Calibri Light" w:cstheme="majorHAnsi"/>
+                <w:color w:val="EE0000"/>
+                <w:szCs w:val="22"/>
+              </w:rPr>
+              <w:t>[  0</w:t>
+            </w:r>
+            <w:proofErr w:type="gramEnd"/>
+            <w:r>
+              <w:rPr>
+                <w:rFonts w:ascii="Calibri Light" w:hAnsi="Calibri Light" w:cstheme="majorHAnsi"/>
+                <w:color w:val="EE0000"/>
+                <w:szCs w:val="22"/>
+              </w:rPr>
+              <w:t xml:space="preserve">   8]</w:t>
+            </w:r>
+          </w:p>
+          <w:p>
+            <w:pPr>
+              <w:spacing w:beforeAutospacing="1" w:afterAutospacing="1"/>
+              <w:rPr>
+                <w:rFonts w:ascii="Calibri Light" w:hAnsi="Calibri Light" w:cstheme="majorHAnsi"/>
+                <w:color w:val="EE0000"/>
+                <w:szCs w:val="22"/>
+              </w:rPr>
+            </w:pPr>
+            <w:r>
+              <w:rPr>
+                <w:rFonts w:ascii="Calibri Light" w:hAnsi="Calibri Light" w:cstheme="majorHAnsi"/>
+                <w:color w:val="EE0000"/>
+                <w:szCs w:val="22"/>
+              </w:rPr>
+              <w:t xml:space="preserve"> [ 38 178]]</w:t>
+            </w:r>
+          </w:p>
+          <w:p>
+            <w:pPr>
+              <w:spacing w:beforeAutospacing="1" w:afterAutospacing="1"/>
+              <w:rPr>
+                <w:rFonts w:ascii="Calibri Light" w:hAnsi="Calibri Light" w:cstheme="majorHAnsi"/>
+                <w:color w:val="EE0000"/>
+                <w:szCs w:val="22"/>
+              </w:rPr>
+            </w:pPr>
+          </w:p>
+        </w:tc>
+        <w:tc>
+          <w:tcPr>
+            <w:tcW w:w="1799" w:type="dxa"/>
+          </w:tcPr>
+          <w:p>
+            <w:pPr>
+              <w:spacing w:beforeAutospacing="1" w:afterAutospacing="1"/>
+              <w:rPr>
+                <w:rFonts w:ascii="Calibri Light" w:hAnsi="Calibri Light" w:cstheme="majorHAnsi"/>
+                <w:color w:val="EE0000"/>
+                <w:szCs w:val="22"/>
+              </w:rPr>
+            </w:pPr>
+            <w:r>
+              <w:rPr>
+                <w:rFonts w:ascii="Calibri Light" w:hAnsi="Calibri Light" w:cstheme="majorHAnsi"/>
+                <w:color w:val="EE0000"/>
+                <w:szCs w:val="22"/>
+              </w:rPr>
+              <w:t>28.613452531626606</w:t>
+            </w:r>
+          </w:p>
+        </w:tc>
+        <w:tc>
+          <w:tcPr>
+            <w:tcW w:w="1799" w:type="dxa"/>
+          </w:tcPr>
+          <w:p>
+            <w:pPr>
+              <w:spacing w:beforeAutospacing="1" w:afterAutospacing="1"/>
+              <w:rPr>
+                <w:rFonts w:ascii="Calibri Light" w:hAnsi="Calibri Light" w:cstheme="majorHAnsi"/>
+                <w:color w:val="EE0000"/>
+                <w:szCs w:val="22"/>
+              </w:rPr>
+            </w:pPr>
+            <w:r>
+              <w:rPr>
+                <w:rFonts w:ascii="Calibri Light" w:hAnsi="Calibri Light" w:cstheme="majorHAnsi"/>
+                <w:color w:val="EE0000"/>
+                <w:szCs w:val="22"/>
+              </w:rPr>
+              <w:t>2.7608059806899315e-05</w:t>
+            </w:r>
+          </w:p>
+        </w:tc>
+      </w:tr>
+      <w:tr>
+        <w:tc>
+          <w:tcPr>
+            <w:tcW w:w="1798" w:type="dxa"/>
+          </w:tcPr>
+          <w:p>
+            <w:pPr>
+              <w:spacing w:beforeAutospacing="1" w:afterAutospacing="1"/>
+              <w:rPr>
+                <w:rFonts w:ascii="Calibri Light" w:hAnsi="Calibri Light" w:cstheme="majorHAnsi"/>
+                <w:color w:val="EE0000"/>
+                <w:szCs w:val="22"/>
+              </w:rPr>
+            </w:pPr>
+            <w:r>
+              <w:rPr>
+                <w:rFonts w:ascii="Calibri Light" w:hAnsi="Calibri Light" w:cstheme="majorHAnsi"/>
+                <w:color w:val="EE0000"/>
+                <w:szCs w:val="22"/>
+              </w:rPr>
+              <w:t>7</w:t>
+            </w:r>
+          </w:p>
+        </w:tc>
+        <w:tc>
+          <w:tcPr>
+            <w:tcW w:w="1798" w:type="dxa"/>
+          </w:tcPr>
+          <w:p>
+            <w:pPr>
+              <w:spacing w:beforeAutospacing="1" w:afterAutospacing="1"/>
+              <w:rPr>
+                <w:rFonts w:ascii="Calibri Light" w:hAnsi="Calibri Light" w:cstheme="majorHAnsi"/>
+                <w:color w:val="EE0000"/>
+                <w:szCs w:val="22"/>
+              </w:rPr>
+            </w:pPr>
+            <w:r>
+              <w:rPr>
+                <w:rFonts w:ascii="Calibri Light" w:hAnsi="Calibri Light" w:cstheme="majorHAnsi"/>
+                <w:color w:val="EE0000"/>
+                <w:szCs w:val="22"/>
+              </w:rPr>
+              <w:t>0.018417075745657915</w:t>
+            </w:r>
+          </w:p>
+        </w:tc>
+        <w:tc>
+          <w:tcPr>
+            <w:tcW w:w="1798" w:type="dxa"/>
+          </w:tcPr>
+          <w:p>
+            <w:pPr>
+              <w:spacing w:beforeAutospacing="1" w:afterAutospacing="1"/>
+              <w:rPr>
+                <w:rFonts w:ascii="Calibri Light" w:hAnsi="Calibri Light" w:cstheme="majorHAnsi"/>
+                <w:color w:val="EE0000"/>
+                <w:szCs w:val="22"/>
+              </w:rPr>
+            </w:pPr>
+            <w:r>
+              <w:rPr>
+                <w:rFonts w:ascii="Calibri Light" w:hAnsi="Calibri Light" w:cstheme="majorHAnsi"/>
+                <w:color w:val="EE0000"/>
+                <w:szCs w:val="22"/>
+              </w:rPr>
+              <w:t>0    108</w:t>
+            </w:r>
+          </w:p>
+          <w:p>
+            <w:pPr>
+              <w:spacing w:beforeAutospacing="1" w:afterAutospacing="1"/>
+              <w:rPr>
+                <w:rFonts w:ascii="Calibri Light" w:hAnsi="Calibri Light" w:cstheme="majorHAnsi"/>
+                <w:color w:val="EE0000"/>
+                <w:szCs w:val="22"/>
+              </w:rPr>
+            </w:pPr>
+            <w:r>
+              <w:rPr>
+                <w:rFonts w:ascii="Calibri Light" w:hAnsi="Calibri Light" w:cstheme="majorHAnsi"/>
+                <w:color w:val="EE0000"/>
+                <w:szCs w:val="22"/>
+              </w:rPr>
+              <w:t>1    162</w:t>
+            </w:r>
+          </w:p>
+          <w:p>
+            <w:pPr>
+              <w:spacing w:beforeAutospacing="1" w:afterAutospacing="1"/>
+              <w:rPr>
+                <w:rFonts w:ascii="Calibri Light" w:hAnsi="Calibri Light" w:cstheme="majorHAnsi"/>
+                <w:color w:val="EE0000"/>
+                <w:szCs w:val="22"/>
+              </w:rPr>
+            </w:pPr>
+            <w:r>
+              <w:rPr>
+                <w:rFonts w:ascii="Calibri Light" w:hAnsi="Calibri Light" w:cstheme="majorHAnsi"/>
+                <w:color w:val="EE0000"/>
+                <w:szCs w:val="22"/>
+              </w:rPr>
+              <w:t>2    161</w:t>
+            </w:r>
+          </w:p>
+          <w:p>
+            <w:pPr>
+              <w:spacing w:beforeAutospacing="1" w:afterAutospacing="1"/>
+              <w:rPr>
+                <w:rFonts w:ascii="Calibri Light" w:hAnsi="Calibri Light" w:cstheme="majorHAnsi"/>
+                <w:color w:val="EE0000"/>
+                <w:szCs w:val="22"/>
+              </w:rPr>
+            </w:pPr>
+            <w:r>
+              <w:rPr>
+                <w:rFonts w:ascii="Calibri Light" w:hAnsi="Calibri Light" w:cstheme="majorHAnsi"/>
+                <w:color w:val="EE0000"/>
+                <w:szCs w:val="22"/>
+              </w:rPr>
+              <w:t>3    114</w:t>
+            </w:r>
+          </w:p>
+          <w:p>
+            <w:pPr>
+              <w:spacing w:beforeAutospacing="1" w:afterAutospacing="1"/>
+              <w:rPr>
+                <w:rFonts w:ascii="Calibri Light" w:hAnsi="Calibri Light" w:cstheme="majorHAnsi"/>
+                <w:color w:val="EE0000"/>
+                <w:szCs w:val="22"/>
+              </w:rPr>
+            </w:pPr>
+            <w:r>
+              <w:rPr>
+                <w:rFonts w:ascii="Calibri Light" w:hAnsi="Calibri Light" w:cstheme="majorHAnsi"/>
+                <w:color w:val="EE0000"/>
+                <w:szCs w:val="22"/>
+              </w:rPr>
+              <w:t>4      8</w:t>
+            </w:r>
+          </w:p>
+          <w:p>
+            <w:pPr>
+              <w:spacing w:beforeAutospacing="1" w:afterAutospacing="1"/>
+              <w:rPr>
+                <w:rFonts w:ascii="Calibri Light" w:hAnsi="Calibri Light" w:cstheme="majorHAnsi"/>
+                <w:color w:val="EE0000"/>
+                <w:szCs w:val="22"/>
+              </w:rPr>
+            </w:pPr>
+            <w:r>
+              <w:rPr>
+                <w:rFonts w:ascii="Calibri Light" w:hAnsi="Calibri Light" w:cstheme="majorHAnsi"/>
+                <w:color w:val="EE0000"/>
+                <w:szCs w:val="22"/>
+              </w:rPr>
+              <w:t>5    128</w:t>
+            </w:r>
+          </w:p>
+          <w:p>
+            <w:pPr>
+              <w:spacing w:beforeAutospacing="1" w:afterAutospacing="1"/>
+              <w:rPr>
+                <w:rFonts w:ascii="Calibri Light" w:hAnsi="Calibri Light" w:cstheme="majorHAnsi"/>
+                <w:color w:val="EE0000"/>
+                <w:szCs w:val="22"/>
+              </w:rPr>
+            </w:pPr>
+            <w:r>
+              <w:rPr>
+                <w:rFonts w:ascii="Calibri Light" w:hAnsi="Calibri Light" w:cstheme="majorHAnsi"/>
+                <w:color w:val="EE0000"/>
+                <w:szCs w:val="22"/>
+              </w:rPr>
+              <w:t>6    138</w:t>
+            </w:r>
+          </w:p>
+          <w:p>
+            <w:pPr>
+              <w:spacing w:beforeAutospacing="1" w:afterAutospacing="1"/>
+              <w:rPr>
+                <w:rFonts w:ascii="Calibri Light" w:hAnsi="Calibri Light" w:cstheme="majorHAnsi"/>
+                <w:color w:val="EE0000"/>
+                <w:szCs w:val="22"/>
+              </w:rPr>
+            </w:pPr>
+          </w:p>
+        </w:tc>
+        <w:tc>
+          <w:tcPr>
+            <w:tcW w:w="1798" w:type="dxa"/>
+          </w:tcPr>
+          <w:p>
+            <w:pPr>
+              <w:spacing w:beforeAutospacing="1" w:afterAutospacing="1"/>
+              <w:rPr>
+                <w:rFonts w:ascii="Calibri Light" w:hAnsi="Calibri Light" w:cstheme="majorHAnsi"/>
+                <w:color w:val="EE0000"/>
+                <w:szCs w:val="22"/>
+              </w:rPr>
+            </w:pPr>
+            <w:r>
+              <w:rPr>
+                <w:rFonts w:ascii="Calibri Light" w:hAnsi="Calibri Light" w:cstheme="majorHAnsi"/>
+                <w:color w:val="EE0000"/>
+                <w:szCs w:val="22"/>
+              </w:rPr>
+              <w:t>[</w:t>
+            </w:r>
+            <w:proofErr w:type="gramStart"/>
+            <w:r>
+              <w:rPr>
+                <w:rFonts w:ascii="Calibri Light" w:hAnsi="Calibri Light" w:cstheme="majorHAnsi"/>
+                <w:color w:val="EE0000"/>
+                <w:szCs w:val="22"/>
+              </w:rPr>
+              <w:t>[  6</w:t>
+            </w:r>
+            <w:proofErr w:type="gramEnd"/>
+            <w:r>
+              <w:rPr>
+                <w:rFonts w:ascii="Calibri Light" w:hAnsi="Calibri Light" w:cstheme="majorHAnsi"/>
+                <w:color w:val="EE0000"/>
+                <w:szCs w:val="22"/>
+              </w:rPr>
+              <w:t xml:space="preserve"> 102]</w:t>
+            </w:r>
+          </w:p>
+          <w:p>
+            <w:pPr>
+              <w:spacing w:beforeAutospacing="1" w:afterAutospacing="1"/>
+              <w:rPr>
+                <w:rFonts w:ascii="Calibri Light" w:hAnsi="Calibri Light" w:cstheme="majorHAnsi"/>
+                <w:color w:val="EE0000"/>
+                <w:szCs w:val="22"/>
+              </w:rPr>
+            </w:pPr>
+            <w:r>
+              <w:rPr>
+                <w:rFonts w:ascii="Calibri Light" w:hAnsi="Calibri Light" w:cstheme="majorHAnsi"/>
+                <w:color w:val="EE0000"/>
+                <w:szCs w:val="22"/>
+              </w:rPr>
+              <w:t xml:space="preserve"> [ 20 142]</w:t>
+            </w:r>
+          </w:p>
+          <w:p>
+            <w:pPr>
+              <w:spacing w:beforeAutospacing="1" w:afterAutospacing="1"/>
+              <w:rPr>
+                <w:rFonts w:ascii="Calibri Light" w:hAnsi="Calibri Light" w:cstheme="majorHAnsi"/>
+                <w:color w:val="EE0000"/>
+                <w:szCs w:val="22"/>
+              </w:rPr>
+            </w:pPr>
+            <w:r>
+              <w:rPr>
+                <w:rFonts w:ascii="Calibri Light" w:hAnsi="Calibri Light" w:cstheme="majorHAnsi"/>
+                <w:color w:val="EE0000"/>
+                <w:szCs w:val="22"/>
+              </w:rPr>
+              <w:t xml:space="preserve"> [ 22 139]</w:t>
+            </w:r>
+          </w:p>
+          <w:p>
+            <w:pPr>
+              <w:spacing w:beforeAutospacing="1" w:afterAutospacing="1"/>
+              <w:rPr>
+                <w:rFonts w:ascii="Calibri Light" w:hAnsi="Calibri Light" w:cstheme="majorHAnsi"/>
+                <w:color w:val="EE0000"/>
+                <w:szCs w:val="22"/>
+              </w:rPr>
+            </w:pPr>
+            <w:r>
+              <w:rPr>
+                <w:rFonts w:ascii="Calibri Light" w:hAnsi="Calibri Light" w:cstheme="majorHAnsi"/>
+                <w:color w:val="EE0000"/>
+                <w:szCs w:val="22"/>
+              </w:rPr>
+              <w:t xml:space="preserve"> </w:t>
+            </w:r>
+            <w:proofErr w:type="gramStart"/>
+            <w:r>
+              <w:rPr>
+                <w:rFonts w:ascii="Calibri Light" w:hAnsi="Calibri Light" w:cstheme="majorHAnsi"/>
+                <w:color w:val="EE0000"/>
+                <w:szCs w:val="22"/>
+              </w:rPr>
+              <w:t>[  2</w:t>
+            </w:r>
+            <w:proofErr w:type="gramEnd"/>
+            <w:r>
+              <w:rPr>
+                <w:rFonts w:ascii="Calibri Light" w:hAnsi="Calibri Light" w:cstheme="majorHAnsi"/>
+                <w:color w:val="EE0000"/>
+                <w:szCs w:val="22"/>
+              </w:rPr>
+              <w:t xml:space="preserve"> 112]</w:t>
+            </w:r>
+          </w:p>
+          <w:p>
+            <w:pPr>
+              <w:spacing w:beforeAutospacing="1" w:afterAutospacing="1"/>
+              <w:rPr>
+                <w:rFonts w:ascii="Calibri Light" w:hAnsi="Calibri Light" w:cstheme="majorHAnsi"/>
+                <w:color w:val="EE0000"/>
+                <w:szCs w:val="22"/>
+              </w:rPr>
+            </w:pPr>
+            <w:r>
+              <w:rPr>
+                <w:rFonts w:ascii="Calibri Light" w:hAnsi="Calibri Light" w:cstheme="majorHAnsi"/>
+                <w:color w:val="EE0000"/>
+                <w:szCs w:val="22"/>
+              </w:rPr>
+              <w:t xml:space="preserve"> </w:t>
+            </w:r>
+            <w:proofErr w:type="gramStart"/>
+            <w:r>
+              <w:rPr>
+                <w:rFonts w:ascii="Calibri Light" w:hAnsi="Calibri Light" w:cstheme="majorHAnsi"/>
+                <w:color w:val="EE0000"/>
+                <w:szCs w:val="22"/>
+              </w:rPr>
+              <w:t>[  0</w:t>
+            </w:r>
+            <w:proofErr w:type="gramEnd"/>
+            <w:r>
+              <w:rPr>
+                <w:rFonts w:ascii="Calibri Light" w:hAnsi="Calibri Light" w:cstheme="majorHAnsi"/>
+                <w:color w:val="EE0000"/>
+                <w:szCs w:val="22"/>
+              </w:rPr>
+              <w:t xml:space="preserve">   8]</w:t>
+            </w:r>
+          </w:p>
+          <w:p>
+            <w:pPr>
+              <w:spacing w:beforeAutospacing="1" w:afterAutospacing="1"/>
+              <w:rPr>
+                <w:rFonts w:ascii="Calibri Light" w:hAnsi="Calibri Light" w:cstheme="majorHAnsi"/>
+                <w:color w:val="EE0000"/>
+                <w:szCs w:val="22"/>
+              </w:rPr>
+            </w:pPr>
+            <w:r>
+              <w:rPr>
+                <w:rFonts w:ascii="Calibri Light" w:hAnsi="Calibri Light" w:cstheme="majorHAnsi"/>
+                <w:color w:val="EE0000"/>
+                <w:szCs w:val="22"/>
+              </w:rPr>
+              <w:t xml:space="preserve"> [ 26 102]</w:t>
+            </w:r>
+          </w:p>
+          <w:p>
+            <w:pPr>
+              <w:spacing w:beforeAutospacing="1" w:afterAutospacing="1"/>
+              <w:rPr>
+                <w:rFonts w:ascii="Calibri Light" w:hAnsi="Calibri Light" w:cstheme="majorHAnsi"/>
+                <w:color w:val="EE0000"/>
+                <w:szCs w:val="22"/>
+              </w:rPr>
+            </w:pPr>
+            <w:r>
+              <w:rPr>
+                <w:rFonts w:ascii="Calibri Light" w:hAnsi="Calibri Light" w:cstheme="majorHAnsi"/>
+                <w:color w:val="EE0000"/>
+                <w:szCs w:val="22"/>
+              </w:rPr>
+              <w:t xml:space="preserve"> </w:t>
+            </w:r>
+            <w:proofErr w:type="gramStart"/>
+            <w:r>
+              <w:rPr>
+                <w:rFonts w:ascii="Calibri Light" w:hAnsi="Calibri Light" w:cstheme="majorHAnsi"/>
+                <w:color w:val="EE0000"/>
+                <w:szCs w:val="22"/>
+              </w:rPr>
+              <w:t>[  2</w:t>
+            </w:r>
+            <w:proofErr w:type="gramEnd"/>
+            <w:r>
+              <w:rPr>
+                <w:rFonts w:ascii="Calibri Light" w:hAnsi="Calibri Light" w:cstheme="majorHAnsi"/>
+                <w:color w:val="EE0000"/>
+                <w:szCs w:val="22"/>
+              </w:rPr>
+              <w:t xml:space="preserve"> 136]]</w:t>
+            </w:r>
+          </w:p>
+          <w:p>
+            <w:pPr>
+              <w:spacing w:beforeAutospacing="1" w:afterAutospacing="1"/>
+              <w:rPr>
+                <w:rFonts w:ascii="Calibri Light" w:hAnsi="Calibri Light" w:cstheme="majorHAnsi"/>
+                <w:color w:val="EE0000"/>
+                <w:szCs w:val="22"/>
+              </w:rPr>
+            </w:pPr>
+          </w:p>
+        </w:tc>
+        <w:tc>
+          <w:tcPr>
+            <w:tcW w:w="1799" w:type="dxa"/>
+          </w:tcPr>
+          <w:p>
+            <w:pPr>
+              <w:spacing w:beforeAutospacing="1" w:afterAutospacing="1"/>
+              <w:rPr>
+                <w:rFonts w:ascii="Calibri Light" w:hAnsi="Calibri Light" w:cstheme="majorHAnsi"/>
+                <w:color w:val="EE0000"/>
+                <w:szCs w:val="22"/>
+              </w:rPr>
+            </w:pPr>
+            <w:r>
+              <w:rPr>
+                <w:rFonts w:ascii="Calibri Light" w:hAnsi="Calibri Light" w:cstheme="majorHAnsi"/>
+                <w:color w:val="EE0000"/>
+                <w:szCs w:val="22"/>
+              </w:rPr>
+              <w:t>43.234620058680264</w:t>
+            </w:r>
+          </w:p>
+        </w:tc>
+        <w:tc>
+          <w:tcPr>
+            <w:tcW w:w="1799" w:type="dxa"/>
+          </w:tcPr>
+          <w:p>
+            <w:pPr>
+              <w:spacing w:beforeAutospacing="1" w:afterAutospacing="1"/>
+              <w:rPr>
+                <w:rFonts w:ascii="Calibri Light" w:hAnsi="Calibri Light" w:cstheme="majorHAnsi"/>
+                <w:color w:val="EE0000"/>
+                <w:szCs w:val="22"/>
+              </w:rPr>
+            </w:pPr>
+            <w:r>
+              <w:rPr>
+                <w:rFonts w:ascii="Calibri Light" w:hAnsi="Calibri Light" w:cstheme="majorHAnsi"/>
+                <w:color w:val="EE0000"/>
+                <w:szCs w:val="22"/>
+              </w:rPr>
+              <w:t>1.0481455826206108e-07</w:t>
+            </w:r>
+          </w:p>
+        </w:tc>
+      </w:tr>
+    </w:tbl>
+    <w:p>
+      <w:pPr>
+        <w:spacing w:beforeAutospacing="1" w:afterAutospacing="1"/>
+        <w:rPr>
+          <w:rFonts w:ascii="Calibri Light" w:hAnsi="Calibri Light" w:cstheme="majorHAnsi"/>
+          <w:color w:val="EE0000"/>
+          <w:szCs w:val="22"/>
+        </w:rPr>
+      </w:pPr>
+      <w:r>
+        <w:rPr>
+          <w:rFonts w:ascii="Calibri Light" w:hAnsi="Calibri Light" w:cstheme="majorHAnsi"/>
+          <w:color w:val="EE0000"/>
+          <w:szCs w:val="22"/>
+        </w:rPr>
+        <w:t xml:space="preserve">The table above shows the different values of k that were tested with the gaussian mixture models. The silhouette score which </w:t>
+      </w:r>
+      <w:proofErr w:type="gramStart"/>
+      <w:r>
+        <w:rPr>
+          <w:rFonts w:ascii="Calibri Light" w:hAnsi="Calibri Light" w:cstheme="majorHAnsi"/>
+          <w:color w:val="EE0000"/>
+          <w:szCs w:val="22"/>
+        </w:rPr>
+        <w:t>were</w:t>
+      </w:r>
+      <w:proofErr w:type="gramEnd"/>
+      <w:r>
+        <w:rPr>
+          <w:rFonts w:ascii="Calibri Light" w:hAnsi="Calibri Light" w:cstheme="majorHAnsi"/>
+          <w:color w:val="EE0000"/>
+          <w:szCs w:val="22"/>
+        </w:rPr>
+        <w:t xml:space="preserve"> all close to 0 indicate how separated the clusters were. The </w:t>
+      </w:r>
+      <w:r>
+        <w:rPr>
+          <w:rFonts w:ascii="Calibri Light" w:hAnsi="Calibri Light" w:cstheme="majorHAnsi"/>
+          <w:color w:val="EE0000"/>
+          <w:szCs w:val="22"/>
+        </w:rPr>
+        <w:t>TB vs Healthy Chi-Squared Tests</w:t>
+      </w:r>
+      <w:r>
+        <w:rPr>
+          <w:rFonts w:ascii="Calibri Light" w:hAnsi="Calibri Light" w:cstheme="majorHAnsi"/>
+          <w:color w:val="EE0000"/>
+          <w:szCs w:val="22"/>
+        </w:rPr>
+        <w:t xml:space="preserve"> compared cluster membership with TB vs healthy status, and the p-values indicated that there was </w:t>
+      </w:r>
+      <w:proofErr w:type="spellStart"/>
+      <w:r>
+        <w:rPr>
+          <w:rFonts w:ascii="Calibri Light" w:hAnsi="Calibri Light" w:cstheme="majorHAnsi"/>
+          <w:color w:val="EE0000"/>
+          <w:szCs w:val="22"/>
+        </w:rPr>
+        <w:t>statistic</w:t>
+      </w:r>
+      <w:proofErr w:type="spellEnd"/>
+      <w:r>
+        <w:rPr>
+          <w:rFonts w:ascii="Calibri Light" w:hAnsi="Calibri Light" w:cstheme="majorHAnsi"/>
+          <w:color w:val="EE0000"/>
+          <w:szCs w:val="22"/>
+        </w:rPr>
+        <w:t xml:space="preserve"> significance for the association.</w:t>
       </w:r>
     </w:p>
     <w:tbl>
@@ -1596,6 +3860,7 @@
                 <w:color w:val="EE0000"/>
                 <w:szCs w:val="22"/>
               </w:rPr>
+              <w:lastRenderedPageBreak/>
               <w:t>100 10000</w:t>
             </w:r>
           </w:p>
@@ -1768,31 +4033,7 @@
                 <w:color w:val="EE0000"/>
                 <w:szCs w:val="22"/>
               </w:rPr>
-              <w:t>Number of G</w:t>
-            </w:r>
-            <w:r>
-              <w:rPr>
-                <w:rFonts w:asciiTheme="majorHAnsi" w:hAnsiTheme="majorHAnsi" w:cstheme="majorHAnsi"/>
-                <w:color w:val="EE0000"/>
-                <w:szCs w:val="22"/>
-              </w:rPr>
-              <w:t>ene</w:t>
-            </w:r>
-            <w:r>
-              <w:rPr>
-                <w:rFonts w:asciiTheme="majorHAnsi" w:hAnsiTheme="majorHAnsi" w:cstheme="majorHAnsi"/>
-                <w:color w:val="EE0000"/>
-                <w:szCs w:val="22"/>
-              </w:rPr>
-              <w:t>s</w:t>
-            </w:r>
-            <w:r>
-              <w:rPr>
-                <w:rFonts w:asciiTheme="majorHAnsi" w:hAnsiTheme="majorHAnsi" w:cstheme="majorHAnsi"/>
-                <w:color w:val="EE0000"/>
-                <w:szCs w:val="22"/>
-              </w:rPr>
-              <w:t xml:space="preserve"> </w:t>
+              <w:t xml:space="preserve">Number of Genes </w:t>
             </w:r>
           </w:p>
         </w:tc>
@@ -2252,7 +4493,6 @@
           <w:iCs/>
           <w:color w:val="064462"/>
         </w:rPr>
-        <w:lastRenderedPageBreak/>
         <w:t>Create a heatmap of the 5,000 genes used in clustering. Add an annotation sidebar showing one set of clusters you identified from each clustering method and the sample groups from Assignment 1.</w:t>
       </w:r>
     </w:p>
@@ -2332,13 +4572,16 @@
       </w:pPr>
       <w:r>
         <w:rPr>
+          <w:rFonts w:ascii="Times New Roman" w:hAnsi="Times New Roman"/>
           <w:noProof/>
-        </w:rPr>
+          <w:sz w:val="24"/>
+        </w:rPr>
+        <w:lastRenderedPageBreak/>
         <w:drawing>
-          <wp:inline distT="0" distB="0" distL="0" distR="0" wp14:anchorId="7160AEC0" wp14:editId="251CE986">
-            <wp:extent cx="6858000" cy="6511925"/>
+          <wp:inline distT="0" distB="0" distL="0" distR="0" wp14:anchorId="63A21D00" wp14:editId="67321C12">
+            <wp:extent cx="6769100" cy="6400800"/>
             <wp:effectExtent l="0" t="0" r="0" b="0"/>
-            <wp:docPr id="3" name="Picture 3"/>
+            <wp:docPr id="349403118" name="Picture 3"/>
             <wp:cNvGraphicFramePr>
               <a:graphicFrameLocks xmlns:a="http://schemas.openxmlformats.org/drawingml/2006/main" noChangeAspect="1"/>
             </wp:cNvGraphicFramePr>
@@ -2346,26 +4589,29 @@
               <a:graphicData uri="http://schemas.openxmlformats.org/drawingml/2006/picture">
                 <pic:pic xmlns:pic="http://schemas.openxmlformats.org/drawingml/2006/picture">
                   <pic:nvPicPr>
-                    <pic:cNvPr id="3" name="Picture 3"/>
-                    <pic:cNvPicPr>
-                      <a:picLocks noChangeAspect="1" noChangeArrowheads="1"/>
-                    </pic:cNvPicPr>
+                    <pic:cNvPr id="349403118" name="Picture 349403118"/>
+                    <pic:cNvPicPr/>
                   </pic:nvPicPr>
                   <pic:blipFill>
-                    <a:blip r:embed="rId15"/>
+                    <a:blip r:embed="rId15">
+                      <a:extLst>
+                        <a:ext uri="{28A0092B-C50C-407E-A947-70E740481C1C}">
+                          <a14:useLocalDpi xmlns:a14="http://schemas.microsoft.com/office/drawing/2010/main" val="0"/>
+                        </a:ext>
+                      </a:extLst>
+                    </a:blip>
                     <a:stretch>
                       <a:fillRect/>
                     </a:stretch>
                   </pic:blipFill>
-                  <pic:spPr bwMode="auto">
+                  <pic:spPr>
                     <a:xfrm>
                       <a:off x="0" y="0"/>
-                      <a:ext cx="6858000" cy="6511925"/>
+                      <a:ext cx="6769100" cy="6400800"/>
                     </a:xfrm>
                     <a:prstGeom prst="rect">
                       <a:avLst/>
                     </a:prstGeom>
-                    <a:noFill/>
                   </pic:spPr>
                 </pic:pic>
               </a:graphicData>
@@ -2451,7 +4697,16 @@
           <w:iCs/>
           <w:color w:val="064462"/>
         </w:rPr>
-        <w:t xml:space="preserve">Does cluster membership correlate with the groups you chose in Assignment 1? Perform a chi-squared test of independence to statistically compare the two (assignment 1 groups vs the clusters you found). Repeat this for each clustering result you identified, for all versions of each clustering approach. Add these results to your table of chi-squared test results comparing the different versions of the clustering method that you ran. </w:t>
+        <w:t xml:space="preserve">Does cluster membership correlate with the groups you chose in Assignment 1? Perform a chi-squared test of independence to statistically compare the two (assignment 1 groups vs the clusters you found). Repeat this for each clustering result you identified, for all versions of each clustering approach. Add </w:t>
+      </w:r>
+      <w:r>
+        <w:rPr>
+          <w:i/>
+          <w:iCs/>
+          <w:color w:val="064462"/>
+        </w:rPr>
+        <w:lastRenderedPageBreak/>
+        <w:t xml:space="preserve">these results to your table of chi-squared test results comparing the different versions of the clustering method that you ran. </w:t>
       </w:r>
     </w:p>
     <w:p>
@@ -2477,6 +4732,26 @@
           <w:color w:val="EE0000"/>
         </w:rPr>
         <w:t>10^-11.</w:t>
+      </w:r>
+    </w:p>
+    <w:p>
+      <w:pPr>
+        <w:rPr>
+          <w:color w:val="EE0000"/>
+        </w:rPr>
+      </w:pPr>
+    </w:p>
+    <w:p>
+      <w:pPr>
+        <w:rPr>
+          <w:color w:val="EE0000"/>
+        </w:rPr>
+      </w:pPr>
+      <w:r>
+        <w:rPr>
+          <w:color w:val="EE0000"/>
+        </w:rPr>
+        <w:t xml:space="preserve">For Gaussian mixture model clustering, the silhouette scores showed that the clusters had significant overlap and did not separate the clusters. However, the chi squared tests and low p-values indicated that there was a significant enough association between TB vs Healthy and cluster membership across all the different sizes of clusters that were tested. This shows that while the structure doesn’t have a clear separation, the distribution still indicates disease related structure. </w:t>
       </w:r>
     </w:p>
     <w:p>
@@ -2525,7 +4800,25 @@
           <w:iCs/>
           <w:color w:val="EE0000"/>
         </w:rPr>
-        <w:t>The p-values were adjusted for multiple hypothesis testing using the Benjamini-Hochberg false discovery rate (FDR) procedure. All adjusted p-values remained below 0.05, indicating that the association between K-means cluster membership and TB/healthy-control status remained statistically significant after correction. The adjusted p-values were 6.40</w:t>
+        <w:t xml:space="preserve">The p-values were adjusted for multiple hypothesis testing using the </w:t>
+      </w:r>
+      <w:proofErr w:type="spellStart"/>
+      <w:r>
+        <w:rPr>
+          <w:i/>
+          <w:iCs/>
+          <w:color w:val="EE0000"/>
+        </w:rPr>
+        <w:t>Benjamini</w:t>
+      </w:r>
+      <w:proofErr w:type="spellEnd"/>
+      <w:r>
+        <w:rPr>
+          <w:i/>
+          <w:iCs/>
+          <w:color w:val="EE0000"/>
+        </w:rPr>
+        <w:t>-Hochberg false discovery rate (FDR) procedure. All adjusted p-values remained below 0.05, indicating that the association between K-means cluster membership and TB/healthy-control status remained statistically significant after correction. The adjusted p-values were 6.40</w:t>
       </w:r>
       <w:r>
         <w:rPr>
@@ -2680,7 +4973,7 @@
 </file>
 
 <file path=word/endnotes.xml><?xml version="1.0" encoding="utf-8"?>
-<w:endnotes xmlns:wpc="http://schemas.microsoft.com/office/word/2010/wordprocessingCanvas" xmlns:cx="http://schemas.microsoft.com/office/drawing/2014/chartex" xmlns:cx1="http://schemas.microsoft.com/office/drawing/2015/9/8/chartex" xmlns:cx2="http://schemas.microsoft.com/office/drawing/2015/10/21/chartex" xmlns:cx3="http://schemas.microsoft.com/office/drawing/2016/5/9/chartex" xmlns:cx4="http://schemas.microsoft.com/office/drawing/2016/5/10/chartex" xmlns:cx5="http://schemas.microsoft.com/office/drawing/2016/5/11/chartex" xmlns:cx6="http://schemas.microsoft.com/office/drawing/2016/5/12/chartex" xmlns:cx7="http://schemas.microsoft.com/office/drawing/2016/5/13/chartex" xmlns:cx8="http://schemas.microsoft.com/office/drawing/2016/5/14/chartex" xmlns:mc="http://schemas.openxmlformats.org/markup-compatibility/2006" xmlns:aink="http://schemas.microsoft.com/office/drawing/2016/ink" xmlns:am3d="http://schemas.microsoft.com/office/drawing/2017/model3d" xmlns:o="urn:schemas-microsoft-com:office:office" xmlns:oel="http://schemas.microsoft.com/office/2019/extlst" xmlns:r="http://schemas.openxmlformats.org/officeDocument/2006/relationships" xmlns:m="http://schemas.openxmlformats.org/officeDocument/2006/math" xmlns:v="urn:schemas-microsoft-com:vml" xmlns:wp14="http://schemas.microsoft.com/office/word/2010/wordprocessingDrawing" xmlns:wp="http://schemas.openxmlformats.org/drawingml/2006/wordprocessingDrawing" xmlns:w10="urn:schemas-microsoft-com:office:word" xmlns:w="http://schemas.openxmlformats.org/wordprocessingml/2006/main" xmlns:w14="http://schemas.microsoft.com/office/word/2010/wordml" xmlns:w15="http://schemas.microsoft.com/office/word/2012/wordml" xmlns:w16cex="http://schemas.microsoft.com/office/word/2018/wordml/cex" xmlns:w16cid="http://schemas.microsoft.com/office/word/2016/wordml/cid" xmlns:w16="http://schemas.microsoft.com/office/word/2018/wordml" xmlns:w16du="http://schemas.microsoft.com/office/word/2023/wordml/word16du" xmlns:w16sdtdh="http://schemas.microsoft.com/office/word/2020/wordml/sdtdatahash" xmlns:w16sdtfl="http://schemas.microsoft.com/office/word/2024/wordml/sdtformatlock" xmlns:w16se="http://schemas.microsoft.com/office/word/2015/wordml/symex" xmlns:wpg="http://schemas.microsoft.com/office/word/2010/wordprocessingGroup" xmlns:wpi="http://schemas.microsoft.com/office/word/2010/wordprocessingInk" xmlns:wne="http://schemas.microsoft.com/office/word/2006/wordml" xmlns:wps="http://schemas.microsoft.com/office/word/2010/wordprocessingShape" mc:Ignorable="w14 w15 w16se w16cid w16 w16cex w16sdtdh w16sdtfl w16du wp14">
+<w:endnotes xmlns:wpc="http://schemas.microsoft.com/office/word/2010/wordprocessingCanvas" xmlns:cx="http://schemas.microsoft.com/office/drawing/2014/chartex" xmlns:cx1="http://schemas.microsoft.com/office/drawing/2015/9/8/chartex" xmlns:cx2="http://schemas.microsoft.com/office/drawing/2015/10/21/chartex" xmlns:cx3="http://schemas.microsoft.com/office/drawing/2016/5/9/chartex" xmlns:cx4="http://schemas.microsoft.com/office/drawing/2016/5/10/chartex" xmlns:cx5="http://schemas.microsoft.com/office/drawing/2016/5/11/chartex" xmlns:cx6="http://schemas.microsoft.com/office/drawing/2016/5/12/chartex" xmlns:cx7="http://schemas.microsoft.com/office/drawing/2016/5/13/chartex" xmlns:cx8="http://schemas.microsoft.com/office/drawing/2016/5/14/chartex" xmlns:mc="http://schemas.openxmlformats.org/markup-compatibility/2006" xmlns:aink="http://schemas.microsoft.com/office/drawing/2016/ink" xmlns:am3d="http://schemas.microsoft.com/office/drawing/2017/model3d" xmlns:o="urn:schemas-microsoft-com:office:office" xmlns:oel="http://schemas.microsoft.com/office/2019/extlst" xmlns:r="http://schemas.openxmlformats.org/officeDocument/2006/relationships" xmlns:m="http://schemas.openxmlformats.org/officeDocument/2006/math" xmlns:v="urn:schemas-microsoft-com:vml" xmlns:wp14="http://schemas.microsoft.com/office/word/2010/wordprocessingDrawing" xmlns:wp="http://schemas.openxmlformats.org/drawingml/2006/wordprocessingDrawing" xmlns:w10="urn:schemas-microsoft-com:office:word" xmlns:w="http://schemas.openxmlformats.org/wordprocessingml/2006/main" xmlns:w14="http://schemas.microsoft.com/office/word/2010/wordml" xmlns:w15="http://schemas.microsoft.com/office/word/2012/wordml" xmlns:w16cex="http://schemas.microsoft.com/office/word/2018/wordml/cex" xmlns:w16cid="http://schemas.microsoft.com/office/word/2016/wordml/cid" xmlns:w16="http://schemas.microsoft.com/office/word/2018/wordml" xmlns:w16du="http://schemas.microsoft.com/office/word/2023/wordml/word16du" xmlns:w16sdtdh="http://schemas.microsoft.com/office/word/2020/wordml/sdtdatahash" xmlns:w16se="http://schemas.microsoft.com/office/word/2015/wordml/symex" xmlns:wpg="http://schemas.microsoft.com/office/word/2010/wordprocessingGroup" xmlns:wpi="http://schemas.microsoft.com/office/word/2010/wordprocessingInk" xmlns:wne="http://schemas.microsoft.com/office/word/2006/wordml" xmlns:wps="http://schemas.microsoft.com/office/word/2010/wordprocessingShape" mc:Ignorable="w14 w15 w16se w16cid w16 w16cex w16sdtdh w16du wp14">
   <w:endnote w:type="separator" w:id="-1">
     <w:p>
       <w:r>
@@ -2699,7 +4992,7 @@
 </file>
 
 <file path=word/footer1.xml><?xml version="1.0" encoding="utf-8"?>
-<w:ftr xmlns:wpc="http://schemas.microsoft.com/office/word/2010/wordprocessingCanvas" xmlns:cx="http://schemas.microsoft.com/office/drawing/2014/chartex" xmlns:cx1="http://schemas.microsoft.com/office/drawing/2015/9/8/chartex" xmlns:cx2="http://schemas.microsoft.com/office/drawing/2015/10/21/chartex" xmlns:cx3="http://schemas.microsoft.com/office/drawing/2016/5/9/chartex" xmlns:cx4="http://schemas.microsoft.com/office/drawing/2016/5/10/chartex" xmlns:cx5="http://schemas.microsoft.com/office/drawing/2016/5/11/chartex" xmlns:cx6="http://schemas.microsoft.com/office/drawing/2016/5/12/chartex" xmlns:cx7="http://schemas.microsoft.com/office/drawing/2016/5/13/chartex" xmlns:cx8="http://schemas.microsoft.com/office/drawing/2016/5/14/chartex" xmlns:mc="http://schemas.openxmlformats.org/markup-compatibility/2006" xmlns:aink="http://schemas.microsoft.com/office/drawing/2016/ink" xmlns:am3d="http://schemas.microsoft.com/office/drawing/2017/model3d" xmlns:o="urn:schemas-microsoft-com:office:office" xmlns:oel="http://schemas.microsoft.com/office/2019/extlst" xmlns:r="http://schemas.openxmlformats.org/officeDocument/2006/relationships" xmlns:m="http://schemas.openxmlformats.org/officeDocument/2006/math" xmlns:v="urn:schemas-microsoft-com:vml" xmlns:wp14="http://schemas.microsoft.com/office/word/2010/wordprocessingDrawing" xmlns:wp="http://schemas.openxmlformats.org/drawingml/2006/wordprocessingDrawing" xmlns:w10="urn:schemas-microsoft-com:office:word" xmlns:w="http://schemas.openxmlformats.org/wordprocessingml/2006/main" xmlns:w14="http://schemas.microsoft.com/office/word/2010/wordml" xmlns:w15="http://schemas.microsoft.com/office/word/2012/wordml" xmlns:w16cex="http://schemas.microsoft.com/office/word/2018/wordml/cex" xmlns:w16cid="http://schemas.microsoft.com/office/word/2016/wordml/cid" xmlns:w16="http://schemas.microsoft.com/office/word/2018/wordml" xmlns:w16du="http://schemas.microsoft.com/office/word/2023/wordml/word16du" xmlns:w16sdtdh="http://schemas.microsoft.com/office/word/2020/wordml/sdtdatahash" xmlns:w16sdtfl="http://schemas.microsoft.com/office/word/2024/wordml/sdtformatlock" xmlns:w16se="http://schemas.microsoft.com/office/word/2015/wordml/symex" xmlns:wpg="http://schemas.microsoft.com/office/word/2010/wordprocessingGroup" xmlns:wpi="http://schemas.microsoft.com/office/word/2010/wordprocessingInk" xmlns:wne="http://schemas.microsoft.com/office/word/2006/wordml" xmlns:wps="http://schemas.microsoft.com/office/word/2010/wordprocessingShape" mc:Ignorable="w14 w15 w16se w16cid w16 w16cex w16sdtdh w16sdtfl w16du wp14">
+<w:ftr xmlns:wpc="http://schemas.microsoft.com/office/word/2010/wordprocessingCanvas" xmlns:cx="http://schemas.microsoft.com/office/drawing/2014/chartex" xmlns:cx1="http://schemas.microsoft.com/office/drawing/2015/9/8/chartex" xmlns:cx2="http://schemas.microsoft.com/office/drawing/2015/10/21/chartex" xmlns:cx3="http://schemas.microsoft.com/office/drawing/2016/5/9/chartex" xmlns:cx4="http://schemas.microsoft.com/office/drawing/2016/5/10/chartex" xmlns:cx5="http://schemas.microsoft.com/office/drawing/2016/5/11/chartex" xmlns:cx6="http://schemas.microsoft.com/office/drawing/2016/5/12/chartex" xmlns:cx7="http://schemas.microsoft.com/office/drawing/2016/5/13/chartex" xmlns:cx8="http://schemas.microsoft.com/office/drawing/2016/5/14/chartex" xmlns:mc="http://schemas.openxmlformats.org/markup-compatibility/2006" xmlns:aink="http://schemas.microsoft.com/office/drawing/2016/ink" xmlns:am3d="http://schemas.microsoft.com/office/drawing/2017/model3d" xmlns:o="urn:schemas-microsoft-com:office:office" xmlns:oel="http://schemas.microsoft.com/office/2019/extlst" xmlns:r="http://schemas.openxmlformats.org/officeDocument/2006/relationships" xmlns:m="http://schemas.openxmlformats.org/officeDocument/2006/math" xmlns:v="urn:schemas-microsoft-com:vml" xmlns:wp14="http://schemas.microsoft.com/office/word/2010/wordprocessingDrawing" xmlns:wp="http://schemas.openxmlformats.org/drawingml/2006/wordprocessingDrawing" xmlns:w10="urn:schemas-microsoft-com:office:word" xmlns:w="http://schemas.openxmlformats.org/wordprocessingml/2006/main" xmlns:w14="http://schemas.microsoft.com/office/word/2010/wordml" xmlns:w15="http://schemas.microsoft.com/office/word/2012/wordml" xmlns:w16cex="http://schemas.microsoft.com/office/word/2018/wordml/cex" xmlns:w16cid="http://schemas.microsoft.com/office/word/2016/wordml/cid" xmlns:w16="http://schemas.microsoft.com/office/word/2018/wordml" xmlns:w16du="http://schemas.microsoft.com/office/word/2023/wordml/word16du" xmlns:w16sdtdh="http://schemas.microsoft.com/office/word/2020/wordml/sdtdatahash" xmlns:w16se="http://schemas.microsoft.com/office/word/2015/wordml/symex" xmlns:wpg="http://schemas.microsoft.com/office/word/2010/wordprocessingGroup" xmlns:wpi="http://schemas.microsoft.com/office/word/2010/wordprocessingInk" xmlns:wne="http://schemas.microsoft.com/office/word/2006/wordml" xmlns:wps="http://schemas.microsoft.com/office/word/2010/wordprocessingShape" mc:Ignorable="w14 w15 w16se w16cid w16 w16cex w16sdtdh w16du wp14">
   <w:p>
     <w:pPr>
       <w:pStyle w:val="Footer"/>
@@ -2709,7 +5002,7 @@
 </file>
 
 <file path=word/footer2.xml><?xml version="1.0" encoding="utf-8"?>
-<w:ftr xmlns:wpc="http://schemas.microsoft.com/office/word/2010/wordprocessingCanvas" xmlns:cx="http://schemas.microsoft.com/office/drawing/2014/chartex" xmlns:cx1="http://schemas.microsoft.com/office/drawing/2015/9/8/chartex" xmlns:cx2="http://schemas.microsoft.com/office/drawing/2015/10/21/chartex" xmlns:cx3="http://schemas.microsoft.com/office/drawing/2016/5/9/chartex" xmlns:cx4="http://schemas.microsoft.com/office/drawing/2016/5/10/chartex" xmlns:cx5="http://schemas.microsoft.com/office/drawing/2016/5/11/chartex" xmlns:cx6="http://schemas.microsoft.com/office/drawing/2016/5/12/chartex" xmlns:cx7="http://schemas.microsoft.com/office/drawing/2016/5/13/chartex" xmlns:cx8="http://schemas.microsoft.com/office/drawing/2016/5/14/chartex" xmlns:mc="http://schemas.openxmlformats.org/markup-compatibility/2006" xmlns:aink="http://schemas.microsoft.com/office/drawing/2016/ink" xmlns:am3d="http://schemas.microsoft.com/office/drawing/2017/model3d" xmlns:o="urn:schemas-microsoft-com:office:office" xmlns:oel="http://schemas.microsoft.com/office/2019/extlst" xmlns:r="http://schemas.openxmlformats.org/officeDocument/2006/relationships" xmlns:m="http://schemas.openxmlformats.org/officeDocument/2006/math" xmlns:v="urn:schemas-microsoft-com:vml" xmlns:wp14="http://schemas.microsoft.com/office/word/2010/wordprocessingDrawing" xmlns:wp="http://schemas.openxmlformats.org/drawingml/2006/wordprocessingDrawing" xmlns:w10="urn:schemas-microsoft-com:office:word" xmlns:w="http://schemas.openxmlformats.org/wordprocessingml/2006/main" xmlns:w14="http://schemas.microsoft.com/office/word/2010/wordml" xmlns:w15="http://schemas.microsoft.com/office/word/2012/wordml" xmlns:w16cex="http://schemas.microsoft.com/office/word/2018/wordml/cex" xmlns:w16cid="http://schemas.microsoft.com/office/word/2016/wordml/cid" xmlns:w16="http://schemas.microsoft.com/office/word/2018/wordml" xmlns:w16du="http://schemas.microsoft.com/office/word/2023/wordml/word16du" xmlns:w16sdtdh="http://schemas.microsoft.com/office/word/2020/wordml/sdtdatahash" xmlns:w16sdtfl="http://schemas.microsoft.com/office/word/2024/wordml/sdtformatlock" xmlns:w16se="http://schemas.microsoft.com/office/word/2015/wordml/symex" xmlns:wpg="http://schemas.microsoft.com/office/word/2010/wordprocessingGroup" xmlns:wpi="http://schemas.microsoft.com/office/word/2010/wordprocessingInk" xmlns:wne="http://schemas.microsoft.com/office/word/2006/wordml" xmlns:wps="http://schemas.microsoft.com/office/word/2010/wordprocessingShape" mc:Ignorable="w14 w15 w16se w16cid w16 w16cex w16sdtdh w16sdtfl w16du wp14">
+<w:ftr xmlns:wpc="http://schemas.microsoft.com/office/word/2010/wordprocessingCanvas" xmlns:cx="http://schemas.microsoft.com/office/drawing/2014/chartex" xmlns:cx1="http://schemas.microsoft.com/office/drawing/2015/9/8/chartex" xmlns:cx2="http://schemas.microsoft.com/office/drawing/2015/10/21/chartex" xmlns:cx3="http://schemas.microsoft.com/office/drawing/2016/5/9/chartex" xmlns:cx4="http://schemas.microsoft.com/office/drawing/2016/5/10/chartex" xmlns:cx5="http://schemas.microsoft.com/office/drawing/2016/5/11/chartex" xmlns:cx6="http://schemas.microsoft.com/office/drawing/2016/5/12/chartex" xmlns:cx7="http://schemas.microsoft.com/office/drawing/2016/5/13/chartex" xmlns:cx8="http://schemas.microsoft.com/office/drawing/2016/5/14/chartex" xmlns:mc="http://schemas.openxmlformats.org/markup-compatibility/2006" xmlns:aink="http://schemas.microsoft.com/office/drawing/2016/ink" xmlns:am3d="http://schemas.microsoft.com/office/drawing/2017/model3d" xmlns:o="urn:schemas-microsoft-com:office:office" xmlns:oel="http://schemas.microsoft.com/office/2019/extlst" xmlns:r="http://schemas.openxmlformats.org/officeDocument/2006/relationships" xmlns:m="http://schemas.openxmlformats.org/officeDocument/2006/math" xmlns:v="urn:schemas-microsoft-com:vml" xmlns:wp14="http://schemas.microsoft.com/office/word/2010/wordprocessingDrawing" xmlns:wp="http://schemas.openxmlformats.org/drawingml/2006/wordprocessingDrawing" xmlns:w10="urn:schemas-microsoft-com:office:word" xmlns:w="http://schemas.openxmlformats.org/wordprocessingml/2006/main" xmlns:w14="http://schemas.microsoft.com/office/word/2010/wordml" xmlns:w15="http://schemas.microsoft.com/office/word/2012/wordml" xmlns:w16cex="http://schemas.microsoft.com/office/word/2018/wordml/cex" xmlns:w16cid="http://schemas.microsoft.com/office/word/2016/wordml/cid" xmlns:w16="http://schemas.microsoft.com/office/word/2018/wordml" xmlns:w16du="http://schemas.microsoft.com/office/word/2023/wordml/word16du" xmlns:w16sdtdh="http://schemas.microsoft.com/office/word/2020/wordml/sdtdatahash" xmlns:w16se="http://schemas.microsoft.com/office/word/2015/wordml/symex" xmlns:wpg="http://schemas.microsoft.com/office/word/2010/wordprocessingGroup" xmlns:wpi="http://schemas.microsoft.com/office/word/2010/wordprocessingInk" xmlns:wne="http://schemas.microsoft.com/office/word/2006/wordml" xmlns:wps="http://schemas.microsoft.com/office/word/2010/wordprocessingShape" mc:Ignorable="w14 w15 w16se w16cid w16 w16cex w16sdtdh w16du wp14">
   <w:p>
     <w:pPr>
       <w:pStyle w:val="Footer"/>
@@ -2811,14 +5104,34 @@
         <w:color w:val="054361"/>
         <w:sz w:val="20"/>
       </w:rPr>
-      <w:t>Kiley Graim, Fall 2026</w:t>
+      <w:t xml:space="preserve">Kiley </w:t>
+    </w:r>
+    <w:proofErr w:type="spellStart"/>
+    <w:r>
+      <w:rPr>
+        <w:b/>
+        <w:i/>
+        <w:color w:val="054361"/>
+        <w:sz w:val="20"/>
+      </w:rPr>
+      <w:t>Graim</w:t>
+    </w:r>
+    <w:proofErr w:type="spellEnd"/>
+    <w:r>
+      <w:rPr>
+        <w:b/>
+        <w:i/>
+        <w:color w:val="054361"/>
+        <w:sz w:val="20"/>
+      </w:rPr>
+      <w:t>, Fall 2026</w:t>
     </w:r>
   </w:p>
 </w:ftr>
 </file>
 
 <file path=word/footer3.xml><?xml version="1.0" encoding="utf-8"?>
-<w:ftr xmlns:wpc="http://schemas.microsoft.com/office/word/2010/wordprocessingCanvas" xmlns:cx="http://schemas.microsoft.com/office/drawing/2014/chartex" xmlns:cx1="http://schemas.microsoft.com/office/drawing/2015/9/8/chartex" xmlns:cx2="http://schemas.microsoft.com/office/drawing/2015/10/21/chartex" xmlns:cx3="http://schemas.microsoft.com/office/drawing/2016/5/9/chartex" xmlns:cx4="http://schemas.microsoft.com/office/drawing/2016/5/10/chartex" xmlns:cx5="http://schemas.microsoft.com/office/drawing/2016/5/11/chartex" xmlns:cx6="http://schemas.microsoft.com/office/drawing/2016/5/12/chartex" xmlns:cx7="http://schemas.microsoft.com/office/drawing/2016/5/13/chartex" xmlns:cx8="http://schemas.microsoft.com/office/drawing/2016/5/14/chartex" xmlns:mc="http://schemas.openxmlformats.org/markup-compatibility/2006" xmlns:aink="http://schemas.microsoft.com/office/drawing/2016/ink" xmlns:am3d="http://schemas.microsoft.com/office/drawing/2017/model3d" xmlns:o="urn:schemas-microsoft-com:office:office" xmlns:oel="http://schemas.microsoft.com/office/2019/extlst" xmlns:r="http://schemas.openxmlformats.org/officeDocument/2006/relationships" xmlns:m="http://schemas.openxmlformats.org/officeDocument/2006/math" xmlns:v="urn:schemas-microsoft-com:vml" xmlns:wp14="http://schemas.microsoft.com/office/word/2010/wordprocessingDrawing" xmlns:wp="http://schemas.openxmlformats.org/drawingml/2006/wordprocessingDrawing" xmlns:w10="urn:schemas-microsoft-com:office:word" xmlns:w="http://schemas.openxmlformats.org/wordprocessingml/2006/main" xmlns:w14="http://schemas.microsoft.com/office/word/2010/wordml" xmlns:w15="http://schemas.microsoft.com/office/word/2012/wordml" xmlns:w16cex="http://schemas.microsoft.com/office/word/2018/wordml/cex" xmlns:w16cid="http://schemas.microsoft.com/office/word/2016/wordml/cid" xmlns:w16="http://schemas.microsoft.com/office/word/2018/wordml" xmlns:w16du="http://schemas.microsoft.com/office/word/2023/wordml/word16du" xmlns:w16sdtdh="http://schemas.microsoft.com/office/word/2020/wordml/sdtdatahash" xmlns:w16sdtfl="http://schemas.microsoft.com/office/word/2024/wordml/sdtformatlock" xmlns:w16se="http://schemas.microsoft.com/office/word/2015/wordml/symex" xmlns:wpg="http://schemas.microsoft.com/office/word/2010/wordprocessingGroup" xmlns:wpi="http://schemas.microsoft.com/office/word/2010/wordprocessingInk" xmlns:wne="http://schemas.microsoft.com/office/word/2006/wordml" xmlns:wps="http://schemas.microsoft.com/office/word/2010/wordprocessingShape" mc:Ignorable="w14 w15 w16se w16cid w16 w16cex w16sdtdh w16sdtfl w16du wp14">
+<w:ftr xmlns:wpc="http://schemas.microsoft.com/office/word/2010/wordprocessingCanvas" xmlns:cx="http://schemas.microsoft.com/office/drawing/2014/chartex" xmlns:cx1="http://schemas.microsoft.com/office/drawing/2015/9/8/chartex" xmlns:cx2="http://schemas.microsoft.com/office/drawing/2015/10/21/chartex" xmlns:cx3="http://schemas.microsoft.com/office/drawing/2016/5/9/chartex" xmlns:cx4="http://schemas.microsoft.com/office/drawing/2016/5/10/chartex" xmlns:cx5="http://schemas.microsoft.com/office/drawing/2016/5/11/chartex" xmlns:cx6="http://schemas.microsoft.com/office/drawing/2016/5/12/chartex" xmlns:cx7="http://schemas.microsoft.com/office/drawing/2016/5/13/chartex" xmlns:cx8="http://schemas.microsoft.com/office/drawing/2016/5/14/chartex" xmlns:mc="http://schemas.openxmlformats.org/markup-compatibility/2006" xmlns:aink="http://schemas.microsoft.com/office/drawing/2016/ink" xmlns:am3d="http://schemas.microsoft.com/office/drawing/2017/model3d" xmlns:o="urn:schemas-microsoft-com:office:office" xmlns:oel="http://schemas.microsoft.com/office/2019/extlst" xmlns:r="http://schemas.openxmlformats.org/officeDocument/2006/relationships" xmlns:m="http://schemas.openxmlformats.org/officeDocument/2006/math" xmlns:v="urn:schemas-microsoft-com:vml" xmlns:wp14="http://schemas.microsoft.com/office/word/2010/wordprocessingDrawing" xmlns:wp="http://schemas.openxmlformats.org/drawingml/2006/wordprocessingDrawing" xmlns:w10="urn:schemas-microsoft-com:office:word" xmlns:w="http://schemas.openxmlformats.org/wordprocessingml/2006/main" xmlns:w14="http://schemas.microsoft.com/office/word/2010/wordml" xmlns:w15="http://schemas.microsoft.com/office/word/2012/wordml" xmlns:w16cex="http://schemas.microsoft.com/office/word/2018/wordml/cex" xmlns:w16cid="http://schemas.microsoft.com/office/word/2016/wordml/cid" xmlns:w16="http://schemas.microsoft.com/office/word/2018/wordml" xmlns:w16du="http://schemas.microsoft.com/office/word/2023/wordml/word16du" xmlns:w16sdtdh="http://schemas.microsoft.com/office/word/2020/wordml/sdtdatahash" xmlns:w16se="http://schemas.microsoft.com/office/word/2015/wordml/symex" xmlns:wpg="http://schemas.microsoft.com/office/word/2010/wordprocessingGroup" xmlns:wpi="http://schemas.microsoft.com/office/word/2010/wordprocessingInk" xmlns:wne="http://schemas.microsoft.com/office/word/2006/wordml" xmlns:wps="http://schemas.microsoft.com/office/word/2010/wordprocessingShape" mc:Ignorable="w14 w15 w16se w16cid w16 w16cex w16sdtdh w16du wp14">
   <w:p>
     <w:pPr>
       <w:pStyle w:val="Footer"/>
@@ -2920,14 +5233,34 @@
         <w:color w:val="054361"/>
         <w:sz w:val="20"/>
       </w:rPr>
-      <w:t>Kiley Graim, Fall 2026</w:t>
+      <w:t xml:space="preserve">Kiley </w:t>
+    </w:r>
+    <w:proofErr w:type="spellStart"/>
+    <w:r>
+      <w:rPr>
+        <w:b/>
+        <w:i/>
+        <w:color w:val="054361"/>
+        <w:sz w:val="20"/>
+      </w:rPr>
+      <w:t>Graim</w:t>
+    </w:r>
+    <w:proofErr w:type="spellEnd"/>
+    <w:r>
+      <w:rPr>
+        <w:b/>
+        <w:i/>
+        <w:color w:val="054361"/>
+        <w:sz w:val="20"/>
+      </w:rPr>
+      <w:t>, Fall 2026</w:t>
     </w:r>
   </w:p>
 </w:ftr>
 </file>
 
 <file path=word/footnotes.xml><?xml version="1.0" encoding="utf-8"?>
-<w:footnotes xmlns:wpc="http://schemas.microsoft.com/office/word/2010/wordprocessingCanvas" xmlns:cx="http://schemas.microsoft.com/office/drawing/2014/chartex" xmlns:cx1="http://schemas.microsoft.com/office/drawing/2015/9/8/chartex" xmlns:cx2="http://schemas.microsoft.com/office/drawing/2015/10/21/chartex" xmlns:cx3="http://schemas.microsoft.com/office/drawing/2016/5/9/chartex" xmlns:cx4="http://schemas.microsoft.com/office/drawing/2016/5/10/chartex" xmlns:cx5="http://schemas.microsoft.com/office/drawing/2016/5/11/chartex" xmlns:cx6="http://schemas.microsoft.com/office/drawing/2016/5/12/chartex" xmlns:cx7="http://schemas.microsoft.com/office/drawing/2016/5/13/chartex" xmlns:cx8="http://schemas.microsoft.com/office/drawing/2016/5/14/chartex" xmlns:mc="http://schemas.openxmlformats.org/markup-compatibility/2006" xmlns:aink="http://schemas.microsoft.com/office/drawing/2016/ink" xmlns:am3d="http://schemas.microsoft.com/office/drawing/2017/model3d" xmlns:o="urn:schemas-microsoft-com:office:office" xmlns:oel="http://schemas.microsoft.com/office/2019/extlst" xmlns:r="http://schemas.openxmlformats.org/officeDocument/2006/relationships" xmlns:m="http://schemas.openxmlformats.org/officeDocument/2006/math" xmlns:v="urn:schemas-microsoft-com:vml" xmlns:wp14="http://schemas.microsoft.com/office/word/2010/wordprocessingDrawing" xmlns:wp="http://schemas.openxmlformats.org/drawingml/2006/wordprocessingDrawing" xmlns:w10="urn:schemas-microsoft-com:office:word" xmlns:w="http://schemas.openxmlformats.org/wordprocessingml/2006/main" xmlns:w14="http://schemas.microsoft.com/office/word/2010/wordml" xmlns:w15="http://schemas.microsoft.com/office/word/2012/wordml" xmlns:w16cex="http://schemas.microsoft.com/office/word/2018/wordml/cex" xmlns:w16cid="http://schemas.microsoft.com/office/word/2016/wordml/cid" xmlns:w16="http://schemas.microsoft.com/office/word/2018/wordml" xmlns:w16du="http://schemas.microsoft.com/office/word/2023/wordml/word16du" xmlns:w16sdtdh="http://schemas.microsoft.com/office/word/2020/wordml/sdtdatahash" xmlns:w16sdtfl="http://schemas.microsoft.com/office/word/2024/wordml/sdtformatlock" xmlns:w16se="http://schemas.microsoft.com/office/word/2015/wordml/symex" xmlns:wpg="http://schemas.microsoft.com/office/word/2010/wordprocessingGroup" xmlns:wpi="http://schemas.microsoft.com/office/word/2010/wordprocessingInk" xmlns:wne="http://schemas.microsoft.com/office/word/2006/wordml" xmlns:wps="http://schemas.microsoft.com/office/word/2010/wordprocessingShape" mc:Ignorable="w14 w15 w16se w16cid w16 w16cex w16sdtdh w16sdtfl w16du wp14">
+<w:footnotes xmlns:wpc="http://schemas.microsoft.com/office/word/2010/wordprocessingCanvas" xmlns:cx="http://schemas.microsoft.com/office/drawing/2014/chartex" xmlns:cx1="http://schemas.microsoft.com/office/drawing/2015/9/8/chartex" xmlns:cx2="http://schemas.microsoft.com/office/drawing/2015/10/21/chartex" xmlns:cx3="http://schemas.microsoft.com/office/drawing/2016/5/9/chartex" xmlns:cx4="http://schemas.microsoft.com/office/drawing/2016/5/10/chartex" xmlns:cx5="http://schemas.microsoft.com/office/drawing/2016/5/11/chartex" xmlns:cx6="http://schemas.microsoft.com/office/drawing/2016/5/12/chartex" xmlns:cx7="http://schemas.microsoft.com/office/drawing/2016/5/13/chartex" xmlns:cx8="http://schemas.microsoft.com/office/drawing/2016/5/14/chartex" xmlns:mc="http://schemas.openxmlformats.org/markup-compatibility/2006" xmlns:aink="http://schemas.microsoft.com/office/drawing/2016/ink" xmlns:am3d="http://schemas.microsoft.com/office/drawing/2017/model3d" xmlns:o="urn:schemas-microsoft-com:office:office" xmlns:oel="http://schemas.microsoft.com/office/2019/extlst" xmlns:r="http://schemas.openxmlformats.org/officeDocument/2006/relationships" xmlns:m="http://schemas.openxmlformats.org/officeDocument/2006/math" xmlns:v="urn:schemas-microsoft-com:vml" xmlns:wp14="http://schemas.microsoft.com/office/word/2010/wordprocessingDrawing" xmlns:wp="http://schemas.openxmlformats.org/drawingml/2006/wordprocessingDrawing" xmlns:w10="urn:schemas-microsoft-com:office:word" xmlns:w="http://schemas.openxmlformats.org/wordprocessingml/2006/main" xmlns:w14="http://schemas.microsoft.com/office/word/2010/wordml" xmlns:w15="http://schemas.microsoft.com/office/word/2012/wordml" xmlns:w16cex="http://schemas.microsoft.com/office/word/2018/wordml/cex" xmlns:w16cid="http://schemas.microsoft.com/office/word/2016/wordml/cid" xmlns:w16="http://schemas.microsoft.com/office/word/2018/wordml" xmlns:w16du="http://schemas.microsoft.com/office/word/2023/wordml/word16du" xmlns:w16sdtdh="http://schemas.microsoft.com/office/word/2020/wordml/sdtdatahash" xmlns:w16se="http://schemas.microsoft.com/office/word/2015/wordml/symex" xmlns:wpg="http://schemas.microsoft.com/office/word/2010/wordprocessingGroup" xmlns:wpi="http://schemas.microsoft.com/office/word/2010/wordprocessingInk" xmlns:wne="http://schemas.microsoft.com/office/word/2006/wordml" xmlns:wps="http://schemas.microsoft.com/office/word/2010/wordprocessingShape" mc:Ignorable="w14 w15 w16se w16cid w16 w16cex w16sdtdh w16du wp14">
   <w:footnote w:type="separator" w:id="-1">
     <w:p>
       <w:r>
@@ -2946,7 +5279,7 @@
 </file>
 
 <file path=word/numbering.xml><?xml version="1.0" encoding="utf-8"?>
-<w:numbering xmlns:wpc="http://schemas.microsoft.com/office/word/2010/wordprocessingCanvas" xmlns:cx="http://schemas.microsoft.com/office/drawing/2014/chartex" xmlns:cx1="http://schemas.microsoft.com/office/drawing/2015/9/8/chartex" xmlns:cx2="http://schemas.microsoft.com/office/drawing/2015/10/21/chartex" xmlns:cx3="http://schemas.microsoft.com/office/drawing/2016/5/9/chartex" xmlns:cx4="http://schemas.microsoft.com/office/drawing/2016/5/10/chartex" xmlns:cx5="http://schemas.microsoft.com/office/drawing/2016/5/11/chartex" xmlns:cx6="http://schemas.microsoft.com/office/drawing/2016/5/12/chartex" xmlns:cx7="http://schemas.microsoft.com/office/drawing/2016/5/13/chartex" xmlns:cx8="http://schemas.microsoft.com/office/drawing/2016/5/14/chartex" xmlns:mc="http://schemas.openxmlformats.org/markup-compatibility/2006" xmlns:aink="http://schemas.microsoft.com/office/drawing/2016/ink" xmlns:am3d="http://schemas.microsoft.com/office/drawing/2017/model3d" xmlns:o="urn:schemas-microsoft-com:office:office" xmlns:oel="http://schemas.microsoft.com/office/2019/extlst" xmlns:r="http://schemas.openxmlformats.org/officeDocument/2006/relationships" xmlns:m="http://schemas.openxmlformats.org/officeDocument/2006/math" xmlns:v="urn:schemas-microsoft-com:vml" xmlns:wp14="http://schemas.microsoft.com/office/word/2010/wordprocessingDrawing" xmlns:wp="http://schemas.openxmlformats.org/drawingml/2006/wordprocessingDrawing" xmlns:w10="urn:schemas-microsoft-com:office:word" xmlns:w="http://schemas.openxmlformats.org/wordprocessingml/2006/main" xmlns:w14="http://schemas.microsoft.com/office/word/2010/wordml" xmlns:w15="http://schemas.microsoft.com/office/word/2012/wordml" xmlns:w16cex="http://schemas.microsoft.com/office/word/2018/wordml/cex" xmlns:w16cid="http://schemas.microsoft.com/office/word/2016/wordml/cid" xmlns:w16="http://schemas.microsoft.com/office/word/2018/wordml" xmlns:w16du="http://schemas.microsoft.com/office/word/2023/wordml/word16du" xmlns:w16sdtdh="http://schemas.microsoft.com/office/word/2020/wordml/sdtdatahash" xmlns:w16sdtfl="http://schemas.microsoft.com/office/word/2024/wordml/sdtformatlock" xmlns:w16se="http://schemas.microsoft.com/office/word/2015/wordml/symex" xmlns:wpg="http://schemas.microsoft.com/office/word/2010/wordprocessingGroup" xmlns:wpi="http://schemas.microsoft.com/office/word/2010/wordprocessingInk" xmlns:wne="http://schemas.microsoft.com/office/word/2006/wordml" xmlns:wps="http://schemas.microsoft.com/office/word/2010/wordprocessingShape" mc:Ignorable="w14 w15 w16se w16cid w16 w16cex w16sdtdh w16sdtfl w16du wp14">
+<w:numbering xmlns:wpc="http://schemas.microsoft.com/office/word/2010/wordprocessingCanvas" xmlns:cx="http://schemas.microsoft.com/office/drawing/2014/chartex" xmlns:cx1="http://schemas.microsoft.com/office/drawing/2015/9/8/chartex" xmlns:cx2="http://schemas.microsoft.com/office/drawing/2015/10/21/chartex" xmlns:cx3="http://schemas.microsoft.com/office/drawing/2016/5/9/chartex" xmlns:cx4="http://schemas.microsoft.com/office/drawing/2016/5/10/chartex" xmlns:cx5="http://schemas.microsoft.com/office/drawing/2016/5/11/chartex" xmlns:cx6="http://schemas.microsoft.com/office/drawing/2016/5/12/chartex" xmlns:cx7="http://schemas.microsoft.com/office/drawing/2016/5/13/chartex" xmlns:cx8="http://schemas.microsoft.com/office/drawing/2016/5/14/chartex" xmlns:mc="http://schemas.openxmlformats.org/markup-compatibility/2006" xmlns:aink="http://schemas.microsoft.com/office/drawing/2016/ink" xmlns:am3d="http://schemas.microsoft.com/office/drawing/2017/model3d" xmlns:o="urn:schemas-microsoft-com:office:office" xmlns:oel="http://schemas.microsoft.com/office/2019/extlst" xmlns:r="http://schemas.openxmlformats.org/officeDocument/2006/relationships" xmlns:m="http://schemas.openxmlformats.org/officeDocument/2006/math" xmlns:v="urn:schemas-microsoft-com:vml" xmlns:wp14="http://schemas.microsoft.com/office/word/2010/wordprocessingDrawing" xmlns:wp="http://schemas.openxmlformats.org/drawingml/2006/wordprocessingDrawing" xmlns:w10="urn:schemas-microsoft-com:office:word" xmlns:w="http://schemas.openxmlformats.org/wordprocessingml/2006/main" xmlns:w14="http://schemas.microsoft.com/office/word/2010/wordml" xmlns:w15="http://schemas.microsoft.com/office/word/2012/wordml" xmlns:w16cex="http://schemas.microsoft.com/office/word/2018/wordml/cex" xmlns:w16cid="http://schemas.microsoft.com/office/word/2016/wordml/cid" xmlns:w16="http://schemas.microsoft.com/office/word/2018/wordml" xmlns:w16du="http://schemas.microsoft.com/office/word/2023/wordml/word16du" xmlns:w16sdtdh="http://schemas.microsoft.com/office/word/2020/wordml/sdtdatahash" xmlns:w16se="http://schemas.microsoft.com/office/word/2015/wordml/symex" xmlns:wpg="http://schemas.microsoft.com/office/word/2010/wordprocessingGroup" xmlns:wpi="http://schemas.microsoft.com/office/word/2010/wordprocessingInk" xmlns:wne="http://schemas.microsoft.com/office/word/2006/wordml" xmlns:wps="http://schemas.microsoft.com/office/word/2010/wordprocessingShape" mc:Ignorable="w14 w15 w16se w16cid w16 w16cex w16sdtdh w16du wp14">
   <w:abstractNum w:abstractNumId="0" w15:restartNumberingAfterBreak="0">
     <w:nsid w:val="11E47C95"/>
     <w:multiLevelType w:val="multilevel"/>
@@ -3192,7 +5525,7 @@
 </file>
 
 <file path=word/styles.xml><?xml version="1.0" encoding="utf-8"?>
-<w:styles xmlns:mc="http://schemas.openxmlformats.org/markup-compatibility/2006" xmlns:r="http://schemas.openxmlformats.org/officeDocument/2006/relationships" xmlns:w="http://schemas.openxmlformats.org/wordprocessingml/2006/main" xmlns:w14="http://schemas.microsoft.com/office/word/2010/wordml" xmlns:w15="http://schemas.microsoft.com/office/word/2012/wordml" xmlns:w16cex="http://schemas.microsoft.com/office/word/2018/wordml/cex" xmlns:w16cid="http://schemas.microsoft.com/office/word/2016/wordml/cid" xmlns:w16="http://schemas.microsoft.com/office/word/2018/wordml" xmlns:w16du="http://schemas.microsoft.com/office/word/2023/wordml/word16du" xmlns:w16sdtdh="http://schemas.microsoft.com/office/word/2020/wordml/sdtdatahash" xmlns:w16sdtfl="http://schemas.microsoft.com/office/word/2024/wordml/sdtformatlock" xmlns:w16se="http://schemas.microsoft.com/office/word/2015/wordml/symex" mc:Ignorable="w14 w15 w16se w16cid w16 w16cex w16sdtdh w16sdtfl w16du">
+<w:styles xmlns:mc="http://schemas.openxmlformats.org/markup-compatibility/2006" xmlns:r="http://schemas.openxmlformats.org/officeDocument/2006/relationships" xmlns:w="http://schemas.openxmlformats.org/wordprocessingml/2006/main" xmlns:w14="http://schemas.microsoft.com/office/word/2010/wordml" xmlns:w15="http://schemas.microsoft.com/office/word/2012/wordml" xmlns:w16cex="http://schemas.microsoft.com/office/word/2018/wordml/cex" xmlns:w16cid="http://schemas.microsoft.com/office/word/2016/wordml/cid" xmlns:w16="http://schemas.microsoft.com/office/word/2018/wordml" xmlns:w16du="http://schemas.microsoft.com/office/word/2023/wordml/word16du" xmlns:w16sdtdh="http://schemas.microsoft.com/office/word/2020/wordml/sdtdatahash" xmlns:w16se="http://schemas.microsoft.com/office/word/2015/wordml/symex" mc:Ignorable="w14 w15 w16se w16cid w16 w16cex w16sdtdh w16du">
   <w:docDefaults>
     <w:rPrDefault>
       <w:rPr>
@@ -3553,6 +5886,7 @@
   <w:style w:type="character" w:default="1" w:styleId="DefaultParagraphFont">
     <w:name w:val="Default Paragraph Font"/>
     <w:uiPriority w:val="1"/>
+    <w:semiHidden/>
     <w:unhideWhenUsed/>
   </w:style>
   <w:style w:type="table" w:default="1" w:styleId="TableNormal">

</xml_diff>